<commit_message>
Housekeeping: regenerate DOCX at 8a88e93
Co-Authored-By: Claude Fable 5.1 <noreply@anthropic.com>
Claude-Session: https://claude.ai/code/session_01DM2PQPFgP8hwwDvWbvdo4R
</commit_message>
<xml_diff>
--- a/paper/paper.docx
+++ b/paper/paper.docx
@@ -1771,7 +1771,7 @@
         </m:r>
       </m:oMath>
       <w:r>
-        <w:t xml:space="preserve">, were retained from the overall best configuration, which had rank</w:t>
+        <w:t xml:space="preserve">, were retained from the best observed configuration, which had rank</w:t>
       </w:r>
       <w:r>
         <w:t xml:space="preserve"> </w:t>
@@ -1794,7 +1794,7 @@
         <w:t xml:space="preserve"> </w:t>
       </w:r>
       <w:r>
-        <w:t xml:space="preserve">(Fig. [fig:schema]b; Methods; Supplementary Information, Bayesian Optimization). The reported combination was therefore never itself evaluated. In contrast, standard unsupervised rank criteria (reconstruction residuals, cophenetic correlation and silhouette width</w:t>
+        <w:t xml:space="preserve">(Fig. [fig:schema]b; Methods; Supplementary Information, Bayesian Optimization). The reported combination was therefore not itself evaluated during the Bayesian-optimization search. In contrast, standard unsupervised rank criteria (reconstruction residuals, cophenetic correlation and silhouette width</w:t>
       </w:r>
       <w:hyperlink w:anchor="ref-brunet2004metagenes">
         <w:r>
@@ -2218,7 +2218,7 @@
           <w:iCs/>
           <w:i/>
         </w:rPr>
-        <w:t xml:space="preserve">) are searched by Bayesian optimization over cross-validated concordance; the rank is then chosen by a one-standard-error rule and the remaining hyperparameters are retained from the best configuration (Methods). Survival supervision acts on the gene-program matrix</w:t>
+        <w:t xml:space="preserve">) are searched by Bayesian optimization over cross-validated concordance; the rank is then chosen by a one-standard-error rule and the remaining hyperparameters are retained from the best observed configuration (Methods). Survival supervision acts on the gene-program matrix</w:t>
       </w:r>
       <w:r>
         <w:rPr>
@@ -5622,7 +5622,7 @@
         <w:pStyle w:val="BodyText"/>
       </w:pPr>
       <w:r>
-        <w:t xml:space="preserve">Rank choice and initialization can affect the recovered gene programs, and both were examined here. Standard NMF criteria gave conflicting rank choices in the PDAC training data, and increasing rank progressively broadened correspondence to established PDAC programs. The three-factor DeSurv solution and the seven-factor unsupervised control were selected by the same one-standard-error rule, and seven is the smallest rank within one standard error of the best configuration in the</w:t>
+        <w:t xml:space="preserve">Rank choice and initialization can affect the recovered gene programs, and both were examined here. Standard NMF criteria gave conflicting rank choices in the PDAC training data, and increasing rank progressively broadened correspondence to established PDAC programs. The three-factor DeSurv solution and the seven-factor unsupervised control were selected by the same one-standard-error rule, and seven is the smallest rank within one standard error of the best observed configuration in the</w:t>
       </w:r>
       <w:r>
         <w:t xml:space="preserve"> </w:t>
@@ -7564,7 +7564,7 @@
         </m:r>
       </m:oMath>
       <w:r>
-        <w:t xml:space="preserve">, where</w:t>
+        <w:t xml:space="preserve">, Here</w:t>
       </w:r>
       <w:r>
         <w:t xml:space="preserve"> </w:t>
@@ -7704,89 +7704,10 @@
         </m:d>
       </m:oMath>
       <w:r>
-        <w:t xml:space="preserve">, with</w:t>
-      </w:r>
-      <w:r>
-        <w:t xml:space="preserve"> </w:t>
-      </w:r>
-      <m:oMath>
-        <m:sSub>
-          <m:e>
-            <m:r>
-              <m:t>Z</m:t>
-            </m:r>
-          </m:e>
-          <m:sub>
-            <m:r>
-              <m:t>r</m:t>
-            </m:r>
-            <m:r>
-              <m:rPr>
-                <m:sty m:val="p"/>
-              </m:rPr>
-              <m:t>⋅</m:t>
-            </m:r>
-          </m:sub>
-        </m:sSub>
-      </m:oMath>
-      <w:r>
-        <w:t xml:space="preserve"> </w:t>
-      </w:r>
-      <w:r>
-        <w:t xml:space="preserve">the</w:t>
-      </w:r>
-      <w:r>
-        <w:t xml:space="preserve"> </w:t>
-      </w:r>
-      <m:oMath>
-        <m:r>
-          <m:t>r</m:t>
-        </m:r>
-      </m:oMath>
-      <w:r>
-        <w:t xml:space="preserve">th row of</w:t>
-      </w:r>
-      <w:r>
-        <w:t xml:space="preserve"> </w:t>
-      </w:r>
-      <m:oMath>
-        <m:r>
-          <m:t>Z</m:t>
-        </m:r>
-      </m:oMath>
-      <w:r>
-        <w:t xml:space="preserve"> </w:t>
-      </w:r>
-      <w:r>
-        <w:t xml:space="preserve">(the scores of factor</w:t>
-      </w:r>
-      <w:r>
-        <w:t xml:space="preserve"> </w:t>
-      </w:r>
-      <m:oMath>
-        <m:r>
-          <m:t>r</m:t>
-        </m:r>
-      </m:oMath>
-      <w:r>
-        <w:t xml:space="preserve"> </w:t>
-      </w:r>
-      <w:r>
-        <w:t xml:space="preserve">across samples) collects the standard deviations across samples of the</w:t>
-      </w:r>
-      <w:r>
-        <w:t xml:space="preserve"> </w:t>
-      </w:r>
-      <m:oMath>
-        <m:r>
-          <m:t>k</m:t>
-        </m:r>
-      </m:oMath>
-      <w:r>
-        <w:t xml:space="preserve"> </w:t>
-      </w:r>
-      <w:r>
-        <w:t xml:space="preserve">factor scores at the current</w:t>
+        <w:t xml:space="preserve"> </w:t>
+      </w:r>
+      <w:r>
+        <w:t xml:space="preserve">contains the standard deviations across samples of the factor-score rows at the current</w:t>
       </w:r>
       <w:r>
         <w:t xml:space="preserve"> </w:t>
@@ -8866,7 +8787,30 @@
         </m:r>
       </m:oMath>
       <w:r>
-        <w:t xml:space="preserve">. Its proposal is accepted only if the evaluated objective does not increase (equivalently, since</w:t>
+        <w:t xml:space="preserve">. Its proposal is accepted only if the evaluated objective does not increase (for</w:t>
+      </w:r>
+      <w:r>
+        <w:t xml:space="preserve"> </w:t>
+      </w:r>
+      <m:oMath>
+        <m:r>
+          <m:t>α</m:t>
+        </m:r>
+        <m:r>
+          <m:rPr>
+            <m:sty m:val="p"/>
+          </m:rPr>
+          <m:t>&gt;</m:t>
+        </m:r>
+        <m:r>
+          <m:t>0</m:t>
+        </m:r>
+      </m:oMath>
+      <w:r>
+        <w:t xml:space="preserve"> </w:t>
+      </w:r>
+      <w:r>
+        <w:t xml:space="preserve">this is equivalent, with</w:t>
       </w:r>
       <w:r>
         <w:t xml:space="preserve"> </w:t>
@@ -8894,7 +8838,41 @@
         <w:t xml:space="preserve"> </w:t>
       </w:r>
       <w:r>
-        <w:t xml:space="preserve">are fixed, only if the penalized survival loss does not increase), which makes the</w:t>
+        <w:t xml:space="preserve">fixed, to not increasing the penalized survival loss; at</w:t>
+      </w:r>
+      <w:r>
+        <w:t xml:space="preserve"> </w:t>
+      </w:r>
+      <m:oMath>
+        <m:r>
+          <m:t>α</m:t>
+        </m:r>
+        <m:r>
+          <m:rPr>
+            <m:sty m:val="p"/>
+          </m:rPr>
+          <m:t>=</m:t>
+        </m:r>
+        <m:r>
+          <m:t>0</m:t>
+        </m:r>
+      </m:oMath>
+      <w:r>
+        <w:t xml:space="preserve"> </w:t>
+      </w:r>
+      <w:r>
+        <w:t xml:space="preserve">the full objective is independent of</w:t>
+      </w:r>
+      <w:r>
+        <w:t xml:space="preserve"> </w:t>
+      </w:r>
+      <m:oMath>
+        <m:r>
+          <m:t>β</m:t>
+        </m:r>
+      </m:oMath>
+      <w:r>
+        <w:t xml:space="preserve">), which makes the</w:t>
       </w:r>
       <w:r>
         <w:t xml:space="preserve"> </w:t>

</xml_diff>

<commit_message>
Housekeeping: regenerate DOCX after commit 4
Co-Authored-By: Claude Fable 5.1 <noreply@anthropic.com>
Claude-Session: https://claude.ai/code/session_01DM2PQPFgP8hwwDvWbvdo4R
</commit_message>
<xml_diff>
--- a/paper/paper.docx
+++ b/paper/paper.docx
@@ -1108,7 +1108,7 @@
         </w:r>
       </w:hyperlink>
       <w:r>
-        <w:t xml:space="preserve">. Whether allowing survival to shape program definitions can identify a tumor–stroma program that provides prognostic information beyond established classifications remains unclear. Such programs could provide candidates for prognostic assays and trial stratification, while identifying genes and biological processes for further investigation. The question is not specific to PDAC, since in any tumor type the largest sources of expression variation need not be those most relevant to survival.</w:t>
+        <w:t xml:space="preserve">. Whether allowing survival to shape program definitions can identify a tumor–stroma program that provides prognostic information beyond established classifications remains unclear. Such programs could provide candidates for prognostic assays and trial stratification, while identifying genes and biological processes for further investigation.</w:t>
       </w:r>
     </w:p>
     <w:p>
@@ -1263,7 +1263,7 @@
         </w:r>
       </w:hyperlink>
       <w:r>
-        <w:t xml:space="preserve">. When predefined signatures are applied unchanged to a bulk cohort, survival can be used to assess their prognostic relevance but does not alter their gene definitions during that application. The practical challenge is therefore not simply to resolve interpretable gene programs. It is to let survival shape the programs as they are learned, to retain a decomposed representation rather than only a risk score, and to test those same programs, unchanged, across independent studies.</w:t>
+        <w:t xml:space="preserve">. When predefined signatures are applied unchanged to a bulk cohort, survival can be used to assess their prognostic relevance but does not alter their gene definitions during that application. The challenge is therefore to let survival shape the programs as they are learned, to retain a decomposed representation rather than only a risk score, and to test those same programs, unchanged, across independent studies.</w:t>
       </w:r>
     </w:p>
     <w:p>
@@ -1271,7 +1271,7 @@
         <w:pStyle w:val="BodyText"/>
       </w:pPr>
       <w:r>
-        <w:t xml:space="preserve">Standard NMF learns gene programs through a reconstruction-driven objective, minimizing reconstruction error, defined as the mismatch between the measured expression matrix and its approximation rebuilt from the programs. Such reconstruction-driven criteria favor patterns that capture prominent expression variation regardless of their relevance to patient survival</w:t>
+        <w:t xml:space="preserve">Standard NMF learns gene programs by minimizing reconstruction error, the mismatch between the measured expression matrix and its approximation rebuilt from the programs. Such reconstruction-driven criteria favor patterns that capture prominent expression variation regardless of their relevance to patient survival</w:t>
       </w:r>
       <w:hyperlink w:anchor="ref-bair2004semi">
         <w:r>
@@ -1402,7 +1402,7 @@
         </w:r>
       </w:hyperlink>
       <w:r>
-        <w:t xml:space="preserve">. Establishing clinically relevant and transportable programs has involved extensive multi-study refinement: the basal-like/classical dichotomy developed over roughly a decade of iterative subtyping, virtual microdissection, independent cohorts, single-cell analyses and prospective clinical profiling</w:t>
+        <w:t xml:space="preserve">. The basal-like/classical dichotomy developed over roughly a decade of iterative subtyping, virtual microdissection, independent cohorts, single-cell analyses and prospective clinical profiling</w:t>
       </w:r>
       <w:hyperlink w:anchor="ref-collisson2011subtypes">
         <w:r>
@@ -1549,10 +1549,10 @@
         <w:pStyle w:val="BodyText"/>
       </w:pPr>
       <w:r>
-        <w:t xml:space="preserve">We evaluate DeSurv in PDAC by comparing the resulting representation with unsupervised NMF at matched and higher rank (the number of programs the factorization extracts) and with conventional survival models such as penalized Cox regression and supervised principal components (Supplementary Table [tab:architecture]). We then evaluate the clinical relevance of the frozen programs in independent cohorts and ask whether they retain prognostic information beyond established PDAC classifiers. Simulations in which the true underlying (latent) programs are known characterize the conditions under which survival supervision improves recovery of prognostic structure. Together, these analyses evaluate survival-guided program discovery in PDAC and examine its potential when prognostically relevant structure contributes relatively little expression variation.</w:t>
-      </w:r>
-    </w:p>
-    <w:bookmarkStart w:id="41" w:name="results"/>
+        <w:t xml:space="preserve">We evaluate DeSurv in PDAC by comparing the resulting representation with unsupervised NMF at matched and higher rank (the number of programs the factorization extracts) and with conventional survival models such as penalized Cox regression and supervised principal components (Supplementary Table [tab:architecture]). We then evaluate the clinical relevance of the frozen programs in independent cohorts and ask whether they retain prognostic information beyond established PDAC classifiers. Simulations in which the true underlying (latent) programs are known characterize the conditions under which survival supervision improves recovery of prognostic structure.</w:t>
+      </w:r>
+    </w:p>
+    <w:bookmarkStart w:id="42" w:name="results"/>
     <w:p>
       <w:pPr>
         <w:pStyle w:val="Heading1"/>
@@ -1575,7 +1575,7 @@
         <w:pStyle w:val="FirstParagraph"/>
       </w:pPr>
       <w:r>
-        <w:t xml:space="preserve">DeSurv learns gene programs by balancing reconstruction of the tumor transcriptome with association to patient survival, so that outcome information shapes which programs are recovered rather than only which programs are selected after an unsupervised factorization. A supervision parameter</w:t>
+        <w:t xml:space="preserve">DeSurv learns gene programs by balancing reconstruction of the tumor transcriptome with association to patient survival. A supervision parameter</w:t>
       </w:r>
       <w:r>
         <w:t xml:space="preserve"> </w:t>
@@ -1626,7 +1626,7 @@
         <w:t xml:space="preserve"> </w:t>
       </w:r>
       <w:r>
-        <w:t xml:space="preserve">sets how many programs are extracted (Fig. [fig:schema]a; Methods). After training, the gene weights and the Cox coefficients are fixed, so the same learned programs and the trained risk score apply unchanged to new tumors without refitting the factorization.</w:t>
+        <w:t xml:space="preserve">sets how many programs are extracted (Fig. [fig:schema]a; Methods). After training, the gene weights and the Cox coefficients are fixed (Methods).</w:t>
       </w:r>
     </w:p>
     <w:p>
@@ -2377,7 +2377,7 @@
         </w:r>
       </w:hyperlink>
       <w:r>
-        <w:t xml:space="preserve">, and a third factor (N2) for exocrine-associated variation. Both methods recovered the activated-stroma and proCAF-like reference programs but differed at the tumor-restraining end: among the displayed top-ranked genes, the restCAF and iCAF reference programs corresponded to a DeSurv program but to no standard NMF factor (Fig. [fig:pdac]a,b). These are bulk gene-program correspondences, not identifications of CAF cell states (Supplementary Information, Stromal resolution).</w:t>
+        <w:t xml:space="preserve">, and a third factor (N2) for exocrine-associated variation. Both methods recovered the activated-stroma and proCAF-like reference programs but differed at the tumor-restraining end: among the displayed top-ranked genes, the restCAF and iCAF reference programs corresponded to a DeSurv factor but to no standard NMF factor (Fig. [fig:pdac]a,b). These are bulk gene-program correspondences, not identifications of CAF cell states (Supplementary Information, Stromal resolution).</w:t>
       </w:r>
     </w:p>
     <w:p>
@@ -2408,7 +2408,7 @@
         </w:r>
       </w:hyperlink>
       <w:r>
-        <w:t xml:space="preserve">), the smallest share among the three programs. However, in post-fit unpenalized Cox models of the three training-cohort scores projected over all analyzed genes, omitting D1 and refitting the Cox model using the remaining scores lowered the maximized Cox partial log-likelihood, the fit criterion of the Cox model, by</w:t>
+        <w:t xml:space="preserve">), the smallest share among the three factors. However, in post-fit unpenalized Cox models of the three training-cohort scores projected over all analyzed genes, omitting D1 and refitting on the remaining scores lowered the maximized Cox partial log-likelihood, the fit criterion of the Cox model, by</w:t>
       </w:r>
       <w:r>
         <w:t xml:space="preserve"> </w:t>
@@ -2458,7 +2458,7 @@
         </m:r>
       </m:oMath>
       <w:r>
-        <w:t xml:space="preserve">% of the reconstruction gain but little of this conditional survival contribution. In the unsupervised model, the factor contributing most to reconstruction (</w:t>
+        <w:t xml:space="preserve">% of the reconstruction gain but little of this conditional survival contribution. In the matched-rank standard NMF model, the factor contributing most to reconstruction (</w:t>
       </w:r>
       <m:oMath>
         <m:r>
@@ -2867,13 +2867,13 @@
       </w:r>
     </w:p>
     <w:bookmarkEnd w:id="27"/>
-    <w:bookmarkStart w:id="34" w:name="X545c29662618d20fbceafc892b81dc1672b6c59"/>
+    <w:bookmarkStart w:id="31" w:name="X915ee18e1a2dc2b5722a73512521e895820b749"/>
     <w:p>
       <w:pPr>
         <w:pStyle w:val="Heading2"/>
       </w:pPr>
       <w:r>
-        <w:t xml:space="preserve">Frozen programs retain prognostic relevance across independent PDAC cohorts, with exploratory transport to treated disease</w:t>
+        <w:t xml:space="preserve">Frozen programs retain prognostic relevance across independent PDAC cohorts</w:t>
       </w:r>
     </w:p>
     <w:p>
@@ -2881,7 +2881,7 @@
         <w:pStyle w:val="FirstParagraph"/>
       </w:pPr>
       <w:r>
-        <w:t xml:space="preserve">We next projected the frozen programs into five external validation datasets from four independent, non-metastatic, treatment-naive PDAC cohorts (Dijk, Moffitt, PACA-AU [array and RNA-seq], and Puleo; Supplementary Table [tab:cohorts]). Each tumor was scored by projecting its expression onto the trained programs over the union of their top-ranked genes (810 genes;</w:t>
+        <w:t xml:space="preserve">We next scored five external validation datasets from four independent, non-metastatic, treatment-naive PDAC cohorts (Dijk, Moffitt, PACA-AU [array and RNA-seq], and Puleo; Supplementary Table [tab:cohorts]) by projecting each tumor’s expression onto the frozen programs over the union of their top-ranked genes (810 genes;</w:t>
       </w:r>
       <w:r>
         <w:t xml:space="preserve"> </w:t>
@@ -3096,7 +3096,7 @@
         </m:r>
       </m:oMath>
       <w:r>
-        <w:t xml:space="preserve">) and varied more across datasets; neither reached statistical significance individually or in combination (Fig. [fig:val]a). Nor did any of the three standard NMF factors at the same rank (HRs 0.94–1.00; Fig. [fig:val]a, right).</w:t>
+        <w:t xml:space="preserve">) and varied more across datasets (Fig. [fig:val]a). Nor did any of the three standard NMF factors at the same rank (HRs 0.94–1.00; Fig. [fig:val]a, right); these are individual factor associations from a standard NMF fit, not the combined risk score of the matched-budget control in Table [tab:hr-adjusted].</w:t>
       </w:r>
     </w:p>
     <w:p>
@@ -3413,81 +3413,6 @@
       </m:oMath>
       <w:r>
         <w:t xml:space="preserve">%; Supplementary Information).</w:t>
-      </w:r>
-    </w:p>
-    <w:p>
-      <w:pPr>
-        <w:pStyle w:val="BodyText"/>
-      </w:pPr>
-      <w:r>
-        <w:t xml:space="preserve">We also projected the frozen programs, without retraining, into two treated PDAC cohorts. In the O’Kane/COMPASS cohort of metastatic disease (</w:t>
-      </w:r>
-      <m:oMath>
-        <m:r>
-          <m:t>n</m:t>
-        </m:r>
-        <m:r>
-          <m:rPr>
-            <m:sty m:val="p"/>
-          </m:rPr>
-          <m:t>=</m:t>
-        </m:r>
-        <m:r>
-          <m:t>173</m:t>
-        </m:r>
-      </m:oMath>
-      <w:r>
-        <w:t xml:space="preserve">, 123 deaths), D1 remained associated with overall survival in a Cox model stratified by treatment arm (HR per SD</w:t>
-      </w:r>
-      <w:r>
-        <w:t xml:space="preserve"> </w:t>
-      </w:r>
-      <m:oMath>
-        <m:r>
-          <m:t>0.75</m:t>
-        </m:r>
-      </m:oMath>
-      <w:r>
-        <w:t xml:space="preserve">, 95% CI</w:t>
-      </w:r>
-      <w:r>
-        <w:t xml:space="preserve"> </w:t>
-      </w:r>
-      <m:oMath>
-        <m:r>
-          <m:t>0.62</m:t>
-        </m:r>
-      </m:oMath>
-      <w:r>
-        <w:t xml:space="preserve">–</w:t>
-      </w:r>
-      <m:oMath>
-        <m:r>
-          <m:t>0.90</m:t>
-        </m:r>
-      </m:oMath>
-      <w:r>
-        <w:t xml:space="preserve">; Fig. [fig:treated]a); these laser-capture microdissected profiles are epithelial-enriched, probing chiefly the tumor component of D1. In the Linehan cohort, the projected proCAF-like D2 score increased from pre- to post-treatment biopsies (mean change +0.34 SD, paired Wilcoxon</w:t>
-      </w:r>
-      <w:r>
-        <w:t xml:space="preserve"> </w:t>
-      </w:r>
-      <m:oMath>
-        <m:r>
-          <m:t>P</m:t>
-        </m:r>
-        <m:r>
-          <m:rPr>
-            <m:sty m:val="p"/>
-          </m:rPr>
-          <m:t>=</m:t>
-        </m:r>
-        <m:r>
-          <m:t>0.013</m:t>
-        </m:r>
-      </m:oMath>
-      <w:r>
-        <w:t xml:space="preserve">; Fig. [fig:treated]b; Supplementary Information, Translational transportability), a shift that may reflect cell composition, cellular state or both. Because treatment, stage and cohort were not independently varied, these analyses are exploratory and do not establish differential treatment benefit.</w:t>
       </w:r>
     </w:p>
     <w:p>
@@ -4155,6 +4080,281 @@
         <w:t xml:space="preserve">fixed at zero (Supplementary Table [tab:tab-cindex-comparison]). These are point estimates for the selected models, not tests of superiority and not a comparison of minimum ranks.</w:t>
       </w:r>
     </w:p>
+    <w:bookmarkEnd w:id="31"/>
+    <w:bookmarkStart w:id="32" w:name="X7fde2f7385271f1c6cf3a3491d058fdf04b2c4f"/>
+    <w:p>
+      <w:pPr>
+        <w:pStyle w:val="Heading2"/>
+      </w:pPr>
+      <w:r>
+        <w:t xml:space="preserve">D1 retains prognostic information beyond established PDAC classifications</w:t>
+      </w:r>
+    </w:p>
+    <w:p>
+      <w:pPr>
+        <w:pStyle w:val="FirstParagraph"/>
+      </w:pPr>
+      <w:r>
+        <w:t xml:space="preserve">Across the pooled validation cohorts (</w:t>
+      </w:r>
+      <m:oMath>
+        <m:r>
+          <m:t>n</m:t>
+        </m:r>
+        <m:r>
+          <m:rPr>
+            <m:sty m:val="p"/>
+          </m:rPr>
+          <m:t>=</m:t>
+        </m:r>
+        <m:r>
+          <m:t>570</m:t>
+        </m:r>
+      </m:oMath>
+      <w:r>
+        <w:t xml:space="preserve">, 388 events), binary PurIST and DeCAF classifications together explained 34% of the within-dataset variance in the continuous D1 score, and DeCAF alone explained 19%. D1 nevertheless remained associated with survival after adjustment for both classifiers (HR per within-dataset SD 0.82, 95% CI</w:t>
+      </w:r>
+      <w:r>
+        <w:t xml:space="preserve"> </w:t>
+      </w:r>
+      <m:oMath>
+        <m:r>
+          <m:t>0.73</m:t>
+        </m:r>
+      </m:oMath>
+      <w:r>
+        <w:t xml:space="preserve">–</w:t>
+      </w:r>
+      <m:oMath>
+        <m:r>
+          <m:t>0.93</m:t>
+        </m:r>
+      </m:oMath>
+      <w:r>
+        <w:t xml:space="preserve">,</w:t>
+      </w:r>
+      <w:r>
+        <w:t xml:space="preserve"> </w:t>
+      </w:r>
+      <m:oMath>
+        <m:r>
+          <m:t>P</m:t>
+        </m:r>
+        <m:r>
+          <m:rPr>
+            <m:sty m:val="p"/>
+          </m:rPr>
+          <m:t>=</m:t>
+        </m:r>
+        <m:r>
+          <m:t>0.0014</m:t>
+        </m:r>
+      </m:oMath>
+      <w:r>
+        <w:t xml:space="preserve">). Adding D1 to a dataset-stratified Cox model with additive PurIST and DeCAF terms improved fit (partial likelihood-ratio</w:t>
+      </w:r>
+      <w:r>
+        <w:t xml:space="preserve"> </w:t>
+      </w:r>
+      <m:oMath>
+        <m:sSup>
+          <m:e>
+            <m:r>
+              <m:t>χ</m:t>
+            </m:r>
+          </m:e>
+          <m:sup>
+            <m:r>
+              <m:t>2</m:t>
+            </m:r>
+          </m:sup>
+        </m:sSup>
+        <m:r>
+          <m:rPr>
+            <m:sty m:val="p"/>
+          </m:rPr>
+          <m:t>=</m:t>
+        </m:r>
+        <m:r>
+          <m:t>10.1</m:t>
+        </m:r>
+      </m:oMath>
+      <w:r>
+        <w:t xml:space="preserve">, 1 df,</w:t>
+      </w:r>
+      <w:r>
+        <w:t xml:space="preserve"> </w:t>
+      </w:r>
+      <m:oMath>
+        <m:r>
+          <m:t>P</m:t>
+        </m:r>
+        <m:r>
+          <m:rPr>
+            <m:sty m:val="p"/>
+          </m:rPr>
+          <m:t>=</m:t>
+        </m:r>
+        <m:r>
+          <m:t>0.0015</m:t>
+        </m:r>
+      </m:oMath>
+      <w:r>
+        <w:t xml:space="preserve">) and increased concordance from 0.592 to 0.622. D1 therefore overlaps substantially with these classifications without being reducible to them.</w:t>
+      </w:r>
+    </w:p>
+    <w:p>
+      <w:pPr>
+        <w:pStyle w:val="BodyText"/>
+      </w:pPr>
+      <w:r>
+        <w:t xml:space="preserve">Because D1 spans tumor and stromal programs, we also asked whether it primarily reflected tumor purity. In the two datasets with purity estimates for all patients, D1 correlated only weakly with purity (Spearman</w:t>
+      </w:r>
+      <w:r>
+        <w:t xml:space="preserve"> </w:t>
+      </w:r>
+      <m:oMath>
+        <m:r>
+          <m:t>ρ</m:t>
+        </m:r>
+        <m:r>
+          <m:rPr>
+            <m:sty m:val="p"/>
+          </m:rPr>
+          <m:t>=</m:t>
+        </m:r>
+        <m:r>
+          <m:t>0.06</m:t>
+        </m:r>
+      </m:oMath>
+      <w:r>
+        <w:t xml:space="preserve"> </w:t>
+      </w:r>
+      <w:r>
+        <w:t xml:space="preserve">and</w:t>
+      </w:r>
+      <w:r>
+        <w:t xml:space="preserve"> </w:t>
+      </w:r>
+      <m:oMath>
+        <m:r>
+          <m:rPr>
+            <m:sty m:val="p"/>
+          </m:rPr>
+          <m:t>−</m:t>
+        </m:r>
+        <m:r>
+          <m:t>0.05</m:t>
+        </m:r>
+      </m:oMath>
+      <w:r>
+        <w:t xml:space="preserve">), and adjustment for purity left the linear predictor’s survival association essentially unchanged (HR per SD: PACA-AU array, 1.44 versus 1.45; RNA-seq, 1.66 versus 1.65; Supplementary Table [tab:clinical-adjustment]). In Puleo, the largest validation cohort, the DeSurv linear predictor also remained prognostic after adjustment for sex and resection-margin status (HR per SD 1.33, 95% CI</w:t>
+      </w:r>
+      <w:r>
+        <w:t xml:space="preserve"> </w:t>
+      </w:r>
+      <m:oMath>
+        <m:r>
+          <m:t>1.14</m:t>
+        </m:r>
+      </m:oMath>
+      <w:r>
+        <w:t xml:space="preserve">–</w:t>
+      </w:r>
+      <m:oMath>
+        <m:r>
+          <m:t>1.55</m:t>
+        </m:r>
+      </m:oMath>
+      <w:r>
+        <w:t xml:space="preserve">; Supplementary Table [tab:clinical-adjustment]). Within the PACA-AU datasets, these findings argue against measured tumor purity as the main explanation for the observed associations, although they do not establish the cellular identity of D1’s restCAF-like component (Supplementary Information, Stromal resolution: which reference programs are recovered from bulk).</w:t>
+      </w:r>
+    </w:p>
+    <w:bookmarkEnd w:id="32"/>
+    <w:bookmarkStart w:id="36" w:name="exploratory-transport-to-treated-disease"/>
+    <w:p>
+      <w:pPr>
+        <w:pStyle w:val="Heading2"/>
+      </w:pPr>
+      <w:r>
+        <w:t xml:space="preserve">Exploratory transport to treated disease</w:t>
+      </w:r>
+    </w:p>
+    <w:p>
+      <w:pPr>
+        <w:pStyle w:val="FirstParagraph"/>
+      </w:pPr>
+      <w:r>
+        <w:t xml:space="preserve">We also projected the frozen programs, without retraining, into two treated PDAC cohorts. In the O’Kane/COMPASS cohort of metastatic disease (</w:t>
+      </w:r>
+      <m:oMath>
+        <m:r>
+          <m:t>n</m:t>
+        </m:r>
+        <m:r>
+          <m:rPr>
+            <m:sty m:val="p"/>
+          </m:rPr>
+          <m:t>=</m:t>
+        </m:r>
+        <m:r>
+          <m:t>173</m:t>
+        </m:r>
+      </m:oMath>
+      <w:r>
+        <w:t xml:space="preserve">, 123 deaths), D1 remained associated with overall survival in a Cox model stratified by treatment arm (HR per SD</w:t>
+      </w:r>
+      <w:r>
+        <w:t xml:space="preserve"> </w:t>
+      </w:r>
+      <m:oMath>
+        <m:r>
+          <m:t>0.75</m:t>
+        </m:r>
+      </m:oMath>
+      <w:r>
+        <w:t xml:space="preserve">, 95% CI</w:t>
+      </w:r>
+      <w:r>
+        <w:t xml:space="preserve"> </w:t>
+      </w:r>
+      <m:oMath>
+        <m:r>
+          <m:t>0.62</m:t>
+        </m:r>
+      </m:oMath>
+      <w:r>
+        <w:t xml:space="preserve">–</w:t>
+      </w:r>
+      <m:oMath>
+        <m:r>
+          <m:t>0.90</m:t>
+        </m:r>
+      </m:oMath>
+      <w:r>
+        <w:t xml:space="preserve">; Fig. [fig:treated]a); these laser-capture microdissected profiles are epithelial-enriched, probing chiefly the tumor component of D1. In the Linehan cohort, the projected proCAF-like D2 score increased from pre- to post-treatment biopsies (mean change +0.34 SD, paired Wilcoxon</w:t>
+      </w:r>
+      <w:r>
+        <w:t xml:space="preserve"> </w:t>
+      </w:r>
+      <m:oMath>
+        <m:r>
+          <m:t>P</m:t>
+        </m:r>
+        <m:r>
+          <m:rPr>
+            <m:sty m:val="p"/>
+          </m:rPr>
+          <m:t>=</m:t>
+        </m:r>
+        <m:r>
+          <m:t>0.013</m:t>
+        </m:r>
+      </m:oMath>
+      <w:r>
+        <w:t xml:space="preserve">; Fig. [fig:treated]b; Supplementary Information, Translational transportability), a shift that may reflect cell composition, cellular state or both. Because treatment, stage and cohort were not independently varied, these analyses are exploratory and do not establish differential treatment benefit.</w:t>
+      </w:r>
+    </w:p>
     <w:p>
       <w:pPr>
         <w:pStyle w:val="BodyText"/>
@@ -4164,18 +4364,18 @@
           <wp:inline>
             <wp:extent cx="5334000" cy="2524290"/>
             <wp:effectExtent b="0" l="0" r="0" t="0"/>
-            <wp:docPr descr="" title="" id="32" name="Picture"/>
+            <wp:docPr descr="" title="" id="34" name="Picture"/>
             <a:graphic>
               <a:graphicData uri="http://schemas.openxmlformats.org/drawingml/2006/picture">
                 <pic:pic>
                   <pic:nvPicPr>
-                    <pic:cNvPr descr=".docx_media/figures_fig_treated_1.png" id="33" name="Picture"/>
+                    <pic:cNvPr descr=".docx_media/figures_fig_treated_1.png" id="35" name="Picture"/>
                     <pic:cNvPicPr>
                       <a:picLocks noChangeArrowheads="1" noChangeAspect="1"/>
                     </pic:cNvPicPr>
                   </pic:nvPicPr>
                   <pic:blipFill>
-                    <a:blip r:embed="rId31"/>
+                    <a:blip r:embed="rId33"/>
                     <a:stretch>
                       <a:fillRect/>
                     </a:stretch>
@@ -4401,14 +4601,14 @@
         <w:t xml:space="preserve">SD). Because treatment, stage and cohort were not independently varied, these analyses support prognostic and biological transportability rather than treatment-predictive effects.</w:t>
       </w:r>
     </w:p>
-    <w:bookmarkEnd w:id="34"/>
-    <w:bookmarkStart w:id="35" w:name="X7fde2f7385271f1c6cf3a3491d058fdf04b2c4f"/>
+    <w:bookmarkEnd w:id="36"/>
+    <w:bookmarkStart w:id="37" w:name="Xc685441adc07ef39d4fb33262bfe779f9f1a448"/>
     <w:p>
       <w:pPr>
         <w:pStyle w:val="Heading2"/>
       </w:pPr>
       <w:r>
-        <w:t xml:space="preserve">D1 retains prognostic information beyond established PDAC classifications</w:t>
+        <w:t xml:space="preserve">Method comparisons distinguish survival prediction from gene program recovery</w:t>
       </w:r>
     </w:p>
     <w:p>
@@ -4416,11 +4616,11 @@
         <w:pStyle w:val="FirstParagraph"/>
       </w:pPr>
       <w:r>
-        <w:t xml:space="preserve">We first asked whether D1 simply recapitulated established PDAC subtype classifications. Across the pooled validation cohorts (</w:t>
-      </w:r>
-      <m:oMath>
-        <m:r>
-          <m:t>n</m:t>
+        <w:t xml:space="preserve">At DeSurv’s rank, the matched-budget unsupervised control did not show a statistically significant survival association (Table [tab:hr-adjusted]). More generally, DeSurv reached near-maximal cross-validated concordance at the lowest ranks examined, with little change as additional factors were added, whereas the unsupervised limit (</w:t>
+      </w:r>
+      <m:oMath>
+        <m:r>
+          <m:t>α</m:t>
         </m:r>
         <m:r>
           <m:rPr>
@@ -4429,37 +4629,26 @@
           <m:t>=</m:t>
         </m:r>
         <m:r>
-          <m:t>570</m:t>
-        </m:r>
-      </m:oMath>
-      <w:r>
-        <w:t xml:space="preserve">, 388 events), binary PurIST and DeCAF classifications together explained 34% of the within-dataset variance in the continuous D1 score, and DeCAF alone explained 19%. D1 nevertheless remained associated with survival after adjustment for both classifiers (HR per within-dataset SD 0.82, 95% CI</w:t>
-      </w:r>
-      <w:r>
-        <w:t xml:space="preserve"> </w:t>
-      </w:r>
-      <m:oMath>
-        <m:r>
-          <m:t>0.73</m:t>
-        </m:r>
-      </m:oMath>
-      <w:r>
-        <w:t xml:space="preserve">–</w:t>
-      </w:r>
-      <m:oMath>
-        <m:r>
-          <m:t>0.93</m:t>
-        </m:r>
-      </m:oMath>
-      <w:r>
-        <w:t xml:space="preserve">,</w:t>
-      </w:r>
-      <w:r>
-        <w:t xml:space="preserve"> </w:t>
-      </w:r>
-      <m:oMath>
-        <m:r>
-          <m:t>P</m:t>
+          <m:t>0</m:t>
+        </m:r>
+      </m:oMath>
+      <w:r>
+        <w:t xml:space="preserve">) improved progressively with rank and approached DeSurv only at higher-rank solutions (Supplementary Fig. [fig:fig-cindex-by-k]).</w:t>
+      </w:r>
+    </w:p>
+    <w:p>
+      <w:pPr>
+        <w:pStyle w:val="BodyText"/>
+      </w:pPr>
+      <w:r>
+        <w:t xml:space="preserve">The rank-optimized unsupervised control, whose rank the same one-standard-error rule set at</w:t>
+      </w:r>
+      <w:r>
+        <w:t xml:space="preserve"> </w:t>
+      </w:r>
+      <m:oMath>
+        <m:r>
+          <m:t>k</m:t>
         </m:r>
         <m:r>
           <m:rPr>
@@ -4468,28 +4657,19 @@
           <m:t>=</m:t>
         </m:r>
         <m:r>
-          <m:t>0.0014</m:t>
-        </m:r>
-      </m:oMath>
-      <w:r>
-        <w:t xml:space="preserve">). Adding D1 to a dataset-stratified Cox model with additive PurIST and DeCAF terms improved fit (partial likelihood-ratio</w:t>
-      </w:r>
-      <w:r>
-        <w:t xml:space="preserve"> </w:t>
-      </w:r>
-      <m:oMath>
-        <m:sSup>
-          <m:e>
-            <m:r>
-              <m:t>χ</m:t>
-            </m:r>
-          </m:e>
-          <m:sup>
-            <m:r>
-              <m:t>2</m:t>
-            </m:r>
-          </m:sup>
-        </m:sSup>
+          <m:t>7</m:t>
+        </m:r>
+      </m:oMath>
+      <w:r>
+        <w:t xml:space="preserve">, carried comparable external prognostic information (Table [tab:hr-adjusted]; Supplementary Table [tab:tab-cindex-comparison]). Reference-program coverage increased from 16 for DeSurv at</w:t>
+      </w:r>
+      <w:r>
+        <w:t xml:space="preserve"> </w:t>
+      </w:r>
+      <m:oMath>
+        <m:r>
+          <m:t>k</m:t>
+        </m:r>
         <m:r>
           <m:rPr>
             <m:sty m:val="p"/>
@@ -4497,18 +4677,21 @@
           <m:t>=</m:t>
         </m:r>
         <m:r>
-          <m:t>10.1</m:t>
-        </m:r>
-      </m:oMath>
-      <w:r>
-        <w:t xml:space="preserve">, 1 df,</w:t>
-      </w:r>
-      <w:r>
-        <w:t xml:space="preserve"> </w:t>
-      </w:r>
-      <m:oMath>
-        <m:r>
-          <m:t>P</m:t>
+          <m:t>3</m:t>
+        </m:r>
+      </m:oMath>
+      <w:r>
+        <w:t xml:space="preserve"> </w:t>
+      </w:r>
+      <w:r>
+        <w:t xml:space="preserve">to 32 for the</w:t>
+      </w:r>
+      <w:r>
+        <w:t xml:space="preserve"> </w:t>
+      </w:r>
+      <m:oMath>
+        <m:r>
+          <m:t>k</m:t>
         </m:r>
         <m:r>
           <m:rPr>
@@ -4517,11 +4700,14 @@
           <m:t>=</m:t>
         </m:r>
         <m:r>
-          <m:t>0.0015</m:t>
-        </m:r>
-      </m:oMath>
-      <w:r>
-        <w:t xml:space="preserve">) and increased concordance from 0.592 to 0.622. D1 therefore overlaps substantially with established tumor-intrinsic and stromal classifications while retaining prognostic information beyond those binary calls.</w:t>
+          <m:t>7</m:t>
+        </m:r>
+      </m:oMath>
+      <w:r>
+        <w:t xml:space="preserve"> </w:t>
+      </w:r>
+      <w:r>
+        <w:t xml:space="preserve">control, while multiplicity remained low (1.00 versus 1.125; Supplementary Figs. [fig:fig-nmf-k7-heatmap] and [fig:fig-rpm]). Seven is where the one-standard-error rule landed for the unsupervised search, not a general minimum rank for comparable prognostic information. Survival supervision was not required to obtain a prognostic signal, but it altered which programs were identified and how that signal was decomposed.</w:t>
       </w:r>
     </w:p>
     <w:p>
@@ -4529,206 +4715,7 @@
         <w:pStyle w:val="BodyText"/>
       </w:pPr>
       <w:r>
-        <w:t xml:space="preserve">Because D1 spans tumor and stromal programs, we also asked whether it primarily reflected tumor purity. In the two datasets with purity estimates for all patients, D1 correlated only weakly with purity (Spearman</w:t>
-      </w:r>
-      <w:r>
-        <w:t xml:space="preserve"> </w:t>
-      </w:r>
-      <m:oMath>
-        <m:r>
-          <m:t>ρ</m:t>
-        </m:r>
-        <m:r>
-          <m:rPr>
-            <m:sty m:val="p"/>
-          </m:rPr>
-          <m:t>=</m:t>
-        </m:r>
-        <m:r>
-          <m:t>0.06</m:t>
-        </m:r>
-      </m:oMath>
-      <w:r>
-        <w:t xml:space="preserve"> </w:t>
-      </w:r>
-      <w:r>
-        <w:t xml:space="preserve">and</w:t>
-      </w:r>
-      <w:r>
-        <w:t xml:space="preserve"> </w:t>
-      </w:r>
-      <m:oMath>
-        <m:r>
-          <m:rPr>
-            <m:sty m:val="p"/>
-          </m:rPr>
-          <m:t>−</m:t>
-        </m:r>
-        <m:r>
-          <m:t>0.05</m:t>
-        </m:r>
-      </m:oMath>
-      <w:r>
-        <w:t xml:space="preserve">), and adjustment for purity left the linear predictor’s survival association essentially unchanged (HR per SD: PACA-AU array, 1.44 versus 1.45; RNA-seq, 1.66 versus 1.65; Supplementary Table [tab:clinical-adjustment]). In Puleo, the largest validation cohort, the DeSurv linear predictor also remained prognostic after adjustment for sex and resection-margin status (HR per SD 1.33, 95% CI</w:t>
-      </w:r>
-      <w:r>
-        <w:t xml:space="preserve"> </w:t>
-      </w:r>
-      <m:oMath>
-        <m:r>
-          <m:t>1.14</m:t>
-        </m:r>
-      </m:oMath>
-      <w:r>
-        <w:t xml:space="preserve">–</w:t>
-      </w:r>
-      <m:oMath>
-        <m:r>
-          <m:t>1.55</m:t>
-        </m:r>
-      </m:oMath>
-      <w:r>
-        <w:t xml:space="preserve">; Supplementary Table [tab:clinical-adjustment]). Within the PACA-AU datasets, these findings argue against measured tumor purity as the main explanation for the observed associations, although they do not establish the cellular identity of D1’s restCAF-like component (Supplementary Information, Stromal resolution: which reference programs are recovered from bulk).</w:t>
-      </w:r>
-    </w:p>
-    <w:bookmarkEnd w:id="35"/>
-    <w:bookmarkStart w:id="36" w:name="Xc685441adc07ef39d4fb33262bfe779f9f1a448"/>
-    <w:p>
-      <w:pPr>
-        <w:pStyle w:val="Heading2"/>
-      </w:pPr>
-      <w:r>
-        <w:t xml:space="preserve">Method comparisons distinguish survival prediction from gene program recovery</w:t>
-      </w:r>
-    </w:p>
-    <w:p>
-      <w:pPr>
-        <w:pStyle w:val="FirstParagraph"/>
-      </w:pPr>
-      <w:r>
-        <w:t xml:space="preserve">We next asked whether comparable prognostic information could be recovered without survival-supervised factorization. At DeSurv’s rank, the matched-budget unsupervised control did not show a statistically significant survival association (Table [tab:hr-adjusted]). More generally, DeSurv reached near-maximal cross-validated concordance at the lowest ranks examined, with little change as additional factors were added, whereas the unsupervised limit (</w:t>
-      </w:r>
-      <m:oMath>
-        <m:r>
-          <m:t>α</m:t>
-        </m:r>
-        <m:r>
-          <m:rPr>
-            <m:sty m:val="p"/>
-          </m:rPr>
-          <m:t>=</m:t>
-        </m:r>
-        <m:r>
-          <m:t>0</m:t>
-        </m:r>
-      </m:oMath>
-      <w:r>
-        <w:t xml:space="preserve">) improved progressively with rank and approached DeSurv only at higher-rank solutions (Supplementary Fig. [fig:fig-cindex-by-k]).</w:t>
-      </w:r>
-    </w:p>
-    <w:p>
-      <w:pPr>
-        <w:pStyle w:val="BodyText"/>
-      </w:pPr>
-      <w:r>
-        <w:t xml:space="preserve">The rank-optimized unsupervised control (the same pipeline at</w:t>
-      </w:r>
-      <w:r>
-        <w:t xml:space="preserve"> </w:t>
-      </w:r>
-      <m:oMath>
-        <m:r>
-          <m:t>α</m:t>
-        </m:r>
-        <m:r>
-          <m:rPr>
-            <m:sty m:val="p"/>
-          </m:rPr>
-          <m:t>=</m:t>
-        </m:r>
-        <m:r>
-          <m:t>0</m:t>
-        </m:r>
-      </m:oMath>
-      <w:r>
-        <w:t xml:space="preserve"> </w:t>
-      </w:r>
-      <w:r>
-        <w:t xml:space="preserve">with rank selected by the same one-standard-error rule applied to its own Bayesian-optimization results,</w:t>
-      </w:r>
-      <w:r>
-        <w:t xml:space="preserve"> </w:t>
-      </w:r>
-      <m:oMath>
-        <m:r>
-          <m:t>k</m:t>
-        </m:r>
-        <m:r>
-          <m:rPr>
-            <m:sty m:val="p"/>
-          </m:rPr>
-          <m:t>=</m:t>
-        </m:r>
-        <m:r>
-          <m:t>7</m:t>
-        </m:r>
-      </m:oMath>
-      <w:r>
-        <w:t xml:space="preserve">) carried comparable external prognostic information (Table [tab:hr-adjusted]; Supplementary Table [tab:tab-cindex-comparison]). Reference-program coverage increased from 16 for DeSurv at</w:t>
-      </w:r>
-      <w:r>
-        <w:t xml:space="preserve"> </w:t>
-      </w:r>
-      <m:oMath>
-        <m:r>
-          <m:t>k</m:t>
-        </m:r>
-        <m:r>
-          <m:rPr>
-            <m:sty m:val="p"/>
-          </m:rPr>
-          <m:t>=</m:t>
-        </m:r>
-        <m:r>
-          <m:t>3</m:t>
-        </m:r>
-      </m:oMath>
-      <w:r>
-        <w:t xml:space="preserve"> </w:t>
-      </w:r>
-      <w:r>
-        <w:t xml:space="preserve">to 32 for the</w:t>
-      </w:r>
-      <w:r>
-        <w:t xml:space="preserve"> </w:t>
-      </w:r>
-      <m:oMath>
-        <m:r>
-          <m:t>k</m:t>
-        </m:r>
-        <m:r>
-          <m:rPr>
-            <m:sty m:val="p"/>
-          </m:rPr>
-          <m:t>=</m:t>
-        </m:r>
-        <m:r>
-          <m:t>7</m:t>
-        </m:r>
-      </m:oMath>
-      <w:r>
-        <w:t xml:space="preserve"> </w:t>
-      </w:r>
-      <w:r>
-        <w:t xml:space="preserve">control, while multiplicity remained low (1.00 versus 1.125; Supplementary Figs. [fig:fig-nmf-k7-heatmap] and [fig:fig-rpm]), indicating broader reference-program coverage with little repeated mapping in the seven-factor control. Seven is where the one-standard-error rule landed for the unsupervised search, not a general minimum rank for comparable prognostic information. Survival supervision was not required to obtain a prognostic signal, but it altered which programs were identified and how that signal was decomposed.</w:t>
-      </w:r>
-    </w:p>
-    <w:p>
-      <w:pPr>
-        <w:pStyle w:val="BodyText"/>
-      </w:pPr>
-      <w:r>
-        <w:t xml:space="preserve">We next asked whether D1 was specific to the DeSurv optimizer. We applied three other survival-supervised approaches to the training datasets (one supervised component each for supervised principal components and Cox partial least squares, one penalized fit for sparse Cox; Methods). All three produced patient scores strongly correlated with D1 (Pearson</w:t>
+        <w:t xml:space="preserve">To test whether D1 was specific to the DeSurv optimizer, we applied three other survival-supervised approaches to the training datasets (one supervised component each for supervised principal components and Cox partial least squares, one penalized fit for sparse Cox; Methods). All three produced patient scores strongly correlated with D1 (Pearson</w:t>
       </w:r>
       <w:r>
         <w:t xml:space="preserve"> </w:t>
@@ -4818,7 +4805,7 @@
         <w:pStyle w:val="BodyText"/>
       </w:pPr>
       <w:r>
-        <w:t xml:space="preserve">We then asked what DeSurv adds beyond recovery of this shared prognostic direction. Independently tuned supervised principal components and lasso-penalized Cox regression had pooled external C-indices of</w:t>
+        <w:t xml:space="preserve">Independently tuned supervised principal components and lasso-penalized Cox regression had pooled external C-indices of</w:t>
       </w:r>
       <w:r>
         <w:t xml:space="preserve"> </w:t>
@@ -4978,8 +4965,8 @@
         <w:t xml:space="preserve">for D2 (Supplementary Information). DeSurv places the shared prognostic direction within separately scored tumor and stromal programs and provides program-specific gene lists for biological investigation and future classifier development.</w:t>
       </w:r>
     </w:p>
-    <w:bookmarkEnd w:id="36"/>
-    <w:bookmarkStart w:id="40" w:name="X6689aa5313dac45210423b6867d0aa8d64ac134"/>
+    <w:bookmarkEnd w:id="37"/>
+    <w:bookmarkStart w:id="41" w:name="X6689aa5313dac45210423b6867d0aa8d64ac134"/>
     <w:p>
       <w:pPr>
         <w:pStyle w:val="Heading2"/>
@@ -4993,7 +4980,7 @@
         <w:pStyle w:val="FirstParagraph"/>
       </w:pPr>
       <w:r>
-        <w:t xml:space="preserve">We used simulations with known latent structure to determine when survival supervision improves gene program recovery. Expression profiles were generated for</w:t>
+        <w:t xml:space="preserve">In simulations with known latent structure, expression profiles were generated for</w:t>
       </w:r>
       <w:r>
         <w:t xml:space="preserve"> </w:t>
@@ -5088,7 +5075,7 @@
         </m:r>
       </m:oMath>
       <w:r>
-        <w:t xml:space="preserve">) were tuned by the same cross-validation procedure, giving a controlled comparison with and without survival supervision.</w:t>
+        <w:t xml:space="preserve">) were tuned by the same cross-validation procedure.</w:t>
       </w:r>
     </w:p>
     <w:p>
@@ -5096,7 +5083,7 @@
         <w:pStyle w:val="BodyText"/>
       </w:pPr>
       <w:r>
-        <w:t xml:space="preserve">Under this setting, DeSurv more accurately recovered the genes defining the true prognostic program, whereas unsupervised NMF was more strongly influenced by the dominant background structure (Fig. [fig:sim]a,b). Across 100 simulated datasets, median matched-factor precision, the proportion of the best-matching learned program’s selected genes that belonged to the true prognostic gene set, was 0.50 for DeSurv versus 0.07 for unsupervised NMF. Global marker recall, the proportion of the true survival-driving marker genes appearing in the union of all learned programs’ top-ranked gene sets, was 0.26 versus 0.15 (Supplementary Information). Median test-set C-index was</w:t>
+        <w:t xml:space="preserve">Under this setting, DeSurv more accurately recovered the genes defining the true prognostic program, whereas unsupervised NMF was more strongly influenced by the dominant background structure (Fig. [fig:sim]a,b). Across 100 simulated datasets, median matched-factor precision (the proportion of the best-matching learned program’s selected genes belonging to the true prognostic gene set) was 0.50 for DeSurv versus 0.07 for unsupervised NMF. Global marker recall (the proportion of the true survival-driving marker genes appearing in the union of all learned programs’ top-ranked gene sets) was 0.26 versus 0.15 (Supplementary Information). Median test-set C-index was</w:t>
       </w:r>
       <w:r>
         <w:t xml:space="preserve"> </w:t>
@@ -5228,7 +5215,7 @@
         <w:t xml:space="preserve"> </w:t>
       </w:r>
       <w:r>
-        <w:t xml:space="preserve">across 100 simulated datasets), consistent with weak discrimination among supervision strengths when concordance is near chance.</w:t>
+        <w:t xml:space="preserve">across 100 simulated datasets), consistent with weak discrimination among supervision strengths.</w:t>
       </w:r>
     </w:p>
     <w:p>
@@ -5240,18 +5227,18 @@
           <wp:inline>
             <wp:extent cx="5334000" cy="4923692"/>
             <wp:effectExtent b="0" l="0" r="0" t="0"/>
-            <wp:docPr descr="" title="" id="38" name="Picture"/>
+            <wp:docPr descr="" title="" id="39" name="Picture"/>
             <a:graphic>
               <a:graphicData uri="http://schemas.openxmlformats.org/drawingml/2006/picture">
                 <pic:pic>
                   <pic:nvPicPr>
-                    <pic:cNvPr descr=".docx_media/figures_fig2_tcgacptac.png" id="39" name="Picture"/>
+                    <pic:cNvPr descr=".docx_media/figures_fig2_tcgacptac.png" id="40" name="Picture"/>
                     <pic:cNvPicPr>
                       <a:picLocks noChangeArrowheads="1" noChangeAspect="1"/>
                     </pic:cNvPicPr>
                   </pic:nvPicPr>
                   <pic:blipFill>
-                    <a:blip r:embed="rId37"/>
+                    <a:blip r:embed="rId38"/>
                     <a:stretch>
                       <a:fillRect/>
                     </a:stretch>
@@ -5471,9 +5458,9 @@
         <w:t xml:space="preserve">IQR; points are individual simulated datasets. (c) Distribution of selected ranks across simulated datasets for DeSurv versus unsupervised NMF. (d) The same matched-factor precision metric as in (b), computed for two signal regimes: a prognostic program whose genes carry low transcriptomic variance relative to the shared background excluded from the survival-generating gene set (separated from the dominant variance) versus one that partially overlaps the dominant variance. DeSurv recovers the prognostic program more accurately in both regimes, whereas the unsupervised solution is more strongly influenced by the dominant expression structure; the null scenario (no prognostic program) is shown in the Supplementary Information. The concordance gap in (a) is not an expected discrimination gain in real data, where the two approaches perform comparably (Table [tab:hr-adjusted]).</w:t>
       </w:r>
     </w:p>
-    <w:bookmarkEnd w:id="40"/>
     <w:bookmarkEnd w:id="41"/>
-    <w:bookmarkStart w:id="42" w:name="discussion"/>
+    <w:bookmarkEnd w:id="42"/>
+    <w:bookmarkStart w:id="43" w:name="discussion"/>
     <w:p>
       <w:pPr>
         <w:pStyle w:val="Heading1"/>
@@ -5487,7 +5474,7 @@
         <w:pStyle w:val="FirstParagraph"/>
       </w:pPr>
       <w:r>
-        <w:t xml:space="preserve">DeSurv allows patient survival to shape gene-program discovery, yielding a tumor–stroma architecture that connects prognostic information with interpretable malignant and stromal programs. The practical value lies in what that architecture yields, program-specific gene lists that can be compared with established classifications and investigated biologically across cohorts. In PDAC, the architecture comprised a dominant survival-aligned program, D1, characterized by coordinated cross-patient variation in classical tumor and restCAF-like stromal features, alongside separately resolved proCAF-like stromal and basal-like tumor programs. D1 remained prognostic after adjustment for the established PurIST and DeCAF classifications, and was supported on its classical tumor side by GATA6 RNA in situ hybridization. The frozen programs then transferred without refitting across four independent external patient cohorts.</w:t>
+        <w:t xml:space="preserve">DeSurv allows patient survival to shape gene-program discovery, yielding a tumor–stroma architecture that connects prognostic information with interpretable malignant and stromal programs. In PDAC, the architecture comprised a dominant survival-aligned program, D1, characterized by coordinated cross-patient variation in classical tumor and restCAF-like stromal features, alongside separately resolved proCAF-like stromal and basal-like tumor programs. D1 remained prognostic after adjustment for the established PurIST and DeCAF classifications. The frozen programs then transferred without refitting across four independent external patient cohorts.</w:t>
       </w:r>
     </w:p>
     <w:p>
@@ -5495,7 +5482,7 @@
         <w:pStyle w:val="BodyText"/>
       </w:pPr>
       <w:r>
-        <w:t xml:space="preserve">This difference in the recovered programs persisted when rank and tuning effort were matched. An unsupervised control at</w:t>
+        <w:t xml:space="preserve">An unsupervised control at</w:t>
       </w:r>
       <w:r>
         <w:t xml:space="preserve"> </w:t>
@@ -5515,7 +5502,7 @@
         </m:r>
       </m:oMath>
       <w:r>
-        <w:t xml:space="preserve">, matched to DeSurv on rank, optimizer, tuning budget and consensus initialization and tuned on cross-validated concordance, did not recover D1. A rank-optimized unsupervised control recovered comparable prognostic information across a broader seven-factor representation, and conventional supervised predictors produced scores aligned with the dominant prognostic direction, correlating only weakly with the separately resolved proCAF-like program (Fig. [fig:val]b). These comparisons separate prognostic information from the representation in which that information is recovered.</w:t>
+        <w:t xml:space="preserve">, matched to DeSurv on rank and tuning budget, did not recover D1, so the difference in the recovered programs did not appear to reflect rank or tuning effort. A rank-optimized unsupervised control recovered comparable prognostic information across a broader seven-factor representation, and conventional supervised predictors produced scores aligned with the dominant prognostic direction, correlating only weakly with the separately resolved proCAF-like program (Fig. [fig:val]b). These comparisons separate prognostic information from the representation in which that information is recovered.</w:t>
       </w:r>
     </w:p>
     <w:p>
@@ -5523,7 +5510,7 @@
         <w:pStyle w:val="BodyText"/>
       </w:pPr>
       <w:r>
-        <w:t xml:space="preserve">This distinction also clarifies the role of the frozen gene-program basis. When programs are learned without outcome information, their prognostic relevance is assessed after discovery. In DeSurv, survival acts directly on the gene-program matrix</w:t>
+        <w:t xml:space="preserve">This distinction clarifies the role of the frozen gene-program basis. In DeSurv, survival acts directly on the gene-program matrix</w:t>
       </w:r>
       <w:r>
         <w:t xml:space="preserve"> </w:t>
@@ -5564,7 +5551,7 @@
         </w:r>
       </w:hyperlink>
       <w:r>
-        <w:t xml:space="preserve">. In DeSurv, it depends directly on projections through the gene-program matrix, and new samples are scored using fixed gene weights without an additional sample-loading estimation step (Supplementary Table [tab:architecture]). Empirically, supervision reorganized rather than replaced the reconstruction-driven structure. D2 and D3 corresponded closely to the major stromal and tumor factors recovered by standard NMF, whereas D1 was poorly reconstructable from those matched-rank factors.</w:t>
+        <w:t xml:space="preserve">. In DeSurv, it depends directly on projections through the gene-program matrix, and new samples are scored using fixed gene weights without an additional sample-loading estimation step (Supplementary Table [tab:architecture]).</w:t>
       </w:r>
     </w:p>
     <w:p>
@@ -5614,7 +5601,7 @@
         </w:r>
       </w:hyperlink>
       <w:r>
-        <w:t xml:space="preserve">. Program-specific gene lists connect measured scores to biological annotation and provide candidates for subsequent classifier development. DeSurv extends this line of work by allowing patient outcomes to influence the gene weights themselves, and D2 remains available as separately measurable proCAF-like stromal context although the fitted risk score combines D1 and D3. Such outputs supply candidate signatures and hypotheses for biological investigation and biomarker development, without yet establishing clinical utility or a treatment-selection rule.</w:t>
+        <w:t xml:space="preserve">. Program-specific gene lists connect measured scores to biological annotation and provide candidates for subsequent classifier development. DeSurv extends this line of work by allowing patient outcomes to influence the gene weights themselves, and D2 remains available as separately measurable proCAF-like stromal context although the fitted risk score combines D1 and D3. These outputs do not yet establish clinical utility or a treatment-selection rule.</w:t>
       </w:r>
     </w:p>
     <w:p>
@@ -5622,30 +5609,7 @@
         <w:pStyle w:val="BodyText"/>
       </w:pPr>
       <w:r>
-        <w:t xml:space="preserve">Rank choice and initialization can affect the recovered gene programs, and both were examined here. Standard NMF criteria gave conflicting rank choices in the PDAC training data, and increasing rank progressively broadened correspondence to established PDAC programs. The three-factor DeSurv solution and the seven-factor unsupervised control were selected by the same one-standard-error rule, and seven is the smallest rank within one standard error of the best observed configuration in the</w:t>
-      </w:r>
-      <w:r>
-        <w:t xml:space="preserve"> </w:t>
-      </w:r>
-      <m:oMath>
-        <m:r>
-          <m:t>α</m:t>
-        </m:r>
-        <m:r>
-          <m:rPr>
-            <m:sty m:val="p"/>
-          </m:rPr>
-          <m:t>=</m:t>
-        </m:r>
-        <m:r>
-          <m:t>0</m:t>
-        </m:r>
-      </m:oMath>
-      <w:r>
-        <w:t xml:space="preserve"> </w:t>
-      </w:r>
-      <w:r>
-        <w:t xml:space="preserve">search, so the two differ in representation size rather than marking a minimum-rank requirement for either method. Survival supervision provides an outcome-informed criterion for shaping the representation, but it does not remove the non-uniqueness of matrix factorization, and individual DeSurv runs from different random starts recover appreciably different gene sets. Consensus fits built from disjoint halves of the same cached restart pool agreed closely with the reported basis (gene-loading correlation 0.97–0.99, top-270 Jaccard 0.73–0.88; Supplementary Information, Stability of the recovered gene programs). This supports stability to restart-pool composition within the training data, while leaving reproducibility under independent repetition, and the stability of the full consensus procedure under patient resampling, to be established.</w:t>
+        <w:t xml:space="preserve">Rank choice and initialization can affect the recovered gene programs. Increasing rank progressively broadened correspondence to established PDAC programs. The three-factor DeSurv solution and the seven-factor unsupervised control were selected by the same one-standard-error rule. Survival supervision provides an outcome-informed criterion for shaping the representation, but it does not remove the non-uniqueness of matrix factorization, and individual DeSurv runs from different random starts recover appreciably different gene sets. Split-half consensus fits agreed closely with the reported basis (Supplementary Information, Stability of the recovered gene programs), which supports stability to restart-pool composition within the training data while leaving reproducibility under independent repetition, and the stability of the full consensus procedure under patient resampling, to be established.</w:t>
       </w:r>
     </w:p>
     <w:p>
@@ -5653,7 +5617,7 @@
         <w:pStyle w:val="BodyText"/>
       </w:pPr>
       <w:r>
-        <w:t xml:space="preserve">The simulations identify conditions under which survival information improves program recovery. In the primary setting, the marker genes defining the prognostic program contributed less expression variation than shared background genes excluded from the survival-generating gene set. DeSurv recovered those prognostic markers more accurately than its unsupervised limit. In the mixed setting, the benefit differed between program-specific markers and shared background genes, while test-set concordance was near chance for both methods under the null. These findings provide a controlled example of how survival supervision can prioritize prognostically relevant structure that contributes relatively little expression variation.</w:t>
+        <w:t xml:space="preserve">The simulations identify conditions under which survival information improves program recovery. They give a controlled example of how survival supervision can prioritize prognostically relevant structure that contributes relatively little expression variation.</w:t>
       </w:r>
     </w:p>
     <w:p>
@@ -5669,9 +5633,17 @@
         <w:pStyle w:val="BodyText"/>
       </w:pPr>
       <w:r>
-        <w:t xml:space="preserve">The question DeSurv addresses extends beyond PDAC. In any tumor type, the programs that dominate expression variation may differ from those most relevant to survival, so outcome information could help prioritize programs that reconstruction alone underweights. Testing generalizability will require multi-cancer evaluation of prognostic performance, program recovery and stability, with attention to cohort composition and event counts. Comparators should include unsupervised decompositions and strong penalized-regression baselines, which remain difficult to outperform consistently for out-of-sample prognosis</w:t>
-      </w:r>
-      <w:hyperlink w:anchor="ref-smith2020standard">
+        <w:t xml:space="preserve">In treated cohorts the frozen scores remained informative in exploratory analyses, but arm-level sample sizes limited assessment of variation in the association across treatments. Whether these programs predict differential treatment benefit therefore remains unresolved and will require adequately powered, prespecified treatment-by-program interaction analyses in studies designed to support treatment comparisons.</w:t>
+      </w:r>
+    </w:p>
+    <w:p>
+      <w:pPr>
+        <w:pStyle w:val="BodyText"/>
+      </w:pPr>
+      <w:r>
+        <w:t xml:space="preserve">The tumor–stroma architecture described here is a bulk-tissue phenomenon. It reflects cross-patient covariation in tumor- and stroma-associated transcriptional programs rather than cellular co-expression or spatial adjacency within individual tumors. This organization is consistent with broader evidence that malignant lineage state and stromal composition vary together in PDAC</w:t>
+      </w:r>
+      <w:hyperlink w:anchor="ref-ogawa2020stroma">
         <w:r>
           <w:rPr>
             <w:rStyle w:val="Hyperlink"/>
@@ -5681,40 +5653,32 @@
         </w:r>
       </w:hyperlink>
       <w:r>
-        <w:t xml:space="preserve">. PDAC is the empirical demonstration presented here rather than evidence of pan-cancer validation.</w:t>
-      </w:r>
-    </w:p>
-    <w:p>
-      <w:pPr>
-        <w:pStyle w:val="BodyText"/>
-      </w:pPr>
-      <w:r>
-        <w:t xml:space="preserve">In treated cohorts the frozen scores remained informative in exploratory analyses. In O’Kane/COMPASS, D1 remained prognostic in an analysis stratified by treatment arm, although arm-level sample sizes limited assessment of variation in the association across treatments, and the epithelial-enriched profiles support transport of its tumor-associated component in particular. The increase in the projected D2 score after treatment in the Linehan cohort indicates a shift toward proCAF-associated bulk expression, which may reflect altered cellular composition, transcriptional state or both, and does not establish a treatment-induced change in fibroblast state. Whether these programs predict differential treatment benefit therefore remains unresolved and will require adequately powered, prespecified treatment-by-program interaction analyses in studies designed to support treatment comparisons.</w:t>
-      </w:r>
-    </w:p>
-    <w:p>
-      <w:pPr>
-        <w:pStyle w:val="BodyText"/>
-      </w:pPr>
-      <w:r>
-        <w:t xml:space="preserve">The tumor–stroma architecture described here is a bulk-tissue phenomenon. It reflects cross-patient covariation in tumor- and stroma-associated transcriptional programs rather than cellular co-expression or spatial adjacency within individual tumors. Within it, D1 is the dominant survival-aligned program rather than the architecture itself, and this organization is consistent with broader evidence that malignant lineage state and stromal composition vary together in PDAC</w:t>
-      </w:r>
-      <w:hyperlink w:anchor="ref-ogawa2020stroma">
+        <w:rPr>
+          <w:vertAlign w:val="superscript"/>
+        </w:rPr>
+        <w:t xml:space="preserve">–</w:t>
+      </w:r>
+      <w:hyperlink w:anchor="ref-lee2024tumorcaf">
         <w:r>
           <w:rPr>
             <w:rStyle w:val="Hyperlink"/>
             <w:vertAlign w:val="superscript"/>
           </w:rPr>
-          <w:t xml:space="preserve">35</w:t>
+          <w:t xml:space="preserve">36</w:t>
         </w:r>
       </w:hyperlink>
       <w:r>
-        <w:rPr>
-          <w:vertAlign w:val="superscript"/>
-        </w:rPr>
-        <w:t xml:space="preserve">–</w:t>
-      </w:r>
-      <w:hyperlink w:anchor="ref-lee2024tumorcaf">
+        <w:t xml:space="preserve">. Adjustment for PurIST and DeCAF supports D1’s prognostic association beyond those classifiers, purity adjustment in the PACA-AU datasets leaves the risk score’s association essentially unchanged, and other supervised methods recover a related patient-score direction. GATA6 RNA in situ hybridization independently supports D1’s classical tumor component; these analyses do not establish the cellular identity of its stromal component. Single-cell or spatial profiling could clarify the cellular sources of these programs; linking those sources to prognosis would additionally require outcome-annotated cohorts and scoring methods appropriate for the measurement platform.</w:t>
+      </w:r>
+    </w:p>
+    <w:p>
+      <w:pPr>
+        <w:pStyle w:val="BodyText"/>
+      </w:pPr>
+      <w:r>
+        <w:t xml:space="preserve">The question DeSurv addresses extends beyond PDAC. In any tumor type, the programs that dominate expression variation may differ from those most relevant to survival, so outcome information could help prioritize programs that reconstruction alone underweights. Testing generalizability will require multi-cancer evaluation of prognostic performance, program recovery and stability, with attention to cohort composition and event counts. Comparators should include unsupervised decompositions and strong penalized-regression baselines, which remain difficult to outperform consistently for out-of-sample prognosis</w:t>
+      </w:r>
+      <w:hyperlink w:anchor="ref-smith2020standard">
         <w:r>
           <w:rPr>
             <w:rStyle w:val="Hyperlink"/>
@@ -5724,7 +5688,7 @@
         </w:r>
       </w:hyperlink>
       <w:r>
-        <w:t xml:space="preserve">. The restCAF-like and proCAF-like labels denote correspondence to reference signatures rather than direct resolution of single-cell CAF states. Adjustment for PurIST and DeCAF supports D1’s prognostic association beyond those classifiers, purity adjustment in the PACA-AU datasets leaves the risk score’s association essentially unchanged, and other supervised methods recover a related patient-score direction. GATA6 RNA in situ hybridization independently supports D1’s classical tumor component; these analyses do not establish the cellular identity of its stromal component. Single-cell or spatial profiling could clarify the cellular sources of these programs; linking those sources to prognosis would additionally require outcome-annotated cohorts and scoring methods appropriate for the measurement platform.</w:t>
+        <w:t xml:space="preserve">. PDAC is the empirical demonstration presented here rather than evidence of pan-cancer validation.</w:t>
       </w:r>
     </w:p>
     <w:p>
@@ -5735,8 +5699,8 @@
         <w:t xml:space="preserve">In PDAC, incorporating survival during factorization recovered a three-program tumor–stroma architecture that transferred across independent cohorts while retaining biological components that could be interrogated separately. More generally, DeSurv provides a framework for asking not only whether transcriptomic data predict outcome, but which biological programs are recovered when outcome information helps shape their discovery.</w:t>
       </w:r>
     </w:p>
-    <w:bookmarkEnd w:id="42"/>
-    <w:bookmarkStart w:id="57" w:name="methods"/>
+    <w:bookmarkEnd w:id="43"/>
+    <w:bookmarkStart w:id="58" w:name="methods"/>
     <w:p>
       <w:pPr>
         <w:pStyle w:val="Heading1"/>
@@ -5745,7 +5709,7 @@
         <w:t xml:space="preserve">Methods</w:t>
       </w:r>
     </w:p>
-    <w:bookmarkStart w:id="43" w:name="problem-formulation-and-notation"/>
+    <w:bookmarkStart w:id="44" w:name="problem-formulation-and-notation"/>
     <w:p>
       <w:pPr>
         <w:pStyle w:val="Heading2"/>
@@ -6514,8 +6478,8 @@
         <w:t xml:space="preserve">describes a factorization objective without a survival term; outcome-based tuning is stated separately.</w:t>
       </w:r>
     </w:p>
-    <w:bookmarkEnd w:id="43"/>
-    <w:bookmarkStart w:id="44" w:name="the-desurv-model"/>
+    <w:bookmarkEnd w:id="44"/>
+    <w:bookmarkStart w:id="45" w:name="the-desurv-model"/>
     <w:p>
       <w:pPr>
         <w:pStyle w:val="Heading2"/>
@@ -7564,7 +7528,7 @@
         </m:r>
       </m:oMath>
       <w:r>
-        <w:t xml:space="preserve">, Here</w:t>
+        <w:t xml:space="preserve">. Here</w:t>
       </w:r>
       <w:r>
         <w:t xml:space="preserve"> </w:t>
@@ -8301,8 +8265,8 @@
         <w:t xml:space="preserve">model (Supplementary Information, Bayesian Optimization). The Cox component also supports optional adjustment for sample-level covariates (for example, stage or grade); the analyses reported here use factor scores alone.</w:t>
       </w:r>
     </w:p>
-    <w:bookmarkEnd w:id="44"/>
-    <w:bookmarkStart w:id="45" w:name="optimization"/>
+    <w:bookmarkEnd w:id="45"/>
+    <w:bookmarkStart w:id="46" w:name="optimization"/>
     <w:p>
       <w:pPr>
         <w:pStyle w:val="Heading2"/>
@@ -9053,8 +9017,8 @@
         <w:t xml:space="preserve">Because the implemented algorithm combines normalization, gradient rescaling and a Coxnet approximation, we assessed optimization behavior empirically rather than relying on a formal convergence guarantee. Across 100 independent random initializations of the reported PDAC model, every run terminated on the stopping criterion rather than the iteration cap, and none failed numerically (median 38 iterations, range 17–233; Supplementary Information, Empirical optimization stability). The recorded outer-loop objective decreased monotonically. Monotone decrease together with the cosine stopping rule is what these runs establish, and they are checks on the optimizer rather than on which programs it recovers. Closed-form update equations are given in Supplementary Information, Model details and Optimization Algorithm, and Bayesian-optimization control parameters in Bayesian Optimization.</w:t>
       </w:r>
     </w:p>
-    <w:bookmarkEnd w:id="45"/>
-    <w:bookmarkStart w:id="46" w:name="Xae18593a87377292dd7aab530561e9c6f103c06"/>
+    <w:bookmarkEnd w:id="46"/>
+    <w:bookmarkStart w:id="47" w:name="Xae18593a87377292dd7aab530561e9c6f103c06"/>
     <w:p>
       <w:pPr>
         <w:pStyle w:val="Heading2"/>
@@ -9738,8 +9702,8 @@
         <w:t xml:space="preserve">from the best observed configuration. Reference-program correspondence and the GATA6 comparison support biological interpretation of the selected programs; they do not establish a uniquely correct rank.</w:t>
       </w:r>
     </w:p>
-    <w:bookmarkEnd w:id="46"/>
-    <w:bookmarkStart w:id="47" w:name="Xbdce6b91f711f953a81a9683ed715f043d727c7"/>
+    <w:bookmarkEnd w:id="47"/>
+    <w:bookmarkStart w:id="48" w:name="Xbdce6b91f711f953a81a9683ed715f043d727c7"/>
     <w:p>
       <w:pPr>
         <w:pStyle w:val="Heading2"/>
@@ -9818,8 +9782,8 @@
         <w:t xml:space="preserve">We assessed program stability by partitioning the cached restart pool into disjoint halves and constructing a consensus initialization and final fit from each half. Across 8 random splits, median agreement with the reported basis was 0.97–0.99 for gene-loading correlations and 0.73–0.88 for top-ranked-gene Jaccard overlap across the three programs. These comparisons assess sensitivity to restart-pool composition within the training data, rather than independent repetition of the full procedure (Supplementary Information, Stability of the recovered gene programs). That section also reports stability under patient subsampling, a separate and weaker property.</w:t>
       </w:r>
     </w:p>
-    <w:bookmarkEnd w:id="47"/>
-    <w:bookmarkStart w:id="48" w:name="frozen-gene-program-and-risk-scoring"/>
+    <w:bookmarkEnd w:id="48"/>
+    <w:bookmarkStart w:id="49" w:name="frozen-gene-program-and-risk-scoring"/>
     <w:p>
       <w:pPr>
         <w:pStyle w:val="Heading2"/>
@@ -10262,8 +10226,8 @@
         <w:t xml:space="preserve">was not refit after truncation. The elastic-net penalty set the D2 coefficient to exactly zero, so the frozen risk score is a weighted combination of D1 and D3.</w:t>
       </w:r>
     </w:p>
-    <w:bookmarkEnd w:id="48"/>
-    <w:bookmarkStart w:id="49" w:name="unsupervised-and-supervised-comparators"/>
+    <w:bookmarkEnd w:id="49"/>
+    <w:bookmarkStart w:id="50" w:name="unsupervised-and-supervised-comparators"/>
     <w:p>
       <w:pPr>
         <w:pStyle w:val="Heading2"/>
@@ -10640,8 +10604,8 @@
         <w:t xml:space="preserve">No matched-budget control was run for these supervised comparators, as was done for the unsupervised arm. Correspondence between each supervised risk score and the DeSurv programs D1–D3 was quantified in the training cohort using absolute Pearson correlation. Additional analyses of selected-gene enrichment and compartment attribution are described in the Supplementary Information.</w:t>
       </w:r>
     </w:p>
-    <w:bookmarkEnd w:id="49"/>
-    <w:bookmarkStart w:id="50" w:name="Xd3d239ff07d74f694934d7759f77f1b836e1757"/>
+    <w:bookmarkEnd w:id="50"/>
+    <w:bookmarkStart w:id="51" w:name="Xd3d239ff07d74f694934d7759f77f1b836e1757"/>
     <w:p>
       <w:pPr>
         <w:pStyle w:val="Heading2"/>
@@ -10800,8 +10764,8 @@
         <w:t xml:space="preserve">), indicating the association is not an artifact of self-correlation.</w:t>
       </w:r>
     </w:p>
-    <w:bookmarkEnd w:id="50"/>
-    <w:bookmarkStart w:id="51" w:name="Xc6cdaaedd08fffd54565f906bd3987bb8958945"/>
+    <w:bookmarkEnd w:id="51"/>
+    <w:bookmarkStart w:id="52" w:name="Xc6cdaaedd08fffd54565f906bd3987bb8958945"/>
     <w:p>
       <w:pPr>
         <w:pStyle w:val="Heading2"/>
@@ -11000,8 +10964,8 @@
         <w:t xml:space="preserve">. Because the risk score under either formulation is a function of the sample loadings rather than of the gene-program basis, a new sample needs loadings of its own. SurvNMF documents such a step, obtaining them for held-out samples by a constrained least-squares fit; that step holds the gene basis fixed and needs neither relearning of the basis nor validation survival outcomes, so it is an additional fitting step at transfer rather than a leak. CoxNMF’s published description does not specify a new-sample scoring procedure (Supplementary Table [tab:architecture]). Sample-side supervision can nonetheless influence the basis indirectly, through the alternating reconstruction updates. External survival outcomes were used to estimate associations and evaluate performance, including the separately described recalibration analysis, rather than to learn or tune the primary programs or risk score. Further training and validation details appear in Supplementary Information, Part I.</w:t>
       </w:r>
     </w:p>
-    <w:bookmarkEnd w:id="51"/>
-    <w:bookmarkStart w:id="52" w:name="simulation-studies"/>
+    <w:bookmarkEnd w:id="52"/>
+    <w:bookmarkStart w:id="53" w:name="simulation-studies"/>
     <w:p>
       <w:pPr>
         <w:pStyle w:val="Heading2"/>
@@ -12198,8 +12162,8 @@
         <w:t xml:space="preserve">); in the mixed scenario, marker-only and full survival-gene definitions of the target were evaluated separately.</w:t>
       </w:r>
     </w:p>
-    <w:bookmarkEnd w:id="52"/>
-    <w:bookmarkStart w:id="53" w:name="pdac-datasets-and-preprocessing"/>
+    <w:bookmarkEnd w:id="53"/>
+    <w:bookmarkStart w:id="54" w:name="pdac-datasets-and-preprocessing"/>
     <w:p>
       <w:pPr>
         <w:pStyle w:val="Heading2"/>
@@ -12378,8 +12342,8 @@
         <w:t xml:space="preserve">. This yielded a combined validation population of 570 unique patients (388 deaths) spanning four independent patient cohorts.</w:t>
       </w:r>
     </w:p>
-    <w:bookmarkEnd w:id="53"/>
-    <w:bookmarkStart w:id="54" w:name="ethics-sex-and-gender-and-ancestry"/>
+    <w:bookmarkEnd w:id="54"/>
+    <w:bookmarkStart w:id="55" w:name="ethics-sex-and-gender-and-ancestry"/>
     <w:p>
       <w:pPr>
         <w:pStyle w:val="Heading2"/>
@@ -12396,8 +12360,8 @@
         <w:t xml:space="preserve">Each dataset was collected under the ethical approvals and consent procedures of the original study. This secondary analysis used only de-identified, previously collected data and was not submitted for separate Institutional Review Board (IRB) review at the University of North Carolina at Chapel Hill. The patient cohorts analyzed in this study were curated by the original investigators or consortia (TCGA, CPTAC, ICGC, and the original Moffitt, Dijk, and Puleo studies) and our access was limited to the de-identified expression and survival data they provide. Sex was recorded in every cohort and was included as a covariate in the clinical-adjustment analyses (Supplementary Table [tab:clinical-adjustment]); cohort-specific estimates and complete-case sample sizes are reported there. We did not conduct sex-stratified analyses, because the study was not powered for subgroup comparisons within individual cohorts, and we did not stratify by race or ethnicity because those annotations were not consistently available across cohorts. Whether the prognostic relevance of these gene programs differs by sex, race, or ethnicity remains an important question for adequately powered, more comprehensively annotated cohorts.</w:t>
       </w:r>
     </w:p>
-    <w:bookmarkEnd w:id="54"/>
-    <w:bookmarkStart w:id="55" w:name="treated-cohort-analyses"/>
+    <w:bookmarkEnd w:id="55"/>
+    <w:bookmarkStart w:id="56" w:name="treated-cohort-analyses"/>
     <w:p>
       <w:pPr>
         <w:pStyle w:val="Heading2"/>
@@ -12434,8 +12398,8 @@
         <w:t xml:space="preserve">patients, 123 deaths; laser-capture microdissected, epithelial-enriched expression), the association of the projected D1 score with survival was reported both as arm-specific estimates and as a common slope from a Cox model stratified by treatment arm, which allows arm-specific baseline hazards, with a treatment-by-D1 interaction test reported descriptively; no estimate is pooled across cohorts. In the Linehan cohort of borderline-resectable or locally advanced disease, 29 patients with paired pre- and post-treatment biopsies were compared on the projected D2 score by a paired Wilcoxon signed-rank test; this analysis concerns program level, not survival. Both analyses were exploratory and not preregistered.</w:t>
       </w:r>
     </w:p>
-    <w:bookmarkEnd w:id="55"/>
-    <w:bookmarkStart w:id="56" w:name="use-of-large-language-models"/>
+    <w:bookmarkEnd w:id="56"/>
+    <w:bookmarkStart w:id="57" w:name="use-of-large-language-models"/>
     <w:p>
       <w:pPr>
         <w:pStyle w:val="Heading2"/>
@@ -12452,9 +12416,9 @@
         <w:t xml:space="preserve">During preparation of this manuscript, the authors used large language models (Claude, Anthropic; ChatGPT, OpenAI) for language editing, for assistance with code used to generate and format the display items, for verification of the written algorithm description against the released code, and for critical review of the manuscript’s presentation and evidentiary framing. All model output was directed, reviewed, and verified by the authors, who take full responsibility for the work. The models were not used to design the study or to develop the DeSurv methodology, and they do not meet the criteria for authorship.</w:t>
       </w:r>
     </w:p>
-    <w:bookmarkEnd w:id="56"/>
     <w:bookmarkEnd w:id="57"/>
-    <w:bookmarkStart w:id="58" w:name="data-availability"/>
+    <w:bookmarkEnd w:id="58"/>
+    <w:bookmarkStart w:id="59" w:name="data-availability"/>
     <w:p>
       <w:pPr>
         <w:pStyle w:val="Heading1"/>
@@ -12581,8 +12545,8 @@
         <w:t xml:space="preserve">), so that every treated-cohort value can be inspected and verified. Code used to generate the COMPASS D1–GATA6 comparison (main-text Fig. [fig:pdac]e) is also provided in the reproducibility repository; reproduction of the patient-level analysis requires authorized access to the COMPASS data.</w:t>
       </w:r>
     </w:p>
-    <w:bookmarkEnd w:id="58"/>
-    <w:bookmarkStart w:id="61" w:name="code-availability"/>
+    <w:bookmarkEnd w:id="59"/>
+    <w:bookmarkStart w:id="62" w:name="code-availability"/>
     <w:p>
       <w:pPr>
         <w:pStyle w:val="Heading1"/>
@@ -12700,7 +12664,7 @@
       <w:r>
         <w:t xml:space="preserve"> </w:t>
       </w:r>
-      <w:hyperlink r:id="rId59">
+      <w:hyperlink r:id="rId60">
         <w:r>
           <w:rPr>
             <w:rStyle w:val="Hyperlink"/>
@@ -12729,7 +12693,7 @@
       <w:r>
         <w:t xml:space="preserve"> </w:t>
       </w:r>
-      <w:hyperlink r:id="rId60">
+      <w:hyperlink r:id="rId61">
         <w:r>
           <w:rPr>
             <w:rStyle w:val="Hyperlink"/>
@@ -12768,8 +12732,8 @@
         <w:t xml:space="preserve">, which generates the treated-cohort summary statistics above.</w:t>
       </w:r>
     </w:p>
-    <w:bookmarkEnd w:id="61"/>
-    <w:bookmarkStart w:id="62" w:name="acknowledgements"/>
+    <w:bookmarkEnd w:id="62"/>
+    <w:bookmarkStart w:id="63" w:name="acknowledgements"/>
     <w:p>
       <w:pPr>
         <w:pStyle w:val="Heading1"/>
@@ -12786,8 +12750,8 @@
         <w:t xml:space="preserve">This work was supported by the National Cancer Institute grants U01 CA274298, P50 CA257911, T32 CA106209, and R01 CA288145, and by the Department of Defense Peer Reviewed Cancer Research Program (HT9425241103100121). We thank the patients and research teams who contributed samples and clinical data to the public cohorts used here (TCGA, CPTAC, Dijk, Moffitt, Puleo, PACA-AU).</w:t>
       </w:r>
     </w:p>
-    <w:bookmarkEnd w:id="62"/>
-    <w:bookmarkStart w:id="63" w:name="author-contributions"/>
+    <w:bookmarkEnd w:id="63"/>
+    <w:bookmarkStart w:id="64" w:name="author-contributions"/>
     <w:p>
       <w:pPr>
         <w:pStyle w:val="Heading1"/>
@@ -12804,8 +12768,8 @@
         <w:t xml:space="preserve">Conceptualization: A.M.Y., N.U.R. Methodology: A.M.Y., A.Y., D.L., N.U.R. Software: A.M.Y. Formal analysis: A.M.Y. Investigation: A.M.Y. Data curation: A.M.Y., X.L.P. Visualization: A.M.Y. Writing – original draft: A.M.Y., N.U.R. Writing – review and editing: A.M.Y., A.Y., X.L.P., J.J.Y., D.L., N.U.R. Resources (PDAC domain expertise and biological interpretation): X.L.P., J.J.Y. Supervision: N.U.R. Funding acquisition: A.M.Y., N.U.R. All authors reviewed and approved the final manuscript.</w:t>
       </w:r>
     </w:p>
-    <w:bookmarkEnd w:id="63"/>
-    <w:bookmarkStart w:id="64" w:name="competing-interests"/>
+    <w:bookmarkEnd w:id="64"/>
+    <w:bookmarkStart w:id="65" w:name="competing-interests"/>
     <w:p>
       <w:pPr>
         <w:pStyle w:val="Heading1"/>
@@ -12822,8 +12786,8 @@
         <w:t xml:space="preserve">N.U.R. and J.J.Y. are named as inventors on US patents US20220127676A1 and US20250066856A1, which relate to pancreatic cancer subtype classification. The PurIST and DeCAF classifiers were used only as published, independently derived comparators: their subtype calls were obtained with the released classifiers and enter only as fixed covariates in the adjustment analyses, not as components of DeSurv. The other authors declare no competing interests.</w:t>
       </w:r>
     </w:p>
-    <w:bookmarkEnd w:id="64"/>
-    <w:bookmarkStart w:id="149" w:name="references"/>
+    <w:bookmarkEnd w:id="65"/>
+    <w:bookmarkStart w:id="150" w:name="references"/>
     <w:p>
       <w:pPr>
         <w:pStyle w:val="Heading1"/>
@@ -12832,8 +12796,8 @@
         <w:t xml:space="preserve">References</w:t>
       </w:r>
     </w:p>
-    <w:bookmarkStart w:id="148" w:name="refs"/>
-    <w:bookmarkStart w:id="66" w:name="ref-siegel2026cancer"/>
+    <w:bookmarkStart w:id="149" w:name="refs"/>
+    <w:bookmarkStart w:id="67" w:name="ref-siegel2026cancer"/>
     <w:p>
       <w:pPr>
         <w:pStyle w:val="Bibliography"/>
@@ -12853,7 +12817,7 @@
       <w:r>
         <w:t xml:space="preserve"> </w:t>
       </w:r>
-      <w:hyperlink r:id="rId65">
+      <w:hyperlink r:id="rId66">
         <w:r>
           <w:rPr>
             <w:rStyle w:val="Hyperlink"/>
@@ -12888,8 +12852,8 @@
         <w:t xml:space="preserve">, e70043 (2026).</w:t>
       </w:r>
     </w:p>
-    <w:bookmarkEnd w:id="66"/>
-    <w:bookmarkStart w:id="68" w:name="ref-collisson2011subtypes"/>
+    <w:bookmarkEnd w:id="67"/>
+    <w:bookmarkStart w:id="69" w:name="ref-collisson2011subtypes"/>
     <w:p>
       <w:pPr>
         <w:pStyle w:val="Bibliography"/>
@@ -12919,7 +12883,7 @@
       <w:r>
         <w:t xml:space="preserve"> </w:t>
       </w:r>
-      <w:hyperlink r:id="rId67">
+      <w:hyperlink r:id="rId68">
         <w:r>
           <w:rPr>
             <w:rStyle w:val="Hyperlink"/>
@@ -12954,8 +12918,8 @@
         <w:t xml:space="preserve">, 500–503 (2011).</w:t>
       </w:r>
     </w:p>
-    <w:bookmarkEnd w:id="68"/>
-    <w:bookmarkStart w:id="70" w:name="ref-moffitt2015virtual"/>
+    <w:bookmarkEnd w:id="69"/>
+    <w:bookmarkStart w:id="71" w:name="ref-moffitt2015virtual"/>
     <w:p>
       <w:pPr>
         <w:pStyle w:val="Bibliography"/>
@@ -12985,7 +12949,7 @@
       <w:r>
         <w:t xml:space="preserve"> </w:t>
       </w:r>
-      <w:hyperlink r:id="rId69">
+      <w:hyperlink r:id="rId70">
         <w:r>
           <w:rPr>
             <w:rStyle w:val="Hyperlink"/>
@@ -13020,8 +12984,8 @@
         <w:t xml:space="preserve">, 1168–1178 (2015).</w:t>
       </w:r>
     </w:p>
-    <w:bookmarkEnd w:id="70"/>
-    <w:bookmarkStart w:id="72" w:name="ref-rashid2020purity"/>
+    <w:bookmarkEnd w:id="71"/>
+    <w:bookmarkStart w:id="73" w:name="ref-rashid2020purity"/>
     <w:p>
       <w:pPr>
         <w:pStyle w:val="Bibliography"/>
@@ -13051,7 +13015,7 @@
       <w:r>
         <w:t xml:space="preserve"> </w:t>
       </w:r>
-      <w:hyperlink r:id="rId71">
+      <w:hyperlink r:id="rId72">
         <w:r>
           <w:rPr>
             <w:rStyle w:val="Hyperlink"/>
@@ -13086,8 +13050,8 @@
         <w:t xml:space="preserve">, 82–92 (2020).</w:t>
       </w:r>
     </w:p>
-    <w:bookmarkEnd w:id="72"/>
-    <w:bookmarkStart w:id="74" w:name="ref-peng2024determination"/>
+    <w:bookmarkEnd w:id="73"/>
+    <w:bookmarkStart w:id="75" w:name="ref-peng2024determination"/>
     <w:p>
       <w:pPr>
         <w:pStyle w:val="Bibliography"/>
@@ -13117,7 +13081,7 @@
       <w:r>
         <w:t xml:space="preserve"> </w:t>
       </w:r>
-      <w:hyperlink r:id="rId73">
+      <w:hyperlink r:id="rId74">
         <w:r>
           <w:rPr>
             <w:rStyle w:val="Hyperlink"/>
@@ -13152,8 +13116,8 @@
         <w:t xml:space="preserve">, 102611 (2026).</w:t>
       </w:r>
     </w:p>
-    <w:bookmarkEnd w:id="74"/>
-    <w:bookmarkStart w:id="76" w:name="ref-moncada2020spatial"/>
+    <w:bookmarkEnd w:id="75"/>
+    <w:bookmarkStart w:id="77" w:name="ref-moncada2020spatial"/>
     <w:p>
       <w:pPr>
         <w:pStyle w:val="Bibliography"/>
@@ -13183,7 +13147,7 @@
       <w:r>
         <w:t xml:space="preserve"> </w:t>
       </w:r>
-      <w:hyperlink r:id="rId75">
+      <w:hyperlink r:id="rId76">
         <w:r>
           <w:rPr>
             <w:rStyle w:val="Hyperlink"/>
@@ -13236,8 +13200,8 @@
         <w:t xml:space="preserve">, 333–342 (2020).</w:t>
       </w:r>
     </w:p>
-    <w:bookmarkEnd w:id="76"/>
-    <w:bookmarkStart w:id="78" w:name="ref-hwang2022single"/>
+    <w:bookmarkEnd w:id="77"/>
+    <w:bookmarkStart w:id="79" w:name="ref-hwang2022single"/>
     <w:p>
       <w:pPr>
         <w:pStyle w:val="Bibliography"/>
@@ -13267,7 +13231,7 @@
       <w:r>
         <w:t xml:space="preserve"> </w:t>
       </w:r>
-      <w:hyperlink r:id="rId77">
+      <w:hyperlink r:id="rId78">
         <w:r>
           <w:rPr>
             <w:rStyle w:val="Hyperlink"/>
@@ -13302,8 +13266,8 @@
         <w:t xml:space="preserve">, 1178–1191 (2022).</w:t>
       </w:r>
     </w:p>
-    <w:bookmarkEnd w:id="78"/>
-    <w:bookmarkStart w:id="80" w:name="ref-werba2023single"/>
+    <w:bookmarkEnd w:id="79"/>
+    <w:bookmarkStart w:id="81" w:name="ref-werba2023single"/>
     <w:p>
       <w:pPr>
         <w:pStyle w:val="Bibliography"/>
@@ -13333,7 +13297,7 @@
       <w:r>
         <w:t xml:space="preserve"> </w:t>
       </w:r>
-      <w:hyperlink r:id="rId79">
+      <w:hyperlink r:id="rId80">
         <w:r>
           <w:rPr>
             <w:rStyle w:val="Hyperlink"/>
@@ -13368,8 +13332,8 @@
         <w:t xml:space="preserve">, 797 (2023).</w:t>
       </w:r>
     </w:p>
-    <w:bookmarkEnd w:id="80"/>
-    <w:bookmarkStart w:id="82" w:name="ref-Bailey2016"/>
+    <w:bookmarkEnd w:id="81"/>
+    <w:bookmarkStart w:id="83" w:name="ref-Bailey2016"/>
     <w:p>
       <w:pPr>
         <w:pStyle w:val="Bibliography"/>
@@ -13399,7 +13363,7 @@
       <w:r>
         <w:t xml:space="preserve"> </w:t>
       </w:r>
-      <w:hyperlink r:id="rId81">
+      <w:hyperlink r:id="rId82">
         <w:r>
           <w:rPr>
             <w:rStyle w:val="Hyperlink"/>
@@ -13434,8 +13398,8 @@
         <w:t xml:space="preserve">, 47–52 (2016).</w:t>
       </w:r>
     </w:p>
-    <w:bookmarkEnd w:id="82"/>
-    <w:bookmarkStart w:id="84" w:name="ref-aung2018compass"/>
+    <w:bookmarkEnd w:id="83"/>
+    <w:bookmarkStart w:id="85" w:name="ref-aung2018compass"/>
     <w:p>
       <w:pPr>
         <w:pStyle w:val="Bibliography"/>
@@ -13465,7 +13429,7 @@
       <w:r>
         <w:t xml:space="preserve"> </w:t>
       </w:r>
-      <w:hyperlink r:id="rId83">
+      <w:hyperlink r:id="rId84">
         <w:r>
           <w:rPr>
             <w:rStyle w:val="Hyperlink"/>
@@ -13500,8 +13464,8 @@
         <w:t xml:space="preserve">, 1344–1354 (2018).</w:t>
       </w:r>
     </w:p>
-    <w:bookmarkEnd w:id="84"/>
-    <w:bookmarkStart w:id="86" w:name="ref-nguyen2024fourteen"/>
+    <w:bookmarkEnd w:id="85"/>
+    <w:bookmarkStart w:id="87" w:name="ref-nguyen2024fourteen"/>
     <w:p>
       <w:pPr>
         <w:pStyle w:val="Bibliography"/>
@@ -13521,7 +13485,7 @@
       <w:r>
         <w:t xml:space="preserve"> </w:t>
       </w:r>
-      <w:hyperlink r:id="rId85">
+      <w:hyperlink r:id="rId86">
         <w:r>
           <w:rPr>
             <w:rStyle w:val="Hyperlink"/>
@@ -13556,8 +13520,8 @@
         <w:t xml:space="preserve">, 4761–4783 (2024).</w:t>
       </w:r>
     </w:p>
-    <w:bookmarkEnd w:id="86"/>
-    <w:bookmarkStart w:id="88" w:name="ref-lee1999learning"/>
+    <w:bookmarkEnd w:id="87"/>
+    <w:bookmarkStart w:id="89" w:name="ref-lee1999learning"/>
     <w:p>
       <w:pPr>
         <w:pStyle w:val="Bibliography"/>
@@ -13577,7 +13541,7 @@
       <w:r>
         <w:t xml:space="preserve"> </w:t>
       </w:r>
-      <w:hyperlink r:id="rId87">
+      <w:hyperlink r:id="rId88">
         <w:r>
           <w:rPr>
             <w:rStyle w:val="Hyperlink"/>
@@ -13612,8 +13576,8 @@
         <w:t xml:space="preserve">, 788–791 (1999).</w:t>
       </w:r>
     </w:p>
-    <w:bookmarkEnd w:id="88"/>
-    <w:bookmarkStart w:id="90" w:name="ref-brunet2004metagenes"/>
+    <w:bookmarkEnd w:id="89"/>
+    <w:bookmarkStart w:id="91" w:name="ref-brunet2004metagenes"/>
     <w:p>
       <w:pPr>
         <w:pStyle w:val="Bibliography"/>
@@ -13633,7 +13597,7 @@
       <w:r>
         <w:t xml:space="preserve"> </w:t>
       </w:r>
-      <w:hyperlink r:id="rId89">
+      <w:hyperlink r:id="rId90">
         <w:r>
           <w:rPr>
             <w:rStyle w:val="Hyperlink"/>
@@ -13668,8 +13632,8 @@
         <w:t xml:space="preserve">, 4164–4169 (2004).</w:t>
       </w:r>
     </w:p>
-    <w:bookmarkEnd w:id="90"/>
-    <w:bookmarkStart w:id="92" w:name="ref-peng2019novo"/>
+    <w:bookmarkEnd w:id="91"/>
+    <w:bookmarkStart w:id="93" w:name="ref-peng2019novo"/>
     <w:p>
       <w:pPr>
         <w:pStyle w:val="Bibliography"/>
@@ -13689,7 +13653,7 @@
       <w:r>
         <w:t xml:space="preserve"> </w:t>
       </w:r>
-      <w:hyperlink r:id="rId91">
+      <w:hyperlink r:id="rId92">
         <w:r>
           <w:rPr>
             <w:rStyle w:val="Hyperlink"/>
@@ -13724,8 +13688,8 @@
         <w:t xml:space="preserve">, 4729 (2019).</w:t>
       </w:r>
     </w:p>
-    <w:bookmarkEnd w:id="92"/>
-    <w:bookmarkStart w:id="94" w:name="ref-bair2004semi"/>
+    <w:bookmarkEnd w:id="93"/>
+    <w:bookmarkStart w:id="95" w:name="ref-bair2004semi"/>
     <w:p>
       <w:pPr>
         <w:pStyle w:val="Bibliography"/>
@@ -13745,7 +13709,7 @@
       <w:r>
         <w:t xml:space="preserve"> </w:t>
       </w:r>
-      <w:hyperlink r:id="rId93">
+      <w:hyperlink r:id="rId94">
         <w:r>
           <w:rPr>
             <w:rStyle w:val="Hyperlink"/>
@@ -13780,8 +13744,8 @@
         <w:t xml:space="preserve">, e108 (2004).</w:t>
       </w:r>
     </w:p>
-    <w:bookmarkEnd w:id="94"/>
-    <w:bookmarkStart w:id="96" w:name="ref-cook2007fisher"/>
+    <w:bookmarkEnd w:id="95"/>
+    <w:bookmarkStart w:id="97" w:name="ref-cook2007fisher"/>
     <w:p>
       <w:pPr>
         <w:pStyle w:val="Bibliography"/>
@@ -13801,7 +13765,7 @@
       <w:r>
         <w:t xml:space="preserve"> </w:t>
       </w:r>
-      <w:hyperlink r:id="rId95">
+      <w:hyperlink r:id="rId96">
         <w:r>
           <w:rPr>
             <w:rStyle w:val="Hyperlink"/>
@@ -13836,8 +13800,8 @@
         <w:t xml:space="preserve">, 1–26 (2007).</w:t>
       </w:r>
     </w:p>
-    <w:bookmarkEnd w:id="96"/>
-    <w:bookmarkStart w:id="98" w:name="ref-torrehealy2023pdacr"/>
+    <w:bookmarkEnd w:id="97"/>
+    <w:bookmarkStart w:id="99" w:name="ref-torrehealy2023pdacr"/>
     <w:p>
       <w:pPr>
         <w:pStyle w:val="Bibliography"/>
@@ -13867,7 +13831,7 @@
       <w:r>
         <w:t xml:space="preserve"> </w:t>
       </w:r>
-      <w:hyperlink r:id="rId97">
+      <w:hyperlink r:id="rId98">
         <w:r>
           <w:rPr>
             <w:rStyle w:val="Hyperlink"/>
@@ -13902,8 +13866,8 @@
         <w:t xml:space="preserve">, 163 (2023).</w:t>
       </w:r>
     </w:p>
-    <w:bookmarkEnd w:id="98"/>
-    <w:bookmarkStart w:id="100" w:name="ref-aran2015systematic"/>
+    <w:bookmarkEnd w:id="99"/>
+    <w:bookmarkStart w:id="101" w:name="ref-aran2015systematic"/>
     <w:p>
       <w:pPr>
         <w:pStyle w:val="Bibliography"/>
@@ -13923,7 +13887,7 @@
       <w:r>
         <w:t xml:space="preserve"> </w:t>
       </w:r>
-      <w:hyperlink r:id="rId99">
+      <w:hyperlink r:id="rId100">
         <w:r>
           <w:rPr>
             <w:rStyle w:val="Hyperlink"/>
@@ -13958,8 +13922,8 @@
         <w:t xml:space="preserve">, 9971 (2015).</w:t>
       </w:r>
     </w:p>
-    <w:bookmarkEnd w:id="100"/>
-    <w:bookmarkStart w:id="101" w:name="ref-donoho2004nmf"/>
+    <w:bookmarkEnd w:id="101"/>
+    <w:bookmarkStart w:id="102" w:name="ref-donoho2004nmf"/>
     <w:p>
       <w:pPr>
         <w:pStyle w:val="Bibliography"/>
@@ -13993,8 +13957,8 @@
         <w:t xml:space="preserve">(eds. Thrun, S., Saul, L. K. &amp; Schölkopf, B.) 1141–1148 (MIT Press, 2004).</w:t>
       </w:r>
     </w:p>
-    <w:bookmarkEnd w:id="101"/>
-    <w:bookmarkStart w:id="103" w:name="ref-laurberg2008uniqueness"/>
+    <w:bookmarkEnd w:id="102"/>
+    <w:bookmarkStart w:id="104" w:name="ref-laurberg2008uniqueness"/>
     <w:p>
       <w:pPr>
         <w:pStyle w:val="Bibliography"/>
@@ -14014,7 +13978,7 @@
       <w:r>
         <w:t xml:space="preserve"> </w:t>
       </w:r>
-      <w:hyperlink r:id="rId102">
+      <w:hyperlink r:id="rId103">
         <w:r>
           <w:rPr>
             <w:rStyle w:val="Hyperlink"/>
@@ -14049,8 +14013,8 @@
         <w:t xml:space="preserve">, 764206 (2008).</w:t>
       </w:r>
     </w:p>
-    <w:bookmarkEnd w:id="103"/>
-    <w:bookmarkStart w:id="104" w:name="ref-gillis2014nmf"/>
+    <w:bookmarkEnd w:id="104"/>
+    <w:bookmarkStart w:id="105" w:name="ref-gillis2014nmf"/>
     <w:p>
       <w:pPr>
         <w:pStyle w:val="Bibliography"/>
@@ -14084,8 +14048,8 @@
         <w:t xml:space="preserve">(eds. Suykens, J. A. K., Signoretto, M. &amp; Argyriou, A.) 257–291 (Chapman; Hall/CRC, 2014).</w:t>
       </w:r>
     </w:p>
-    <w:bookmarkEnd w:id="104"/>
-    <w:bookmarkStart w:id="106" w:name="ref-lautizi2022pancreatic"/>
+    <w:bookmarkEnd w:id="105"/>
+    <w:bookmarkStart w:id="107" w:name="ref-lautizi2022pancreatic"/>
     <w:p>
       <w:pPr>
         <w:pStyle w:val="Bibliography"/>
@@ -14105,7 +14069,7 @@
       <w:r>
         <w:t xml:space="preserve"> </w:t>
       </w:r>
-      <w:hyperlink r:id="rId105">
+      <w:hyperlink r:id="rId106">
         <w:r>
           <w:rPr>
             <w:rStyle w:val="Hyperlink"/>
@@ -14140,8 +14104,8 @@
         <w:t xml:space="preserve">, zcac030 (2022).</w:t>
       </w:r>
     </w:p>
-    <w:bookmarkEnd w:id="106"/>
-    <w:bookmarkStart w:id="108" w:name="ref-simon2011regularization"/>
+    <w:bookmarkEnd w:id="107"/>
+    <w:bookmarkStart w:id="109" w:name="ref-simon2011regularization"/>
     <w:p>
       <w:pPr>
         <w:pStyle w:val="Bibliography"/>
@@ -14161,7 +14125,7 @@
       <w:r>
         <w:t xml:space="preserve"> </w:t>
       </w:r>
-      <w:hyperlink r:id="rId107">
+      <w:hyperlink r:id="rId108">
         <w:r>
           <w:rPr>
             <w:rStyle w:val="Hyperlink"/>
@@ -14220,8 +14184,8 @@
         <w:t xml:space="preserve">, 1–13 (2011).</w:t>
       </w:r>
     </w:p>
-    <w:bookmarkEnd w:id="108"/>
-    <w:bookmarkStart w:id="110" w:name="ref-raphael2017integrated"/>
+    <w:bookmarkEnd w:id="109"/>
+    <w:bookmarkStart w:id="111" w:name="ref-raphael2017integrated"/>
     <w:p>
       <w:pPr>
         <w:pStyle w:val="Bibliography"/>
@@ -14251,7 +14215,7 @@
       <w:r>
         <w:t xml:space="preserve"> </w:t>
       </w:r>
-      <w:hyperlink r:id="rId109">
+      <w:hyperlink r:id="rId110">
         <w:r>
           <w:rPr>
             <w:rStyle w:val="Hyperlink"/>
@@ -14286,8 +14250,8 @@
         <w:t xml:space="preserve">, 185–203 (2017).</w:t>
       </w:r>
     </w:p>
-    <w:bookmarkEnd w:id="110"/>
-    <w:bookmarkStart w:id="112" w:name="ref-cao2021proteogenomic"/>
+    <w:bookmarkEnd w:id="111"/>
+    <w:bookmarkStart w:id="113" w:name="ref-cao2021proteogenomic"/>
     <w:p>
       <w:pPr>
         <w:pStyle w:val="Bibliography"/>
@@ -14317,7 +14281,7 @@
       <w:r>
         <w:t xml:space="preserve"> </w:t>
       </w:r>
-      <w:hyperlink r:id="rId111">
+      <w:hyperlink r:id="rId112">
         <w:r>
           <w:rPr>
             <w:rStyle w:val="Hyperlink"/>
@@ -14352,8 +14316,8 @@
         <w:t xml:space="preserve">, 5031–5052 (2021).</w:t>
       </w:r>
     </w:p>
-    <w:bookmarkEnd w:id="112"/>
-    <w:bookmarkStart w:id="114" w:name="ref-snoek2012practical"/>
+    <w:bookmarkEnd w:id="113"/>
+    <w:bookmarkStart w:id="115" w:name="ref-snoek2012practical"/>
     <w:p>
       <w:pPr>
         <w:pStyle w:val="Bibliography"/>
@@ -14373,7 +14337,7 @@
       <w:r>
         <w:t xml:space="preserve"> </w:t>
       </w:r>
-      <w:hyperlink r:id="rId113">
+      <w:hyperlink r:id="rId114">
         <w:r>
           <w:rPr>
             <w:rStyle w:val="Hyperlink"/>
@@ -14419,8 +14383,8 @@
         <w:t xml:space="preserve">(2012).</w:t>
       </w:r>
     </w:p>
-    <w:bookmarkEnd w:id="114"/>
-    <w:bookmarkStart w:id="116" w:name="ref-shahriari2016taking"/>
+    <w:bookmarkEnd w:id="115"/>
+    <w:bookmarkStart w:id="117" w:name="ref-shahriari2016taking"/>
     <w:p>
       <w:pPr>
         <w:pStyle w:val="Bibliography"/>
@@ -14440,7 +14404,7 @@
       <w:r>
         <w:t xml:space="preserve"> </w:t>
       </w:r>
-      <w:hyperlink r:id="rId115">
+      <w:hyperlink r:id="rId116">
         <w:r>
           <w:rPr>
             <w:rStyle w:val="Hyperlink"/>
@@ -14493,8 +14457,8 @@
         <w:t xml:space="preserve">, 148–175 (2016).</w:t>
       </w:r>
     </w:p>
-    <w:bookmarkEnd w:id="116"/>
-    <w:bookmarkStart w:id="118" w:name="ref-frigyesi2008nmf"/>
+    <w:bookmarkEnd w:id="117"/>
+    <w:bookmarkStart w:id="119" w:name="ref-frigyesi2008nmf"/>
     <w:p>
       <w:pPr>
         <w:pStyle w:val="Bibliography"/>
@@ -14514,7 +14478,7 @@
       <w:r>
         <w:t xml:space="preserve"> </w:t>
       </w:r>
-      <w:hyperlink r:id="rId117">
+      <w:hyperlink r:id="rId118">
         <w:r>
           <w:rPr>
             <w:rStyle w:val="Hyperlink"/>
@@ -14549,8 +14513,8 @@
         <w:t xml:space="preserve">, 275–292 (2008).</w:t>
       </w:r>
     </w:p>
-    <w:bookmarkEnd w:id="118"/>
-    <w:bookmarkStart w:id="120" w:name="ref-leary2023s"/>
+    <w:bookmarkEnd w:id="119"/>
+    <w:bookmarkStart w:id="121" w:name="ref-leary2023s"/>
     <w:p>
       <w:pPr>
         <w:pStyle w:val="Bibliography"/>
@@ -14580,7 +14544,7 @@
       <w:r>
         <w:t xml:space="preserve"> </w:t>
       </w:r>
-      <w:hyperlink r:id="rId119">
+      <w:hyperlink r:id="rId120">
         <w:r>
           <w:rPr>
             <w:rStyle w:val="Hyperlink"/>
@@ -14645,8 +14609,8 @@
         <w:t xml:space="preserve">, btad449 (2023).</w:t>
       </w:r>
     </w:p>
-    <w:bookmarkEnd w:id="120"/>
-    <w:bookmarkStart w:id="122" w:name="ref-Maurer2019"/>
+    <w:bookmarkEnd w:id="121"/>
+    <w:bookmarkStart w:id="123" w:name="ref-Maurer2019"/>
     <w:p>
       <w:pPr>
         <w:pStyle w:val="Bibliography"/>
@@ -14676,7 +14640,7 @@
       <w:r>
         <w:t xml:space="preserve"> </w:t>
       </w:r>
-      <w:hyperlink r:id="rId121">
+      <w:hyperlink r:id="rId122">
         <w:r>
           <w:rPr>
             <w:rStyle w:val="Hyperlink"/>
@@ -14711,8 +14675,8 @@
         <w:t xml:space="preserve">, 1034–1043 (2019).</w:t>
       </w:r>
     </w:p>
-    <w:bookmarkEnd w:id="122"/>
-    <w:bookmarkStart w:id="123" w:name="ref-shapley1953value"/>
+    <w:bookmarkEnd w:id="123"/>
+    <w:bookmarkStart w:id="124" w:name="ref-shapley1953value"/>
     <w:p>
       <w:pPr>
         <w:pStyle w:val="Bibliography"/>
@@ -14746,8 +14710,8 @@
         <w:t xml:space="preserve">(eds. Kuhn, H. W. &amp; Tucker, A. W.) 307–317 (Princeton University Press, 1953).</w:t>
       </w:r>
     </w:p>
-    <w:bookmarkEnd w:id="123"/>
-    <w:bookmarkStart w:id="124" w:name="ref-huang2020low"/>
+    <w:bookmarkEnd w:id="124"/>
+    <w:bookmarkStart w:id="125" w:name="ref-huang2020low"/>
     <w:p>
       <w:pPr>
         <w:pStyle w:val="Bibliography"/>
@@ -14781,8 +14745,8 @@
         <w:t xml:space="preserve">(2020).</w:t>
       </w:r>
     </w:p>
-    <w:bookmarkEnd w:id="124"/>
-    <w:bookmarkStart w:id="125" w:name="ref-le2025survnmf"/>
+    <w:bookmarkEnd w:id="125"/>
+    <w:bookmarkStart w:id="126" w:name="ref-le2025survnmf"/>
     <w:p>
       <w:pPr>
         <w:pStyle w:val="Bibliography"/>
@@ -14829,8 +14793,8 @@
         <w:t xml:space="preserve">(2025).</w:t>
       </w:r>
     </w:p>
-    <w:bookmarkEnd w:id="125"/>
-    <w:bookmarkStart w:id="127" w:name="ref-smith2020standard"/>
+    <w:bookmarkEnd w:id="126"/>
+    <w:bookmarkStart w:id="128" w:name="ref-ogawa2020stroma"/>
     <w:p>
       <w:pPr>
         <w:pStyle w:val="Bibliography"/>
@@ -14845,7 +14809,7 @@
         <w:t xml:space="preserve">	</w:t>
       </w:r>
       <w:r>
-        <w:t xml:space="preserve">Smith, A. M.</w:t>
+        <w:t xml:space="preserve">Ogawa, Y.</w:t>
       </w:r>
       <w:r>
         <w:t xml:space="preserve"> </w:t>
@@ -14860,7 +14824,205 @@
       <w:r>
         <w:t xml:space="preserve"> </w:t>
       </w:r>
-      <w:hyperlink r:id="rId126">
+      <w:hyperlink r:id="rId127">
+        <w:r>
+          <w:rPr>
+            <w:rStyle w:val="Hyperlink"/>
+          </w:rPr>
+          <w:t xml:space="preserve">Three distinct stroma types in human pancreatic cancer identified by image analysis of fibroblast subpopulations and collagen</w:t>
+        </w:r>
+      </w:hyperlink>
+      <w:r>
+        <w:t xml:space="preserve">.</w:t>
+      </w:r>
+      <w:r>
+        <w:t xml:space="preserve"> </w:t>
+      </w:r>
+      <w:r>
+        <w:rPr>
+          <w:iCs/>
+          <w:i/>
+        </w:rPr>
+        <w:t xml:space="preserve">Clinical Cancer Research</w:t>
+      </w:r>
+      <w:r>
+        <w:t xml:space="preserve"> </w:t>
+      </w:r>
+      <w:r>
+        <w:rPr>
+          <w:bCs/>
+          <w:b/>
+        </w:rPr>
+        <w:t xml:space="preserve">27</w:t>
+      </w:r>
+      <w:r>
+        <w:t xml:space="preserve">, 107–119 (2021).</w:t>
+      </w:r>
+    </w:p>
+    <w:bookmarkEnd w:id="128"/>
+    <w:bookmarkStart w:id="130" w:name="ref-neuzillet2022periostin"/>
+    <w:p>
+      <w:pPr>
+        <w:pStyle w:val="Bibliography"/>
+      </w:pPr>
+      <w:r>
+        <w:t xml:space="preserve">35.</w:t>
+      </w:r>
+      <w:r>
+        <w:t xml:space="preserve"> </w:t>
+      </w:r>
+      <w:r>
+        <w:t xml:space="preserve">	</w:t>
+      </w:r>
+      <w:r>
+        <w:t xml:space="preserve">Neuzillet, C.</w:t>
+      </w:r>
+      <w:r>
+        <w:t xml:space="preserve"> </w:t>
+      </w:r>
+      <w:r>
+        <w:rPr>
+          <w:iCs/>
+          <w:i/>
+        </w:rPr>
+        <w:t xml:space="preserve">et al.</w:t>
+      </w:r>
+      <w:r>
+        <w:t xml:space="preserve"> </w:t>
+      </w:r>
+      <w:hyperlink r:id="rId129">
+        <w:r>
+          <w:rPr>
+            <w:rStyle w:val="Hyperlink"/>
+          </w:rPr>
+          <w:t xml:space="preserve">Periostin- and podoplanin-positive cancer-associated fibroblast subtypes cooperate to shape the inflamed tumor microenvironment in aggressive pancreatic adenocarcinoma</w:t>
+        </w:r>
+      </w:hyperlink>
+      <w:r>
+        <w:t xml:space="preserve">.</w:t>
+      </w:r>
+      <w:r>
+        <w:t xml:space="preserve"> </w:t>
+      </w:r>
+      <w:r>
+        <w:rPr>
+          <w:iCs/>
+          <w:i/>
+        </w:rPr>
+        <w:t xml:space="preserve">The Journal of Pathology</w:t>
+      </w:r>
+      <w:r>
+        <w:t xml:space="preserve"> </w:t>
+      </w:r>
+      <w:r>
+        <w:rPr>
+          <w:bCs/>
+          <w:b/>
+        </w:rPr>
+        <w:t xml:space="preserve">258</w:t>
+      </w:r>
+      <w:r>
+        <w:t xml:space="preserve">, 408–425 (2022).</w:t>
+      </w:r>
+    </w:p>
+    <w:bookmarkEnd w:id="130"/>
+    <w:bookmarkStart w:id="132" w:name="ref-lee2024tumorcaf"/>
+    <w:p>
+      <w:pPr>
+        <w:pStyle w:val="Bibliography"/>
+      </w:pPr>
+      <w:r>
+        <w:t xml:space="preserve">36.</w:t>
+      </w:r>
+      <w:r>
+        <w:t xml:space="preserve"> </w:t>
+      </w:r>
+      <w:r>
+        <w:t xml:space="preserve">	</w:t>
+      </w:r>
+      <w:r>
+        <w:t xml:space="preserve">Lee, J. J.</w:t>
+      </w:r>
+      <w:r>
+        <w:t xml:space="preserve"> </w:t>
+      </w:r>
+      <w:r>
+        <w:rPr>
+          <w:iCs/>
+          <w:i/>
+        </w:rPr>
+        <w:t xml:space="preserve">et al.</w:t>
+      </w:r>
+      <w:r>
+        <w:t xml:space="preserve"> </w:t>
+      </w:r>
+      <w:hyperlink r:id="rId131">
+        <w:r>
+          <w:rPr>
+            <w:rStyle w:val="Hyperlink"/>
+          </w:rPr>
+          <w:t xml:space="preserve">Tumor-intrinsic and cancer-associated fibroblast subtypes independently predict outcomes in pancreatic cancer</w:t>
+        </w:r>
+      </w:hyperlink>
+      <w:r>
+        <w:t xml:space="preserve">.</w:t>
+      </w:r>
+      <w:r>
+        <w:t xml:space="preserve"> </w:t>
+      </w:r>
+      <w:r>
+        <w:rPr>
+          <w:iCs/>
+          <w:i/>
+        </w:rPr>
+        <w:t xml:space="preserve">Annals of Surgery</w:t>
+      </w:r>
+      <w:r>
+        <w:t xml:space="preserve"> </w:t>
+      </w:r>
+      <w:r>
+        <w:rPr>
+          <w:bCs/>
+          <w:b/>
+        </w:rPr>
+        <w:t xml:space="preserve">280</w:t>
+      </w:r>
+      <w:r>
+        <w:t xml:space="preserve">, 659–666 (2024).</w:t>
+      </w:r>
+    </w:p>
+    <w:bookmarkEnd w:id="132"/>
+    <w:bookmarkStart w:id="134" w:name="ref-smith2020standard"/>
+    <w:p>
+      <w:pPr>
+        <w:pStyle w:val="Bibliography"/>
+      </w:pPr>
+      <w:r>
+        <w:t xml:space="preserve">37.</w:t>
+      </w:r>
+      <w:r>
+        <w:t xml:space="preserve"> </w:t>
+      </w:r>
+      <w:r>
+        <w:t xml:space="preserve">	</w:t>
+      </w:r>
+      <w:r>
+        <w:t xml:space="preserve">Smith, A. M.</w:t>
+      </w:r>
+      <w:r>
+        <w:t xml:space="preserve"> </w:t>
+      </w:r>
+      <w:r>
+        <w:rPr>
+          <w:iCs/>
+          <w:i/>
+        </w:rPr>
+        <w:t xml:space="preserve">et al.</w:t>
+      </w:r>
+      <w:r>
+        <w:t xml:space="preserve"> </w:t>
+      </w:r>
+      <w:hyperlink r:id="rId133">
         <w:r>
           <w:rPr>
             <w:rStyle w:val="Hyperlink"/>
@@ -14895,14 +15057,14 @@
         <w:t xml:space="preserve">, 119 (2020).</w:t>
       </w:r>
     </w:p>
-    <w:bookmarkEnd w:id="127"/>
-    <w:bookmarkStart w:id="129" w:name="ref-ogawa2020stroma"/>
+    <w:bookmarkEnd w:id="134"/>
+    <w:bookmarkStart w:id="136" w:name="ref-gaujoux2010flexible"/>
     <w:p>
       <w:pPr>
         <w:pStyle w:val="Bibliography"/>
       </w:pPr>
       <w:r>
-        <w:t xml:space="preserve">35.</w:t>
+        <w:t xml:space="preserve">38.</w:t>
       </w:r>
       <w:r>
         <w:t xml:space="preserve"> </w:t>
@@ -14911,210 +15073,12 @@
         <w:t xml:space="preserve">	</w:t>
       </w:r>
       <w:r>
-        <w:t xml:space="preserve">Ogawa, Y.</w:t>
-      </w:r>
-      <w:r>
-        <w:t xml:space="preserve"> </w:t>
-      </w:r>
-      <w:r>
-        <w:rPr>
-          <w:iCs/>
-          <w:i/>
-        </w:rPr>
-        <w:t xml:space="preserve">et al.</w:t>
-      </w:r>
-      <w:r>
-        <w:t xml:space="preserve"> </w:t>
-      </w:r>
-      <w:hyperlink r:id="rId128">
-        <w:r>
-          <w:rPr>
-            <w:rStyle w:val="Hyperlink"/>
-          </w:rPr>
-          <w:t xml:space="preserve">Three distinct stroma types in human pancreatic cancer identified by image analysis of fibroblast subpopulations and collagen</w:t>
-        </w:r>
-      </w:hyperlink>
-      <w:r>
-        <w:t xml:space="preserve">.</w:t>
-      </w:r>
-      <w:r>
-        <w:t xml:space="preserve"> </w:t>
-      </w:r>
-      <w:r>
-        <w:rPr>
-          <w:iCs/>
-          <w:i/>
-        </w:rPr>
-        <w:t xml:space="preserve">Clinical Cancer Research</w:t>
-      </w:r>
-      <w:r>
-        <w:t xml:space="preserve"> </w:t>
-      </w:r>
-      <w:r>
-        <w:rPr>
-          <w:bCs/>
-          <w:b/>
-        </w:rPr>
-        <w:t xml:space="preserve">27</w:t>
-      </w:r>
-      <w:r>
-        <w:t xml:space="preserve">, 107–119 (2021).</w:t>
-      </w:r>
-    </w:p>
-    <w:bookmarkEnd w:id="129"/>
-    <w:bookmarkStart w:id="131" w:name="ref-neuzillet2022periostin"/>
-    <w:p>
-      <w:pPr>
-        <w:pStyle w:val="Bibliography"/>
-      </w:pPr>
-      <w:r>
-        <w:t xml:space="preserve">36.</w:t>
-      </w:r>
-      <w:r>
-        <w:t xml:space="preserve"> </w:t>
-      </w:r>
-      <w:r>
-        <w:t xml:space="preserve">	</w:t>
-      </w:r>
-      <w:r>
-        <w:t xml:space="preserve">Neuzillet, C.</w:t>
-      </w:r>
-      <w:r>
-        <w:t xml:space="preserve"> </w:t>
-      </w:r>
-      <w:r>
-        <w:rPr>
-          <w:iCs/>
-          <w:i/>
-        </w:rPr>
-        <w:t xml:space="preserve">et al.</w:t>
-      </w:r>
-      <w:r>
-        <w:t xml:space="preserve"> </w:t>
-      </w:r>
-      <w:hyperlink r:id="rId130">
-        <w:r>
-          <w:rPr>
-            <w:rStyle w:val="Hyperlink"/>
-          </w:rPr>
-          <w:t xml:space="preserve">Periostin- and podoplanin-positive cancer-associated fibroblast subtypes cooperate to shape the inflamed tumor microenvironment in aggressive pancreatic adenocarcinoma</w:t>
-        </w:r>
-      </w:hyperlink>
-      <w:r>
-        <w:t xml:space="preserve">.</w:t>
-      </w:r>
-      <w:r>
-        <w:t xml:space="preserve"> </w:t>
-      </w:r>
-      <w:r>
-        <w:rPr>
-          <w:iCs/>
-          <w:i/>
-        </w:rPr>
-        <w:t xml:space="preserve">The Journal of Pathology</w:t>
-      </w:r>
-      <w:r>
-        <w:t xml:space="preserve"> </w:t>
-      </w:r>
-      <w:r>
-        <w:rPr>
-          <w:bCs/>
-          <w:b/>
-        </w:rPr>
-        <w:t xml:space="preserve">258</w:t>
-      </w:r>
-      <w:r>
-        <w:t xml:space="preserve">, 408–425 (2022).</w:t>
-      </w:r>
-    </w:p>
-    <w:bookmarkEnd w:id="131"/>
-    <w:bookmarkStart w:id="133" w:name="ref-lee2024tumorcaf"/>
-    <w:p>
-      <w:pPr>
-        <w:pStyle w:val="Bibliography"/>
-      </w:pPr>
-      <w:r>
-        <w:t xml:space="preserve">37.</w:t>
-      </w:r>
-      <w:r>
-        <w:t xml:space="preserve"> </w:t>
-      </w:r>
-      <w:r>
-        <w:t xml:space="preserve">	</w:t>
-      </w:r>
-      <w:r>
-        <w:t xml:space="preserve">Lee, J. J.</w:t>
-      </w:r>
-      <w:r>
-        <w:t xml:space="preserve"> </w:t>
-      </w:r>
-      <w:r>
-        <w:rPr>
-          <w:iCs/>
-          <w:i/>
-        </w:rPr>
-        <w:t xml:space="preserve">et al.</w:t>
-      </w:r>
-      <w:r>
-        <w:t xml:space="preserve"> </w:t>
-      </w:r>
-      <w:hyperlink r:id="rId132">
-        <w:r>
-          <w:rPr>
-            <w:rStyle w:val="Hyperlink"/>
-          </w:rPr>
-          <w:t xml:space="preserve">Tumor-intrinsic and cancer-associated fibroblast subtypes independently predict outcomes in pancreatic cancer</w:t>
-        </w:r>
-      </w:hyperlink>
-      <w:r>
-        <w:t xml:space="preserve">.</w:t>
-      </w:r>
-      <w:r>
-        <w:t xml:space="preserve"> </w:t>
-      </w:r>
-      <w:r>
-        <w:rPr>
-          <w:iCs/>
-          <w:i/>
-        </w:rPr>
-        <w:t xml:space="preserve">Annals of Surgery</w:t>
-      </w:r>
-      <w:r>
-        <w:t xml:space="preserve"> </w:t>
-      </w:r>
-      <w:r>
-        <w:rPr>
-          <w:bCs/>
-          <w:b/>
-        </w:rPr>
-        <w:t xml:space="preserve">280</w:t>
-      </w:r>
-      <w:r>
-        <w:t xml:space="preserve">, 659–666 (2024).</w:t>
-      </w:r>
-    </w:p>
-    <w:bookmarkEnd w:id="133"/>
-    <w:bookmarkStart w:id="135" w:name="ref-gaujoux2010flexible"/>
-    <w:p>
-      <w:pPr>
-        <w:pStyle w:val="Bibliography"/>
-      </w:pPr>
-      <w:r>
-        <w:t xml:space="preserve">38.</w:t>
-      </w:r>
-      <w:r>
-        <w:t xml:space="preserve"> </w:t>
-      </w:r>
-      <w:r>
-        <w:t xml:space="preserve">	</w:t>
-      </w:r>
-      <w:r>
         <w:t xml:space="preserve">Gaujoux, R. &amp; Seoighe, C.</w:t>
       </w:r>
       <w:r>
         <w:t xml:space="preserve"> </w:t>
       </w:r>
-      <w:hyperlink r:id="rId134">
+      <w:hyperlink r:id="rId135">
         <w:r>
           <w:rPr>
             <w:rStyle w:val="Hyperlink"/>
@@ -15173,8 +15137,8 @@
         <w:t xml:space="preserve">, 367 (2010).</w:t>
       </w:r>
     </w:p>
-    <w:bookmarkEnd w:id="135"/>
-    <w:bookmarkStart w:id="137" w:name="ref-data_tcga_paad"/>
+    <w:bookmarkEnd w:id="136"/>
+    <w:bookmarkStart w:id="138" w:name="ref-data_tcga_paad"/>
     <w:p>
       <w:pPr>
         <w:pStyle w:val="Bibliography"/>
@@ -15194,7 +15158,7 @@
       <w:r>
         <w:t xml:space="preserve"> </w:t>
       </w:r>
-      <w:hyperlink r:id="rId136">
+      <w:hyperlink r:id="rId137">
         <w:r>
           <w:rPr>
             <w:rStyle w:val="Hyperlink"/>
@@ -15230,8 +15194,8 @@
         <w:t xml:space="preserve">. (2017).</w:t>
       </w:r>
     </w:p>
-    <w:bookmarkEnd w:id="137"/>
-    <w:bookmarkStart w:id="139" w:name="ref-data_cptac3"/>
+    <w:bookmarkEnd w:id="138"/>
+    <w:bookmarkStart w:id="140" w:name="ref-data_cptac3"/>
     <w:p>
       <w:pPr>
         <w:pStyle w:val="Bibliography"/>
@@ -15251,7 +15215,7 @@
       <w:r>
         <w:t xml:space="preserve"> </w:t>
       </w:r>
-      <w:hyperlink r:id="rId138">
+      <w:hyperlink r:id="rId139">
         <w:r>
           <w:rPr>
             <w:rStyle w:val="Hyperlink"/>
@@ -15263,8 +15227,8 @@
         <w:t xml:space="preserve">. (2019).</w:t>
       </w:r>
     </w:p>
-    <w:bookmarkEnd w:id="139"/>
-    <w:bookmarkStart w:id="141" w:name="ref-data_dijk_emtab6830"/>
+    <w:bookmarkEnd w:id="140"/>
+    <w:bookmarkStart w:id="142" w:name="ref-data_dijk_emtab6830"/>
     <w:p>
       <w:pPr>
         <w:pStyle w:val="Bibliography"/>
@@ -15294,7 +15258,7 @@
       <w:r>
         <w:t xml:space="preserve"> </w:t>
       </w:r>
-      <w:hyperlink r:id="rId140">
+      <w:hyperlink r:id="rId141">
         <w:r>
           <w:rPr>
             <w:rStyle w:val="Hyperlink"/>
@@ -15318,8 +15282,8 @@
         <w:t xml:space="preserve">. (2020).</w:t>
       </w:r>
     </w:p>
-    <w:bookmarkEnd w:id="141"/>
-    <w:bookmarkStart w:id="143" w:name="ref-data_puleo_emtab6134"/>
+    <w:bookmarkEnd w:id="142"/>
+    <w:bookmarkStart w:id="144" w:name="ref-data_puleo_emtab6134"/>
     <w:p>
       <w:pPr>
         <w:pStyle w:val="Bibliography"/>
@@ -15349,7 +15313,7 @@
       <w:r>
         <w:t xml:space="preserve"> </w:t>
       </w:r>
-      <w:hyperlink r:id="rId142">
+      <w:hyperlink r:id="rId143">
         <w:r>
           <w:rPr>
             <w:rStyle w:val="Hyperlink"/>
@@ -15373,8 +15337,8 @@
         <w:t xml:space="preserve">. (2018).</w:t>
       </w:r>
     </w:p>
-    <w:bookmarkEnd w:id="143"/>
-    <w:bookmarkStart w:id="145" w:name="ref-data_moffitt_gse71729"/>
+    <w:bookmarkEnd w:id="144"/>
+    <w:bookmarkStart w:id="146" w:name="ref-data_moffitt_gse71729"/>
     <w:p>
       <w:pPr>
         <w:pStyle w:val="Bibliography"/>
@@ -15404,7 +15368,7 @@
       <w:r>
         <w:t xml:space="preserve"> </w:t>
       </w:r>
-      <w:hyperlink r:id="rId144">
+      <w:hyperlink r:id="rId145">
         <w:r>
           <w:rPr>
             <w:rStyle w:val="Hyperlink"/>
@@ -15428,8 +15392,8 @@
         <w:t xml:space="preserve">. (2015).</w:t>
       </w:r>
     </w:p>
-    <w:bookmarkEnd w:id="145"/>
-    <w:bookmarkStart w:id="147" w:name="ref-data_paca_au_egas"/>
+    <w:bookmarkEnd w:id="146"/>
+    <w:bookmarkStart w:id="148" w:name="ref-data_paca_au_egas"/>
     <w:p>
       <w:pPr>
         <w:pStyle w:val="Bibliography"/>
@@ -15449,7 +15413,7 @@
       <w:r>
         <w:t xml:space="preserve"> </w:t>
       </w:r>
-      <w:hyperlink r:id="rId146">
+      <w:hyperlink r:id="rId147">
         <w:r>
           <w:rPr>
             <w:rStyle w:val="Hyperlink"/>
@@ -15461,9 +15425,9 @@
         <w:t xml:space="preserve">. (2016).</w:t>
       </w:r>
     </w:p>
-    <w:bookmarkEnd w:id="147"/>
     <w:bookmarkEnd w:id="148"/>
     <w:bookmarkEnd w:id="149"/>
+    <w:bookmarkEnd w:id="150"/>
     <w:sectPr/>
   </w:body>
 </w:document>

</xml_diff>

<commit_message>
Housekeeping: regenerate PDFs, figure assets and DOCX at 57105bf
Rendered outputs of commit 5 (paper.pdf 29 pages, si_appendix.pdf 51
pages, no unresolved references) and both DOCX files regenerated from
the same knit output; no literal \diag remains. Figure assets carry
timestamp-only churn from the render.

Co-Authored-By: Claude Fable 5.1 <noreply@anthropic.com>
Claude-Session: https://claude.ai/code/session_01UmC5VGiZgLLFSQibZmMyH7
</commit_message>
<xml_diff>
--- a/paper/paper.docx
+++ b/paper/paper.docx
@@ -1626,7 +1626,7 @@
         <w:t xml:space="preserve"> </w:t>
       </w:r>
       <w:r>
-        <w:t xml:space="preserve">sets how many programs are extracted (Fig. [fig:schema]a; Methods). After training, the gene weights and the Cox coefficients are fixed (Methods).</w:t>
+        <w:t xml:space="preserve">sets how many programs are extracted (Fig. [fig:schema]a; Methods). After training, the gene weights and the Cox coefficients are fixed.</w:t>
       </w:r>
     </w:p>
     <w:p>
@@ -1821,7 +1821,19 @@
         </w:r>
       </w:hyperlink>
       <w:r>
-        <w:t xml:space="preserve">) gave conflicting rank choices in the same data (Supplementary Fig. [fig:fig-nmf-diagnostics]). All model and hyperparameter selection was completed within the training cohorts.</w:t>
+        <w:t xml:space="preserve">) gave conflicting rank choices in the same data (Supplementary Fig. [fig:fig-nmf-diagnostics]), echoing the cross-study instability of unsupervised PDAC subtype taxonomies</w:t>
+      </w:r>
+      <w:hyperlink w:anchor="ref-lautizi2022pancreatic">
+        <w:r>
+          <w:rPr>
+            <w:rStyle w:val="Hyperlink"/>
+            <w:vertAlign w:val="superscript"/>
+          </w:rPr>
+          <w:t xml:space="preserve">22</w:t>
+        </w:r>
+      </w:hyperlink>
+      <w:r>
+        <w:t xml:space="preserve">. All model and hyperparameter selection was completed within the training cohorts.</w:t>
       </w:r>
     </w:p>
     <w:p>
@@ -2377,7 +2389,7 @@
         </w:r>
       </w:hyperlink>
       <w:r>
-        <w:t xml:space="preserve">, and a third factor (N2) for exocrine-associated variation. Both methods recovered the activated-stroma and proCAF-like reference programs but differed at the tumor-restraining end: among the displayed top-ranked genes, the restCAF and iCAF reference programs corresponded to a DeSurv factor but to no standard NMF factor (Fig. [fig:pdac]a,b). These are bulk gene-program correspondences, not identifications of CAF cell states (Supplementary Information, Stromal resolution).</w:t>
+        <w:t xml:space="preserve">, and a third factor (N2) for exocrine-associated variation. Both methods recovered the activated-stroma and proCAF-like reference programs but differed at the tumor-restraining end: among the displayed top-ranked genes, the restCAF and iCAF reference programs corresponded to a DeSurv factor but to no standard NMF factor (Fig. [fig:pdac]a,b). These are bulk gene-program correspondences, not identifications of CAF cell states (Supplementary Information, Stromal resolution: which reference programs are recovered from bulk).</w:t>
       </w:r>
     </w:p>
     <w:p>
@@ -4352,7 +4364,7 @@
         </m:r>
       </m:oMath>
       <w:r>
-        <w:t xml:space="preserve">; Fig. [fig:treated]b; Supplementary Information, Translational transportability), a shift that may reflect cell composition, cellular state or both. Because treatment, stage and cohort were not independently varied, these analyses are exploratory and do not establish differential treatment benefit.</w:t>
+        <w:t xml:space="preserve">; Fig. [fig:treated]b; Supplementary Information, Translational transportability into independent treated PDAC cohorts), a shift that may reflect cell composition, cellular state or both. Because treatment, stage and cohort were not independently varied, these analyses are exploratory and do not establish differential treatment benefit.</w:t>
       </w:r>
     </w:p>
     <w:p>
@@ -5625,7 +5637,7 @@
         <w:pStyle w:val="BodyText"/>
       </w:pPr>
       <w:r>
-        <w:t xml:space="preserve">Three statistical qualifications bound the prognostic findings. DeSurv uses a proportional-hazards objective, while the external validation data showed attenuation of the prognostic association over follow-up (Results), so the reported hazard ratios are time-averaged summaries and extensions could accommodate non-proportional hazards or nonlinear survival relationships. The integrated Brier analysis recalibrated the score’s scalar slope and baseline hazard within each validation dataset, so it describes apparent prediction error rather than out-of-sample prediction error (Supplementary Information, Proper-scoring sensitivity of the external validation). The pooled training objective was fitted without a cohort term; within-cohort analyses argued against simple encoding of training-cohort membership, though cohort influence on the learned representation remains possible (Supplementary Information, Cohort handling in the training objective).</w:t>
+        <w:t xml:space="preserve">Three statistical qualifications bound the prognostic findings. DeSurv uses a proportional-hazards objective, while the external validation data showed attenuation of the prognostic association over follow-up (Schoenfeld test, Results), so the reported hazard ratios are time-averaged summaries and extensions could accommodate non-proportional hazards or nonlinear survival relationships. The integrated Brier analysis recalibrated the score’s scalar slope and baseline hazard within each validation dataset, so it describes apparent prediction error rather than out-of-sample prediction error (Supplementary Information, Proper-scoring sensitivity of the external validation). The pooled training objective was fitted without a cohort term; within-cohort analyses argued against simple encoding of training-cohort membership, though cohort influence on the learned representation remains possible (Supplementary Information, Cohort handling in the training objective).</w:t>
       </w:r>
     </w:p>
     <w:p>

</xml_diff>

<commit_message>
Housekeeping: regenerate PDFs, figure assets and DOCX at the relocation commit
Co-Authored-By: Claude Fable 5.1 <noreply@anthropic.com>
Claude-Session: https://claude.ai/code/session_01UmC5VGiZgLLFSQibZmMyH7
</commit_message>
<xml_diff>
--- a/paper/paper.docx
+++ b/paper/paper.docx
@@ -155,12 +155,6 @@
         <w:t xml:space="preserve"> </w:t>
       </w:r>
       <w:r>
-        <w:t xml:space="preserve">other</w:t>
-      </w:r>
-      <w:r>
-        <w:t xml:space="preserve"> </w:t>
-      </w:r>
-      <w:r>
         <w:t xml:space="preserve">microenvironmental</w:t>
       </w:r>
       <w:r>
@@ -227,12 +221,6 @@
         <w:t xml:space="preserve"> </w:t>
       </w:r>
       <w:r>
-        <w:t xml:space="preserve">relatively</w:t>
-      </w:r>
-      <w:r>
-        <w:t xml:space="preserve"> </w:t>
-      </w:r>
-      <w:r>
         <w:t xml:space="preserve">little</w:t>
       </w:r>
       <w:r>
@@ -473,6 +461,12 @@
         <w:t xml:space="preserve"> </w:t>
       </w:r>
       <w:r>
+        <w:t xml:space="preserve">(D1)</w:t>
+      </w:r>
+      <w:r>
+        <w:t xml:space="preserve"> </w:t>
+      </w:r>
+      <w:r>
         <w:t xml:space="preserve">combined</w:t>
       </w:r>
       <w:r>
@@ -545,7 +539,31 @@
         <w:t xml:space="preserve"> </w:t>
       </w:r>
       <w:r>
-        <w:t xml:space="preserve">datasets,</w:t>
+        <w:t xml:space="preserve">datasets</w:t>
+      </w:r>
+      <w:r>
+        <w:t xml:space="preserve"> </w:t>
+      </w:r>
+      <w:r>
+        <w:t xml:space="preserve">spanning</w:t>
+      </w:r>
+      <w:r>
+        <w:t xml:space="preserve"> </w:t>
+      </w:r>
+      <w:r>
+        <w:t xml:space="preserve">four</w:t>
+      </w:r>
+      <w:r>
+        <w:t xml:space="preserve"> </w:t>
+      </w:r>
+      <w:r>
+        <w:t xml:space="preserve">independent</w:t>
+      </w:r>
+      <w:r>
+        <w:t xml:space="preserve"> </w:t>
+      </w:r>
+      <w:r>
+        <w:t xml:space="preserve">cohorts,</w:t>
       </w:r>
       <w:r>
         <w:t xml:space="preserve"> </w:t>
@@ -743,13 +761,7 @@
         <w:t xml:space="preserve"> </w:t>
       </w:r>
       <w:r>
-        <w:t xml:space="preserve">this</w:t>
-      </w:r>
-      <w:r>
-        <w:t xml:space="preserve"> </w:t>
-      </w:r>
-      <w:r>
-        <w:t xml:space="preserve">program;</w:t>
+        <w:t xml:space="preserve">D1;</w:t>
       </w:r>
       <w:r>
         <w:t xml:space="preserve"> </w:t>
@@ -845,12 +857,6 @@
         <w:t xml:space="preserve"> </w:t>
       </w:r>
       <w:r>
-        <w:t xml:space="preserve">underlying</w:t>
-      </w:r>
-      <w:r>
-        <w:t xml:space="preserve"> </w:t>
-      </w:r>
-      <w:r>
         <w:t xml:space="preserve">structure,</w:t>
       </w:r>
       <w:r>
@@ -942,12 +948,6 @@
       </w:r>
       <w:r>
         <w:t xml:space="preserve">supervision</w:t>
-      </w:r>
-      <w:r>
-        <w:t xml:space="preserve"> </w:t>
-      </w:r>
-      <w:r>
-        <w:t xml:space="preserve">therefore</w:t>
       </w:r>
       <w:r>
         <w:t xml:space="preserve"> </w:t>
@@ -3108,7 +3108,7 @@
         </m:r>
       </m:oMath>
       <w:r>
-        <w:t xml:space="preserve">) and varied more across datasets (Fig. [fig:val]a). Nor did any of the three standard NMF factors at the same rank (HRs 0.94–1.00; Fig. [fig:val]a, right); these are individual factor associations from a standard NMF fit, not the combined risk score of the matched-budget control in Table [tab:hr-adjusted].</w:t>
+        <w:t xml:space="preserve">) and varied more across datasets (Fig. [fig:val]a). None of the three standard NMF factors at the same rank showed a significant combined association (HRs 0.94–1.00; Fig. [fig:val]a, right); these are individual factor associations from a standard NMF fit, not the combined risk score of the matched-budget control in Table [tab:hr-adjusted].</w:t>
       </w:r>
     </w:p>
     <w:p>
@@ -3655,7 +3655,7 @@
           <w:iCs/>
           <w:i/>
         </w:rPr>
-        <w:t xml:space="preserve">) of tuned supervised risk scores (lasso Cox and supervised PCA) with the three DeSurv programs (D1–D3) in the training data; supervised scores concentrate on D1 and are only weakly correlated with the D2 stromal program. These score correspondences do not establish recovery of identical gene programs. No validation-cohort survival outcomes were used in training, scoring or hyperparameter selection.</w:t>
+        <w:t xml:space="preserve">) of tuned supervised risk scores (lasso Cox and supervised PCA) with the three DeSurv programs (D1–D3) in the training data; supervised scores concentrate on D1 and are only weakly correlated with the D2 stromal program. These score correspondences do not establish recovery of identical gene programs. No validation-cohort survival outcomes were used in training, scoring or hyperparameter selection; they enter only the association estimates shown and the separately described recalibration analysis (Methods; Supplementary Information, Proper-scoring sensitivity of the external validation).</w:t>
       </w:r>
     </w:p>
     <w:tbl>
@@ -5070,7 +5070,7 @@
         <w:t xml:space="preserve"> </w:t>
       </w:r>
       <w:r>
-        <w:t xml:space="preserve">true programs, each with its own marker genes and all drawn from the same loading and activity distributions (Methods, Simulation studies). In the primary scenario, survival depended on the marker genes of one program only, and those genes contributed less transcriptomic variation than a shared background signal excluded from the survival-generating gene set. DeSurv and its unsupervised limit (</w:t>
+        <w:t xml:space="preserve">true programs, each with its own marker genes and all drawn from the same loading and activity distributions (Supplementary Information, Simulation design and data generation). In the primary scenario, survival depended on the marker genes of one program only, and those genes contributed less transcriptomic variation than a shared background signal excluded from the survival-generating gene set. DeSurv and its unsupervised limit (</w:t>
       </w:r>
       <m:oMath>
         <m:r>
@@ -5185,7 +5185,7 @@
         <w:pStyle w:val="BodyText"/>
       </w:pPr>
       <w:r>
-        <w:t xml:space="preserve">Performance depended on how prognostic signal aligned with expression structure. In the mixed setting, the benefit of supervision differed between recovery of program-specific markers and recovery of shared background genes included in the survival-generating set (Supplementary Fig. [fig:fig-sim-null-mixed]). Under the null, test-set concordance was near chance for both methods. There, the selected supervision strength dispersed across its admissible range rather than concentrating at zero (median</w:t>
+        <w:t xml:space="preserve">Performance depended on how prognostic signal aligned with expression structure. In the mixed setting, the benefit of supervision was concentrated in recovery of program-specific marker genes and was smaller for the shared background genes included in the survival-generating set (Supplementary Fig. [fig:fig-sim-null-mixed]), consistent with supervision acting on the genes that define the prognostic program. Under the null, test-set concordance was near chance for both methods. There, the selected supervision strength dispersed across its admissible range rather than concentrating at zero (median</w:t>
       </w:r>
       <w:r>
         <w:t xml:space="preserve"> </w:t>
@@ -5467,7 +5467,7 @@
           <w:iCs/>
           <w:i/>
         </w:rPr>
-        <w:t xml:space="preserve">IQR; points are individual simulated datasets. (c) Distribution of selected ranks across simulated datasets for DeSurv versus unsupervised NMF. (d) The same matched-factor precision metric as in (b), computed for two signal regimes: a prognostic program whose genes carry low transcriptomic variance relative to the shared background excluded from the survival-generating gene set (separated from the dominant variance) versus one that partially overlaps the dominant variance. DeSurv recovers the prognostic program more accurately in both regimes, whereas the unsupervised solution is more strongly influenced by the dominant expression structure; the null scenario (no prognostic program) is shown in the Supplementary Information. The concordance gap in (a) is not an expected discrimination gain in real data, where the two approaches perform comparably (Table [tab:hr-adjusted]).</w:t>
+        <w:t xml:space="preserve">IQR; points are individual simulated datasets. (c) Distribution of selected ranks across simulated datasets for DeSurv versus unsupervised NMF. (d) The same matched-factor precision metric as in (b), computed for two signal regimes: a prognostic program whose genes carry low transcriptomic variance relative to the shared background excluded from the survival-generating gene set (separated from the dominant variance) versus one that partially overlaps the dominant variance. DeSurv recovers the prognostic program more accurately in both regimes, whereas the unsupervised solution is more strongly influenced by the dominant expression structure; the null scenario (no prognostic program) is shown in the Supplementary Information. The concordance gap in (a) is not an expected discrimination gain in real data, where a rank-optimized unsupervised control carried comparable prognostic information (Table [tab:hr-adjusted]).</w:t>
       </w:r>
     </w:p>
     <w:bookmarkEnd w:id="41"/>
@@ -5563,7 +5563,67 @@
         </w:r>
       </w:hyperlink>
       <w:r>
-        <w:t xml:space="preserve">. In DeSurv, it depends directly on projections through the gene-program matrix, and new samples are scored using fixed gene weights without an additional sample-loading estimation step (Supplementary Table [tab:architecture]).</w:t>
+        <w:t xml:space="preserve">. In DeSurv, it depends directly on projections through the gene-program matrix, and new samples are scored using fixed gene weights without an additional sample-loading estimation step (Supplementary Table [tab:architecture]). Deep latent-variable survival models</w:t>
+      </w:r>
+      <w:hyperlink w:anchor="ref-zaccaria2023surviae">
+        <w:r>
+          <w:rPr>
+            <w:rStyle w:val="Hyperlink"/>
+            <w:vertAlign w:val="superscript"/>
+          </w:rPr>
+          <w:t xml:space="preserve">34</w:t>
+        </w:r>
+      </w:hyperlink>
+      <w:r>
+        <w:rPr>
+          <w:vertAlign w:val="superscript"/>
+        </w:rPr>
+        <w:t xml:space="preserve">,</w:t>
+      </w:r>
+      <w:hyperlink w:anchor="ref-meng2022savae">
+        <w:r>
+          <w:rPr>
+            <w:rStyle w:val="Hyperlink"/>
+            <w:vertAlign w:val="superscript"/>
+          </w:rPr>
+          <w:t xml:space="preserve">35</w:t>
+        </w:r>
+      </w:hyperlink>
+      <w:r>
+        <w:t xml:space="preserve"> </w:t>
+      </w:r>
+      <w:r>
+        <w:t xml:space="preserve">likewise learn sample representations rather than a fixed gene-program basis, and reference-based deconvolution methods such as CIBERSORTx</w:t>
+      </w:r>
+      <w:hyperlink w:anchor="ref-newman2019cibersortx">
+        <w:r>
+          <w:rPr>
+            <w:rStyle w:val="Hyperlink"/>
+            <w:vertAlign w:val="superscript"/>
+          </w:rPr>
+          <w:t xml:space="preserve">36</w:t>
+        </w:r>
+      </w:hyperlink>
+      <w:r>
+        <w:t xml:space="preserve"> </w:t>
+      </w:r>
+      <w:r>
+        <w:t xml:space="preserve">and BayesPrism</w:t>
+      </w:r>
+      <w:hyperlink w:anchor="ref-chu2022bayesprism">
+        <w:r>
+          <w:rPr>
+            <w:rStyle w:val="Hyperlink"/>
+            <w:vertAlign w:val="superscript"/>
+          </w:rPr>
+          <w:t xml:space="preserve">37</w:t>
+        </w:r>
+      </w:hyperlink>
+      <w:r>
+        <w:t xml:space="preserve"> </w:t>
+      </w:r>
+      <w:r>
+        <w:t xml:space="preserve">estimate the abundance of predefined cell types rather than outcome-aligned programs, so DeSurv is complementary to them.</w:t>
       </w:r>
     </w:p>
     <w:p>
@@ -5661,7 +5721,7 @@
             <w:rStyle w:val="Hyperlink"/>
             <w:vertAlign w:val="superscript"/>
           </w:rPr>
-          <w:t xml:space="preserve">34</w:t>
+          <w:t xml:space="preserve">38</w:t>
         </w:r>
       </w:hyperlink>
       <w:r>
@@ -5676,7 +5736,7 @@
             <w:rStyle w:val="Hyperlink"/>
             <w:vertAlign w:val="superscript"/>
           </w:rPr>
-          <w:t xml:space="preserve">36</w:t>
+          <w:t xml:space="preserve">40</w:t>
         </w:r>
       </w:hyperlink>
       <w:r>
@@ -5696,7 +5756,7 @@
             <w:rStyle w:val="Hyperlink"/>
             <w:vertAlign w:val="superscript"/>
           </w:rPr>
-          <w:t xml:space="preserve">37</w:t>
+          <w:t xml:space="preserve">41</w:t>
         </w:r>
       </w:hyperlink>
       <w:r>
@@ -8078,7 +8138,7 @@
             <w:rStyle w:val="Hyperlink"/>
             <w:vertAlign w:val="superscript"/>
           </w:rPr>
-          <w:t xml:space="preserve">38</w:t>
+          <w:t xml:space="preserve">42</w:t>
         </w:r>
       </w:hyperlink>
       <w:r>
@@ -8325,10 +8385,7 @@
         </m:r>
       </m:oMath>
       <w:r>
-        <w:t xml:space="preserve"> </w:t>
-      </w:r>
-      <w:r>
-        <w:t xml:space="preserve">(Supplementary Information, Optimization Algorithm). The reconstruction term is minimized using multiplicative updates that preserve nonnegativity, and the supervision term enters the proposal for</w:t>
+        <w:t xml:space="preserve">. The reconstruction term is minimized using multiplicative updates that preserve nonnegativity, and the supervision term enters the proposal for</w:t>
       </w:r>
       <w:r>
         <w:t xml:space="preserve"> </w:t>
@@ -8342,7 +8399,7 @@
         <w:t xml:space="preserve"> </w:t>
       </w:r>
       <w:r>
-        <w:t xml:space="preserve">as a Cox log-partial-likelihood derivative. The proposal rescales the weighted reconstruction and survival gradients using the norm-based factor defined in the Supplementary Information, subject to its numerical stabilizer and cap. It does not differentiate the</w:t>
+        <w:t xml:space="preserve">as a Cox log-partial-likelihood derivative. That proposal does not differentiate the</w:t>
       </w:r>
       <w:r>
         <w:t xml:space="preserve"> </w:t>
@@ -8353,7 +8410,7 @@
         </m:r>
       </m:oMath>
       <w:r>
-        <w:t xml:space="preserve">-dependent penalty on the standardized-score coefficients and is therefore not the gradient of the full objective; each candidate is instead evaluated under the full objective by a backtracking line search. Every candidate</w:t>
+        <w:t xml:space="preserve">-dependent penalty on the standardized-score coefficients and is therefore not the gradient of the full objective, so every candidate</w:t>
       </w:r>
       <w:r>
         <w:t xml:space="preserve"> </w:t>
@@ -8395,7 +8452,7 @@
         <w:t xml:space="preserve"> </w:t>
       </w:r>
       <w:r>
-        <w:t xml:space="preserve">rescaled by the same constants, so that</w:t>
+        <w:t xml:space="preserve">rescaled by the same constants so that</w:t>
       </w:r>
       <w:r>
         <w:t xml:space="preserve"> </w:t>
@@ -8444,7 +8501,23 @@
         <w:t xml:space="preserve"> </w:t>
       </w:r>
       <w:r>
-        <w:t xml:space="preserve">are all preserved; with the optional ridge penalties on</w:t>
+        <w:t xml:space="preserve">are all preserved, and is then evaluated under the full objective by a backtracking line search (Supplementary Information, Optimization Algorithm and Normalization of W).</w:t>
+      </w:r>
+    </w:p>
+    <w:p>
+      <w:pPr>
+        <w:pStyle w:val="BodyText"/>
+      </w:pPr>
+      <m:oMath>
+        <m:r>
+          <m:t>β</m:t>
+        </m:r>
+      </m:oMath>
+      <w:r>
+        <w:t xml:space="preserve"> </w:t>
+      </w:r>
+      <w:r>
+        <w:t xml:space="preserve">is then updated by Coxnet-style cyclic coordinate descent on the current centered and standardized factor scores, and is refit on the converged</w:t>
       </w:r>
       <w:r>
         <w:t xml:space="preserve"> </w:t>
@@ -8458,6 +8531,56 @@
         <w:t xml:space="preserve"> </w:t>
       </w:r>
       <w:r>
+        <w:t xml:space="preserve">once the outer loop terminates. The coordinate sweeps approximate rather than exactly minimize the conditional objective, and their proposal is accepted only under a safeguard that prevents it from increasing the evaluated objective, so the</w:t>
+      </w:r>
+      <w:r>
+        <w:t xml:space="preserve"> </w:t>
+      </w:r>
+      <m:oMath>
+        <m:r>
+          <m:t>β</m:t>
+        </m:r>
+      </m:oMath>
+      <w:r>
+        <w:t xml:space="preserve"> </w:t>
+      </w:r>
+      <w:r>
+        <w:t xml:space="preserve">block is non-increasing in that objective without establishing convergence to a conditional or joint optimum. The closed-form update, the stopping tolerances and the iteration cap are given in Supplementary Information, Update for</w:t>
+      </w:r>
+      <w:r>
+        <w:t xml:space="preserve"> </w:t>
+      </w:r>
+      <m:oMath>
+        <m:r>
+          <m:t>β</m:t>
+        </m:r>
+      </m:oMath>
+      <w:r>
+        <w:t xml:space="preserve"> </w:t>
+      </w:r>
+      <w:r>
+        <w:t xml:space="preserve">and Bayesian Optimization.</w:t>
+      </w:r>
+    </w:p>
+    <w:p>
+      <w:pPr>
+        <w:pStyle w:val="BodyText"/>
+      </w:pPr>
+      <w:r>
+        <w:t xml:space="preserve">Because the implemented algorithm combines normalization, gradient rescaling and a Coxnet approximation, we assessed optimization behavior empirically rather than relying on a formal convergence guarantee. Across 100 independent random initializations of the reported PDAC model, every run terminated on the stopping criterion rather than the iteration cap, none failed numerically, and the recorded outer-loop objective decreased monotonically (Supplementary Information, Empirical optimization stability across random initializations). Monotone decrease together with the stopping rule on the cosine change of</w:t>
+      </w:r>
+      <w:r>
+        <w:t xml:space="preserve"> </w:t>
+      </w:r>
+      <m:oMath>
+        <m:r>
+          <m:t>W</m:t>
+        </m:r>
+      </m:oMath>
+      <w:r>
+        <w:t xml:space="preserve"> </w:t>
+      </w:r>
+      <w:r>
         <w:t xml:space="preserve">and</w:t>
       </w:r>
       <w:r>
@@ -8472,561 +8595,7 @@
         <w:t xml:space="preserve"> </w:t>
       </w:r>
       <w:r>
-        <w:t xml:space="preserve">both zero (</w:t>
-      </w:r>
-      <m:oMath>
-        <m:sSub>
-          <m:e>
-            <m:r>
-              <m:t>λ</m:t>
-            </m:r>
-          </m:e>
-          <m:sub>
-            <m:r>
-              <m:t>W</m:t>
-            </m:r>
-          </m:sub>
-        </m:sSub>
-        <m:r>
-          <m:rPr>
-            <m:sty m:val="p"/>
-          </m:rPr>
-          <m:t>=</m:t>
-        </m:r>
-        <m:sSub>
-          <m:e>
-            <m:r>
-              <m:t>λ</m:t>
-            </m:r>
-          </m:e>
-          <m:sub>
-            <m:r>
-              <m:t>H</m:t>
-            </m:r>
-          </m:sub>
-        </m:sSub>
-        <m:r>
-          <m:rPr>
-            <m:sty m:val="p"/>
-          </m:rPr>
-          <m:t>=</m:t>
-        </m:r>
-        <m:r>
-          <m:t>0</m:t>
-        </m:r>
-      </m:oMath>
-      <w:r>
-        <w:t xml:space="preserve">), as in the reported fits, the normalization alone leaves the displayed objective unchanged.</w:t>
-      </w:r>
-    </w:p>
-    <w:p>
-      <w:pPr>
-        <w:pStyle w:val="BodyText"/>
-      </w:pPr>
-      <m:oMath>
-        <m:r>
-          <m:t>β</m:t>
-        </m:r>
-      </m:oMath>
-      <w:r>
-        <w:t xml:space="preserve"> </w:t>
-      </w:r>
-      <w:r>
-        <w:t xml:space="preserve">is then updated by Coxnet-style cyclic coordinate descent on the current factor scores</w:t>
-      </w:r>
-      <w:r>
-        <w:t xml:space="preserve"> </w:t>
-      </w:r>
-      <m:oMath>
-        <m:r>
-          <m:t>Z</m:t>
-        </m:r>
-        <m:r>
-          <m:rPr>
-            <m:sty m:val="p"/>
-          </m:rPr>
-          <m:t>=</m:t>
-        </m:r>
-        <m:sSup>
-          <m:e>
-            <m:r>
-              <m:t>W</m:t>
-            </m:r>
-          </m:e>
-          <m:sup>
-            <m:r>
-              <m:rPr>
-                <m:sty m:val="p"/>
-              </m:rPr>
-              <m:t>⊤</m:t>
-            </m:r>
-          </m:sup>
-        </m:sSup>
-        <m:r>
-          <m:t>X</m:t>
-        </m:r>
-      </m:oMath>
-      <w:r>
-        <w:t xml:space="preserve"> </w:t>
-      </w:r>
-      <w:r>
-        <w:t xml:space="preserve">with elastic-net penalty parameters</w:t>
-      </w:r>
-      <w:r>
-        <w:t xml:space="preserve"> </w:t>
-      </w:r>
-      <m:oMath>
-        <m:d>
-          <m:dPr>
-            <m:begChr m:val="("/>
-            <m:endChr m:val=")"/>
-            <m:sepChr m:val=""/>
-            <m:grow/>
-          </m:dPr>
-          <m:e>
-            <m:r>
-              <m:t>λ</m:t>
-            </m:r>
-            <m:r>
-              <m:rPr>
-                <m:sty m:val="p"/>
-              </m:rPr>
-              <m:t>,</m:t>
-            </m:r>
-            <m:r>
-              <m:t>ξ</m:t>
-            </m:r>
-          </m:e>
-        </m:d>
-      </m:oMath>
-      <w:r>
-        <w:t xml:space="preserve">, starting from the current raw coefficients after the normalization step and using the current</w:t>
-      </w:r>
-      <w:r>
-        <w:t xml:space="preserve"> </w:t>
-      </w:r>
-      <m:oMath>
-        <m:sSub>
-          <m:e>
-            <m:r>
-              <m:t>D</m:t>
-            </m:r>
-          </m:e>
-          <m:sub>
-            <m:r>
-              <m:t>Z</m:t>
-            </m:r>
-          </m:sub>
-        </m:sSub>
-      </m:oMath>
-      <w:r>
-        <w:t xml:space="preserve">. The scores are centered as well as standardized, which shifts the linear predictor by a common additive constant that cancels from the Cox partial likelihood. The coordinate descent weights its quadratic approximation of the partial likelihood by</w:t>
-      </w:r>
-      <w:r>
-        <w:t xml:space="preserve"> </w:t>
-      </w:r>
-      <m:oMath>
-        <m:r>
-          <m:t>1</m:t>
-        </m:r>
-        <m:r>
-          <m:rPr>
-            <m:sty m:val="p"/>
-          </m:rPr>
-          <m:t>/</m:t>
-        </m:r>
-        <m:sSub>
-          <m:e>
-            <m:r>
-              <m:t>n</m:t>
-            </m:r>
-          </m:e>
-          <m:sub>
-            <m:r>
-              <m:rPr>
-                <m:sty m:val="p"/>
-              </m:rPr>
-              <m:t>e</m:t>
-            </m:r>
-            <m:r>
-              <m:rPr>
-                <m:sty m:val="p"/>
-              </m:rPr>
-              <m:t>v</m:t>
-            </m:r>
-            <m:r>
-              <m:rPr>
-                <m:sty m:val="p"/>
-              </m:rPr>
-              <m:t>e</m:t>
-            </m:r>
-            <m:r>
-              <m:rPr>
-                <m:sty m:val="p"/>
-              </m:rPr>
-              <m:t>n</m:t>
-            </m:r>
-            <m:r>
-              <m:rPr>
-                <m:sty m:val="p"/>
-              </m:rPr>
-              <m:t>t</m:t>
-            </m:r>
-          </m:sub>
-        </m:sSub>
-      </m:oMath>
-      <w:r>
-        <w:t xml:space="preserve"> </w:t>
-      </w:r>
-      <w:r>
-        <w:t xml:space="preserve">rather than the</w:t>
-      </w:r>
-      <w:r>
-        <w:t xml:space="preserve"> </w:t>
-      </w:r>
-      <m:oMath>
-        <m:r>
-          <m:t>2</m:t>
-        </m:r>
-        <m:r>
-          <m:rPr>
-            <m:sty m:val="p"/>
-          </m:rPr>
-          <m:t>/</m:t>
-        </m:r>
-        <m:sSub>
-          <m:e>
-            <m:r>
-              <m:t>n</m:t>
-            </m:r>
-          </m:e>
-          <m:sub>
-            <m:r>
-              <m:rPr>
-                <m:sty m:val="p"/>
-              </m:rPr>
-              <m:t>e</m:t>
-            </m:r>
-            <m:r>
-              <m:rPr>
-                <m:sty m:val="p"/>
-              </m:rPr>
-              <m:t>v</m:t>
-            </m:r>
-            <m:r>
-              <m:rPr>
-                <m:sty m:val="p"/>
-              </m:rPr>
-              <m:t>e</m:t>
-            </m:r>
-            <m:r>
-              <m:rPr>
-                <m:sty m:val="p"/>
-              </m:rPr>
-              <m:t>n</m:t>
-            </m:r>
-            <m:r>
-              <m:rPr>
-                <m:sty m:val="p"/>
-              </m:rPr>
-              <m:t>t</m:t>
-            </m:r>
-          </m:sub>
-        </m:sSub>
-      </m:oMath>
-      <w:r>
-        <w:t xml:space="preserve"> </w:t>
-      </w:r>
-      <w:r>
-        <w:t xml:space="preserve">of the objective while penalizing</w:t>
-      </w:r>
-      <w:r>
-        <w:t xml:space="preserve"> </w:t>
-      </w:r>
-      <m:oMath>
-        <m:r>
-          <m:t>b</m:t>
-        </m:r>
-      </m:oMath>
-      <w:r>
-        <w:t xml:space="preserve">, so within that parameterization the effective penalty is</w:t>
-      </w:r>
-      <w:r>
-        <w:t xml:space="preserve"> </w:t>
-      </w:r>
-      <m:oMath>
-        <m:r>
-          <m:t>2</m:t>
-        </m:r>
-        <m:r>
-          <m:t>λ</m:t>
-        </m:r>
-      </m:oMath>
-      <w:r>
-        <w:t xml:space="preserve">. Its proposal is accepted only if the evaluated objective does not increase (for</w:t>
-      </w:r>
-      <w:r>
-        <w:t xml:space="preserve"> </w:t>
-      </w:r>
-      <m:oMath>
-        <m:r>
-          <m:t>α</m:t>
-        </m:r>
-        <m:r>
-          <m:rPr>
-            <m:sty m:val="p"/>
-          </m:rPr>
-          <m:t>&gt;</m:t>
-        </m:r>
-        <m:r>
-          <m:t>0</m:t>
-        </m:r>
-      </m:oMath>
-      <w:r>
-        <w:t xml:space="preserve"> </w:t>
-      </w:r>
-      <w:r>
-        <w:t xml:space="preserve">this is equivalent, with</w:t>
-      </w:r>
-      <w:r>
-        <w:t xml:space="preserve"> </w:t>
-      </w:r>
-      <m:oMath>
-        <m:r>
-          <m:t>W</m:t>
-        </m:r>
-      </m:oMath>
-      <w:r>
-        <w:t xml:space="preserve"> </w:t>
-      </w:r>
-      <w:r>
-        <w:t xml:space="preserve">and</w:t>
-      </w:r>
-      <w:r>
-        <w:t xml:space="preserve"> </w:t>
-      </w:r>
-      <m:oMath>
-        <m:r>
-          <m:t>H</m:t>
-        </m:r>
-      </m:oMath>
-      <w:r>
-        <w:t xml:space="preserve"> </w:t>
-      </w:r>
-      <w:r>
-        <w:t xml:space="preserve">fixed, to not increasing the penalized survival loss; at</w:t>
-      </w:r>
-      <w:r>
-        <w:t xml:space="preserve"> </w:t>
-      </w:r>
-      <m:oMath>
-        <m:r>
-          <m:t>α</m:t>
-        </m:r>
-        <m:r>
-          <m:rPr>
-            <m:sty m:val="p"/>
-          </m:rPr>
-          <m:t>=</m:t>
-        </m:r>
-        <m:r>
-          <m:t>0</m:t>
-        </m:r>
-      </m:oMath>
-      <w:r>
-        <w:t xml:space="preserve"> </w:t>
-      </w:r>
-      <w:r>
-        <w:t xml:space="preserve">the full objective is independent of</w:t>
-      </w:r>
-      <w:r>
-        <w:t xml:space="preserve"> </w:t>
-      </w:r>
-      <m:oMath>
-        <m:r>
-          <m:t>β</m:t>
-        </m:r>
-      </m:oMath>
-      <w:r>
-        <w:t xml:space="preserve">), which makes the</w:t>
-      </w:r>
-      <w:r>
-        <w:t xml:space="preserve"> </w:t>
-      </w:r>
-      <m:oMath>
-        <m:r>
-          <m:t>β</m:t>
-        </m:r>
-      </m:oMath>
-      <w:r>
-        <w:t xml:space="preserve"> </w:t>
-      </w:r>
-      <w:r>
-        <w:t xml:space="preserve">update non-increasing in that objective without establishing convergence to a conditional or joint optimum, and</w:t>
-      </w:r>
-      <w:r>
-        <w:t xml:space="preserve"> </w:t>
-      </w:r>
-      <m:oMath>
-        <m:r>
-          <m:t>β</m:t>
-        </m:r>
-      </m:oMath>
-      <w:r>
-        <w:t xml:space="preserve"> </w:t>
-      </w:r>
-      <w:r>
-        <w:t xml:space="preserve">is refit on the converged</w:t>
-      </w:r>
-      <w:r>
-        <w:t xml:space="preserve"> </w:t>
-      </w:r>
-      <m:oMath>
-        <m:r>
-          <m:t>W</m:t>
-        </m:r>
-      </m:oMath>
-      <w:r>
-        <w:t xml:space="preserve"> </w:t>
-      </w:r>
-      <w:r>
-        <w:t xml:space="preserve">at the end. The</w:t>
-      </w:r>
-      <w:r>
-        <w:t xml:space="preserve"> </w:t>
-      </w:r>
-      <m:oMath>
-        <m:r>
-          <m:t>β</m:t>
-        </m:r>
-      </m:oMath>
-      <w:r>
-        <w:t xml:space="preserve"> </w:t>
-      </w:r>
-      <w:r>
-        <w:t xml:space="preserve">block is therefore an approximate rather than exact conditional minimizer. Convergence of the outer loop is assessed by the change in</w:t>
-      </w:r>
-      <w:r>
-        <w:t xml:space="preserve"> </w:t>
-      </w:r>
-      <m:oMath>
-        <m:r>
-          <m:t>W</m:t>
-        </m:r>
-      </m:oMath>
-      <w:r>
-        <w:t xml:space="preserve"> </w:t>
-      </w:r>
-      <w:r>
-        <w:t xml:space="preserve">and</w:t>
-      </w:r>
-      <w:r>
-        <w:t xml:space="preserve"> </w:t>
-      </w:r>
-      <m:oMath>
-        <m:r>
-          <m:t>H</m:t>
-        </m:r>
-      </m:oMath>
-      <w:r>
-        <w:t xml:space="preserve"> </w:t>
-      </w:r>
-      <w:r>
-        <w:t xml:space="preserve">between successive iterations, not by the change in the objective. Iteration stops when the cosine change of both</w:t>
-      </w:r>
-      <w:r>
-        <w:t xml:space="preserve"> </w:t>
-      </w:r>
-      <m:oMath>
-        <m:r>
-          <m:t>W</m:t>
-        </m:r>
-      </m:oMath>
-      <w:r>
-        <w:t xml:space="preserve"> </w:t>
-      </w:r>
-      <w:r>
-        <w:t xml:space="preserve">and</w:t>
-      </w:r>
-      <w:r>
-        <w:t xml:space="preserve"> </w:t>
-      </w:r>
-      <m:oMath>
-        <m:r>
-          <m:t>H</m:t>
-        </m:r>
-      </m:oMath>
-      <w:r>
-        <w:t xml:space="preserve"> </w:t>
-      </w:r>
-      <w:r>
-        <w:t xml:space="preserve">falls below</w:t>
-      </w:r>
-      <w:r>
-        <w:t xml:space="preserve"> </w:t>
-      </w:r>
-      <m:oMath>
-        <m:sSup>
-          <m:e>
-            <m:r>
-              <m:t>10</m:t>
-            </m:r>
-          </m:e>
-          <m:sup>
-            <m:r>
-              <m:rPr>
-                <m:sty m:val="p"/>
-              </m:rPr>
-              <m:t>−</m:t>
-            </m:r>
-            <m:r>
-              <m:t>7</m:t>
-            </m:r>
-          </m:sup>
-        </m:sSup>
-      </m:oMath>
-      <w:r>
-        <w:t xml:space="preserve"> </w:t>
-      </w:r>
-      <w:r>
-        <w:t xml:space="preserve">for the restart and final fits, and below</w:t>
-      </w:r>
-      <w:r>
-        <w:t xml:space="preserve"> </w:t>
-      </w:r>
-      <m:oMath>
-        <m:sSup>
-          <m:e>
-            <m:r>
-              <m:t>10</m:t>
-            </m:r>
-          </m:e>
-          <m:sup>
-            <m:r>
-              <m:rPr>
-                <m:sty m:val="p"/>
-              </m:rPr>
-              <m:t>−</m:t>
-            </m:r>
-            <m:r>
-              <m:t>5</m:t>
-            </m:r>
-          </m:sup>
-        </m:sSup>
-      </m:oMath>
-      <w:r>
-        <w:t xml:space="preserve"> </w:t>
-      </w:r>
-      <w:r>
-        <w:t xml:space="preserve">for the cross-validation fits inside the hyperparameter search, or after 4,000 iterations; cosine change is defined in Supplementary Information, Optimization Algorithm. The reported fits were produced by this implementation; the nominal tuning parameters are reported together with the implemented scaling and standardization conventions.</w:t>
-      </w:r>
-    </w:p>
-    <w:p>
-      <w:pPr>
-        <w:pStyle w:val="BodyText"/>
-      </w:pPr>
-      <w:r>
-        <w:t xml:space="preserve">Because the implemented algorithm combines normalization, gradient rescaling and a Coxnet approximation, we assessed optimization behavior empirically rather than relying on a formal convergence guarantee. Across 100 independent random initializations of the reported PDAC model, every run terminated on the stopping criterion rather than the iteration cap, and none failed numerically (median 38 iterations, range 17–233; Supplementary Information, Empirical optimization stability). The recorded outer-loop objective decreased monotonically. Monotone decrease together with the cosine stopping rule is what these runs establish, and they are checks on the optimizer rather than on which programs it recovers. Closed-form update equations are given in Supplementary Information, Model details and Optimization Algorithm, and Bayesian-optimization control parameters in Bayesian Optimization.</w:t>
+        <w:t xml:space="preserve">(Supplementary Information, Optimization Algorithm) is what these runs establish, and they are checks on the optimizer rather than on which programs it recovers.</w:t>
       </w:r>
     </w:p>
     <w:bookmarkEnd w:id="46"/>
@@ -9258,7 +8827,7 @@
         <w:t xml:space="preserve"> </w:t>
       </w:r>
       <w:r>
-        <w:t xml:space="preserve">with the non-rank hyperparameters of the best observed configuration, a configuration not itself evaluated in the search, we ran a sensitivity check on rank selection using the same training data and selected non-rank hyperparameters. That check is an exhaustive grid over ranks</w:t>
+        <w:t xml:space="preserve">with the non-rank hyperparameters of the best observed configuration, a configuration not itself evaluated in the search, we ran a sensitivity check on rank selection: an exhaustive grid over ranks and supervision strengths at the selected non-rank hyperparameters, to which the same one-standard-error rule again selects</w:t>
       </w:r>
       <w:r>
         <w:t xml:space="preserve"> </w:t>
@@ -9274,6 +8843,78 @@
           <m:t>=</m:t>
         </m:r>
         <m:r>
+          <m:t>3</m:t>
+        </m:r>
+      </m:oMath>
+      <w:r>
+        <w:t xml:space="preserve"> </w:t>
+      </w:r>
+      <w:r>
+        <w:t xml:space="preserve">(Supplementary Information, Bayesian Optimization and Cross-validated C-index across factorization rank).</w:t>
+      </w:r>
+    </w:p>
+    <w:p>
+      <w:pPr>
+        <w:pStyle w:val="BodyText"/>
+      </w:pPr>
+      <w:r>
+        <w:t xml:space="preserve">Because the goal is prognostic factorization, DeSurv selects</w:t>
+      </w:r>
+      <w:r>
+        <w:t xml:space="preserve"> </w:t>
+      </w:r>
+      <m:oMath>
+        <m:r>
+          <m:t>k</m:t>
+        </m:r>
+      </m:oMath>
+      <w:r>
+        <w:t xml:space="preserve"> </w:t>
+      </w:r>
+      <w:r>
+        <w:t xml:space="preserve">using the criterion that directly measures prognostic performance (cross-validated C-index) rather than the unsupervised diagnostics commonly used for NMF rank selection</w:t>
+      </w:r>
+      <w:hyperlink w:anchor="ref-brunet2004metagenes">
+        <w:r>
+          <w:rPr>
+            <w:rStyle w:val="Hyperlink"/>
+            <w:vertAlign w:val="superscript"/>
+          </w:rPr>
+          <w:t xml:space="preserve">13</w:t>
+        </w:r>
+      </w:hyperlink>
+      <w:r>
+        <w:rPr>
+          <w:vertAlign w:val="superscript"/>
+        </w:rPr>
+        <w:t xml:space="preserve">,</w:t>
+      </w:r>
+      <w:hyperlink w:anchor="ref-frigyesi2008nmf">
+        <w:r>
+          <w:rPr>
+            <w:rStyle w:val="Hyperlink"/>
+            <w:vertAlign w:val="superscript"/>
+          </w:rPr>
+          <w:t xml:space="preserve">28</w:t>
+        </w:r>
+      </w:hyperlink>
+      <w:r>
+        <w:t xml:space="preserve">, which gave inconsistent guidance across candidate ranks in these training data (Supplementary Information, Standard NMF rank selection heuristics). On the sensitivity grid, cross-validated concordance varied little across candidate ranks, with no clear optimum anywhere between</w:t>
+      </w:r>
+      <w:r>
+        <w:t xml:space="preserve"> </w:t>
+      </w:r>
+      <m:oMath>
+        <m:r>
+          <m:t>k</m:t>
+        </m:r>
+        <m:r>
+          <m:rPr>
+            <m:sty m:val="p"/>
+          </m:rPr>
+          <m:t>=</m:t>
+        </m:r>
+        <m:r>
           <m:t>2</m:t>
         </m:r>
       </m:oMath>
@@ -9281,7 +8922,7 @@
         <w:t xml:space="preserve"> </w:t>
       </w:r>
       <w:r>
-        <w:t xml:space="preserve">to</w:t>
+        <w:t xml:space="preserve">and</w:t>
       </w:r>
       <w:r>
         <w:t xml:space="preserve"> </w:t>
@@ -9304,7 +8945,27 @@
         <w:t xml:space="preserve"> </w:t>
       </w:r>
       <w:r>
-        <w:t xml:space="preserve">and supervision strengths</w:t>
+        <w:t xml:space="preserve">and a total spread across that range of 2.0 standard errors (Supplementary Fig. [fig:fig-cindex-by-k]). The one-standard-error rule applied to the rank-wise BO results accordingly selected the parsimonious</w:t>
+      </w:r>
+      <w:r>
+        <w:t xml:space="preserve"> </w:t>
+      </w:r>
+      <m:oMath>
+        <m:r>
+          <m:t>k</m:t>
+        </m:r>
+        <m:r>
+          <m:rPr>
+            <m:sty m:val="p"/>
+          </m:rPr>
+          <m:t>=</m:t>
+        </m:r>
+        <m:r>
+          <m:t>3</m:t>
+        </m:r>
+      </m:oMath>
+      <w:r>
+        <w:t xml:space="preserve">; the final model retained</w:t>
       </w:r>
       <w:r>
         <w:t xml:space="preserve"> </w:t>
@@ -9313,9 +8974,18 @@
         <m:r>
           <m:t>α</m:t>
         </m:r>
-      </m:oMath>
-      <w:r>
-        <w:t xml:space="preserve">, holding</w:t>
+        <m:r>
+          <m:rPr>
+            <m:sty m:val="p"/>
+          </m:rPr>
+          <m:t>=</m:t>
+        </m:r>
+        <m:r>
+          <m:t>0.334</m:t>
+        </m:r>
+      </m:oMath>
+      <w:r>
+        <w:t xml:space="preserve">,</w:t>
       </w:r>
       <w:r>
         <w:t xml:space="preserve"> </w:t>
@@ -9324,6 +8994,15 @@
         <m:r>
           <m:t>λ</m:t>
         </m:r>
+        <m:r>
+          <m:rPr>
+            <m:sty m:val="p"/>
+          </m:rPr>
+          <m:t>=</m:t>
+        </m:r>
+        <m:r>
+          <m:t>0.349</m:t>
+        </m:r>
       </m:oMath>
       <w:r>
         <w:t xml:space="preserve">,</w:t>
@@ -9334,6 +9013,15 @@
       <m:oMath>
         <m:r>
           <m:t>ξ</m:t>
+        </m:r>
+        <m:r>
+          <m:rPr>
+            <m:sty m:val="p"/>
+          </m:rPr>
+          <m:t>=</m:t>
+        </m:r>
+        <m:r>
+          <m:t>0.056</m:t>
         </m:r>
       </m:oMath>
       <w:r>
@@ -9362,341 +9050,6 @@
             </m:r>
           </m:sub>
         </m:sSub>
-      </m:oMath>
-      <w:r>
-        <w:t xml:space="preserve"> </w:t>
-      </w:r>
-      <w:r>
-        <w:t xml:space="preserve">at the retained values, and is restricted throughout to</w:t>
-      </w:r>
-      <w:r>
-        <w:t xml:space="preserve"> </w:t>
-      </w:r>
-      <m:oMath>
-        <m:sSub>
-          <m:e>
-            <m:r>
-              <m:t>n</m:t>
-            </m:r>
-          </m:e>
-          <m:sub>
-            <m:r>
-              <m:rPr>
-                <m:nor/>
-                <m:sty m:val="p"/>
-              </m:rPr>
-              <m:t>top</m:t>
-            </m:r>
-          </m:sub>
-        </m:sSub>
-        <m:r>
-          <m:rPr>
-            <m:sty m:val="p"/>
-          </m:rPr>
-          <m:t>=</m:t>
-        </m:r>
-        <m:r>
-          <m:t>270</m:t>
-        </m:r>
-      </m:oMath>
-      <w:r>
-        <w:t xml:space="preserve">. Applying the same one-standard-error rule to that grid also selects</w:t>
-      </w:r>
-      <w:r>
-        <w:t xml:space="preserve"> </w:t>
-      </w:r>
-      <m:oMath>
-        <m:r>
-          <m:t>k</m:t>
-        </m:r>
-        <m:r>
-          <m:rPr>
-            <m:sty m:val="p"/>
-          </m:rPr>
-          <m:t>=</m:t>
-        </m:r>
-        <m:r>
-          <m:t>3</m:t>
-        </m:r>
-      </m:oMath>
-      <w:r>
-        <w:t xml:space="preserve">. Within its</w:t>
-      </w:r>
-      <w:r>
-        <w:t xml:space="preserve"> </w:t>
-      </w:r>
-      <m:oMath>
-        <m:r>
-          <m:t>k</m:t>
-        </m:r>
-        <m:r>
-          <m:rPr>
-            <m:sty m:val="p"/>
-          </m:rPr>
-          <m:t>=</m:t>
-        </m:r>
-        <m:r>
-          <m:t>3</m:t>
-        </m:r>
-      </m:oMath>
-      <w:r>
-        <w:t xml:space="preserve"> </w:t>
-      </w:r>
-      <w:r>
-        <w:t xml:space="preserve">slice, the nearest evaluated supervision level,</w:t>
-      </w:r>
-      <w:r>
-        <w:t xml:space="preserve"> </w:t>
-      </w:r>
-      <m:oMath>
-        <m:r>
-          <m:t>α</m:t>
-        </m:r>
-        <m:r>
-          <m:rPr>
-            <m:sty m:val="p"/>
-          </m:rPr>
-          <m:t>=</m:t>
-        </m:r>
-        <m:r>
-          <m:t>0.35</m:t>
-        </m:r>
-      </m:oMath>
-      <w:r>
-        <w:t xml:space="preserve">, gave a mean cross-validated C-index of 0.656 (SE 0.010). That value clears the Bayesian-optimization threshold of 0.644 but not the grid’s own one-standard-error threshold of 0.662, which is set by the grid’s best rank,</w:t>
-      </w:r>
-      <w:r>
-        <w:t xml:space="preserve"> </w:t>
-      </w:r>
-      <m:oMath>
-        <m:r>
-          <m:t>k</m:t>
-        </m:r>
-        <m:r>
-          <m:rPr>
-            <m:sty m:val="p"/>
-          </m:rPr>
-          <m:t>=</m:t>
-        </m:r>
-        <m:r>
-          <m:t>9</m:t>
-        </m:r>
-      </m:oMath>
-      <w:r>
-        <w:t xml:space="preserve"> </w:t>
-      </w:r>
-      <w:r>
-        <w:t xml:space="preserve">(Supplementary Information, Bayesian Optimization and Cross-validated C-index across factorization rank). That grid point is a sensitivity check at a nearby</w:t>
-      </w:r>
-      <w:r>
-        <w:t xml:space="preserve"> </w:t>
-      </w:r>
-      <m:oMath>
-        <m:r>
-          <m:t>α</m:t>
-        </m:r>
-      </m:oMath>
-      <w:r>
-        <w:t xml:space="preserve">, not the cross-validated performance of the final configuration itself.</w:t>
-      </w:r>
-    </w:p>
-    <w:p>
-      <w:pPr>
-        <w:pStyle w:val="BodyText"/>
-      </w:pPr>
-      <w:r>
-        <w:t xml:space="preserve">Because the goal is prognostic factorization, DeSurv selects</w:t>
-      </w:r>
-      <w:r>
-        <w:t xml:space="preserve"> </w:t>
-      </w:r>
-      <m:oMath>
-        <m:r>
-          <m:t>k</m:t>
-        </m:r>
-      </m:oMath>
-      <w:r>
-        <w:t xml:space="preserve"> </w:t>
-      </w:r>
-      <w:r>
-        <w:t xml:space="preserve">using the criterion that directly measures prognostic performance (cross-validated C-index) rather than the unsupervised diagnostics commonly used for NMF rank selection</w:t>
-      </w:r>
-      <w:hyperlink w:anchor="ref-brunet2004metagenes">
-        <w:r>
-          <w:rPr>
-            <w:rStyle w:val="Hyperlink"/>
-            <w:vertAlign w:val="superscript"/>
-          </w:rPr>
-          <w:t xml:space="preserve">13</w:t>
-        </w:r>
-      </w:hyperlink>
-      <w:r>
-        <w:rPr>
-          <w:vertAlign w:val="superscript"/>
-        </w:rPr>
-        <w:t xml:space="preserve">,</w:t>
-      </w:r>
-      <w:hyperlink w:anchor="ref-frigyesi2008nmf">
-        <w:r>
-          <w:rPr>
-            <w:rStyle w:val="Hyperlink"/>
-            <w:vertAlign w:val="superscript"/>
-          </w:rPr>
-          <w:t xml:space="preserve">28</w:t>
-        </w:r>
-      </w:hyperlink>
-      <w:r>
-        <w:t xml:space="preserve">. In the PDAC training data, standard NMF diagnostics (reconstruction residuals, cophenetic correlation, mean silhouette width) yielded inconsistent guidance across candidate ranks, a known limitation of unsupervised rank-selection criteria that can disagree on the same dataset (Supplementary Fig. [fig:fig-nmf-diagnostics]). On the sensitivity grid, cross-validated concordance varied little across candidate ranks, with no clear optimum anywhere between</w:t>
-      </w:r>
-      <w:r>
-        <w:t xml:space="preserve"> </w:t>
-      </w:r>
-      <m:oMath>
-        <m:r>
-          <m:t>k</m:t>
-        </m:r>
-        <m:r>
-          <m:rPr>
-            <m:sty m:val="p"/>
-          </m:rPr>
-          <m:t>=</m:t>
-        </m:r>
-        <m:r>
-          <m:t>2</m:t>
-        </m:r>
-      </m:oMath>
-      <w:r>
-        <w:t xml:space="preserve"> </w:t>
-      </w:r>
-      <w:r>
-        <w:t xml:space="preserve">and</w:t>
-      </w:r>
-      <w:r>
-        <w:t xml:space="preserve"> </w:t>
-      </w:r>
-      <m:oMath>
-        <m:r>
-          <m:t>k</m:t>
-        </m:r>
-        <m:r>
-          <m:rPr>
-            <m:sty m:val="p"/>
-          </m:rPr>
-          <m:t>=</m:t>
-        </m:r>
-        <m:r>
-          <m:t>12</m:t>
-        </m:r>
-      </m:oMath>
-      <w:r>
-        <w:t xml:space="preserve"> </w:t>
-      </w:r>
-      <w:r>
-        <w:t xml:space="preserve">(Supplementary Fig. [fig:fig-cindex-by-k]). The one-standard-error rule applied to the rank-wise BO results accordingly selected the parsimonious</w:t>
-      </w:r>
-      <w:r>
-        <w:t xml:space="preserve"> </w:t>
-      </w:r>
-      <m:oMath>
-        <m:r>
-          <m:t>k</m:t>
-        </m:r>
-        <m:r>
-          <m:rPr>
-            <m:sty m:val="p"/>
-          </m:rPr>
-          <m:t>=</m:t>
-        </m:r>
-        <m:r>
-          <m:t>3</m:t>
-        </m:r>
-      </m:oMath>
-      <w:r>
-        <w:t xml:space="preserve">; the final model retained</w:t>
-      </w:r>
-      <w:r>
-        <w:t xml:space="preserve"> </w:t>
-      </w:r>
-      <m:oMath>
-        <m:r>
-          <m:t>α</m:t>
-        </m:r>
-        <m:r>
-          <m:rPr>
-            <m:sty m:val="p"/>
-          </m:rPr>
-          <m:t>=</m:t>
-        </m:r>
-        <m:r>
-          <m:t>0.334</m:t>
-        </m:r>
-      </m:oMath>
-      <w:r>
-        <w:t xml:space="preserve">,</w:t>
-      </w:r>
-      <w:r>
-        <w:t xml:space="preserve"> </w:t>
-      </w:r>
-      <m:oMath>
-        <m:r>
-          <m:t>λ</m:t>
-        </m:r>
-        <m:r>
-          <m:rPr>
-            <m:sty m:val="p"/>
-          </m:rPr>
-          <m:t>=</m:t>
-        </m:r>
-        <m:r>
-          <m:t>0.349</m:t>
-        </m:r>
-      </m:oMath>
-      <w:r>
-        <w:t xml:space="preserve">,</w:t>
-      </w:r>
-      <w:r>
-        <w:t xml:space="preserve"> </w:t>
-      </w:r>
-      <m:oMath>
-        <m:r>
-          <m:t>ξ</m:t>
-        </m:r>
-        <m:r>
-          <m:rPr>
-            <m:sty m:val="p"/>
-          </m:rPr>
-          <m:t>=</m:t>
-        </m:r>
-        <m:r>
-          <m:t>0.056</m:t>
-        </m:r>
-      </m:oMath>
-      <w:r>
-        <w:t xml:space="preserve"> </w:t>
-      </w:r>
-      <w:r>
-        <w:t xml:space="preserve">and</w:t>
-      </w:r>
-      <w:r>
-        <w:t xml:space="preserve"> </w:t>
-      </w:r>
-      <m:oMath>
-        <m:sSub>
-          <m:e>
-            <m:r>
-              <m:t>n</m:t>
-            </m:r>
-          </m:e>
-          <m:sub>
-            <m:r>
-              <m:rPr>
-                <m:nor/>
-                <m:sty m:val="p"/>
-              </m:rPr>
-              <m:t>top</m:t>
-            </m:r>
-          </m:sub>
-        </m:sSub>
         <m:r>
           <m:rPr>
             <m:sty m:val="p"/>
@@ -9729,61 +9082,7 @@
         <w:pStyle w:val="FirstParagraph"/>
       </w:pPr>
       <w:r>
-        <w:t xml:space="preserve">At the selected hyperparameters, 100 fits from independent random initializations were aggregated into a gene-by-gene co-occurrence matrix, recording how often each pair of genes appeared together among the top genes of the same program, ranked by factor specificity. Genes reaching a top set in fewer than 30 of the runs were treated as inactive and excluded; the remaining genes were partitioned into</w:t>
-      </w:r>
-      <w:r>
-        <w:t xml:space="preserve"> </w:t>
-      </w:r>
-      <m:oMath>
-        <m:r>
-          <m:t>k</m:t>
-        </m:r>
-      </m:oMath>
-      <w:r>
-        <w:t xml:space="preserve"> </w:t>
-      </w:r>
-      <w:r>
-        <w:t xml:space="preserve">groups by average-linkage hierarchical clustering, each cluster defining one column of the initialization</w:t>
-      </w:r>
-      <w:r>
-        <w:t xml:space="preserve"> </w:t>
-      </w:r>
-      <m:oMath>
-        <m:sSub>
-          <m:e>
-            <m:r>
-              <m:t>W</m:t>
-            </m:r>
-          </m:e>
-          <m:sub>
-            <m:r>
-              <m:t>0</m:t>
-            </m:r>
-          </m:sub>
-        </m:sSub>
-      </m:oMath>
-      <w:r>
-        <w:t xml:space="preserve">, with inactive and otherwise empty entries set to a small positive floor. The loadings were initialized by nonnegative least squares given</w:t>
-      </w:r>
-      <w:r>
-        <w:t xml:space="preserve"> </w:t>
-      </w:r>
-      <m:oMath>
-        <m:sSub>
-          <m:e>
-            <m:r>
-              <m:t>W</m:t>
-            </m:r>
-          </m:e>
-          <m:sub>
-            <m:r>
-              <m:t>0</m:t>
-            </m:r>
-          </m:sub>
-        </m:sSub>
-      </m:oMath>
-      <w:r>
-        <w:t xml:space="preserve">, and the initial Cox coefficients were set to zero; the final model was then fit once from that initialization. Because the consensus is built from gene-by-gene co-occurrence, it is invariant to factor-label permutation and requires no alignment of labels across runs (Supplementary Information, Consensus initialization for the final model).</w:t>
+        <w:t xml:space="preserve">At the selected hyperparameters the final model was fit once from a consensus initialization built from 100 fits from independent random initializations, aggregated as a gene-by-gene co-occurrence matrix and therefore invariant to factor-label permutation (Supplementary Information, Consensus initialization for the final model).</w:t>
       </w:r>
     </w:p>
     <w:p>
@@ -10466,7 +9765,7 @@
         <w:pStyle w:val="BodyText"/>
       </w:pPr>
       <w:r>
-        <w:t xml:space="preserve">The primary factorization comparison used a common number of top genes per program when constructing each model’s scoring union. Total union size can still differ with rank and overlap among programs. Both unsupervised controls were therefore scored externally at the supervised model’s</w:t>
+        <w:t xml:space="preserve">Both unsupervised controls were scored externally at the supervised model’s</w:t>
       </w:r>
       <w:r>
         <w:t xml:space="preserve"> </w:t>
@@ -10502,7 +9801,7 @@
         <w:t xml:space="preserve"> </w:t>
       </w:r>
       <w:r>
-        <w:t xml:space="preserve">rather than at their own tuning-selected values, which were 299 for the matched-rank control and 187 for the rank-optimized control. Scoring the matched-rank control at its own selected value instead changes no per-dataset C-index by more than 0.007 (Supplementary Information, Matched-budget unsupervised control at the same rank).</w:t>
+        <w:t xml:space="preserve">rather than at their own tuning-selected values, a choice to which the per-dataset C-indices are insensitive (Supplementary Information, Matched-budget unsupervised control at the same rank).</w:t>
       </w:r>
     </w:p>
     <w:p>
@@ -10541,71 +9840,7 @@
         <w:pStyle w:val="BodyText"/>
       </w:pPr>
       <w:r>
-        <w:t xml:space="preserve">The two comparators select features by different mechanisms, and neither matches DeSurv’s. The penalized Cox comparator uses a pure lasso penalty (</w:t>
-      </w:r>
-      <w:r>
-        <w:rPr>
-          <w:rStyle w:val="VerbatimChar"/>
-        </w:rPr>
-        <w:t xml:space="preserve">glmnet</w:t>
-      </w:r>
-      <w:r>
-        <w:t xml:space="preserve"> </w:t>
-      </w:r>
-      <w:r>
-        <w:t xml:space="preserve">with mixing parameter 1, distinct from DeSurv’s supervision parameter</w:t>
-      </w:r>
-      <w:r>
-        <w:t xml:space="preserve"> </w:t>
-      </w:r>
-      <m:oMath>
-        <m:r>
-          <m:t>α</m:t>
-        </m:r>
-      </m:oMath>
-      <w:r>
-        <w:t xml:space="preserve">), whereas supervised principal components applies no penalty at all, instead screening genes by a cross-validated feature-score threshold and extracting a cross-validated number of components. DeSurv’s internal Cox step uses an elastic net whose Bayesian-optimization-selected mixing parameter (</w:t>
-      </w:r>
-      <m:oMath>
-        <m:r>
-          <m:t>ξ</m:t>
-        </m:r>
-        <m:r>
-          <m:rPr>
-            <m:sty m:val="p"/>
-          </m:rPr>
-          <m:t>=</m:t>
-        </m:r>
-        <m:r>
-          <m:t>0.056</m:t>
-        </m:r>
-      </m:oMath>
-      <w:r>
-        <w:t xml:space="preserve">) sits close to ridge. Both comparators retain far fewer genes than DeSurv’s 810-gene support (across 12 resampling seeds, sparse Cox selected a median of 14 genes, range 9–33, and supervised principal components 39, range 5–222), and both were tuned by their standard method-specific cross-validation rather than a budget matched to DeSurv. For this comparison DeSurv’s program scores used per-program top-</w:t>
-      </w:r>
-      <m:oMath>
-        <m:sSub>
-          <m:e>
-            <m:r>
-              <m:t>n</m:t>
-            </m:r>
-          </m:e>
-          <m:sub>
-            <m:r>
-              <m:rPr>
-                <m:nor/>
-                <m:sty m:val="p"/>
-              </m:rPr>
-              <m:t>top</m:t>
-            </m:r>
-          </m:sub>
-        </m:sSub>
-      </m:oMath>
-      <w:r>
-        <w:t xml:space="preserve"> </w:t>
-      </w:r>
-      <w:r>
-        <w:t xml:space="preserve">masks rather than the union support, and the Cox weights combining the three program scores were re-estimated without penalty on the training scores, so that all three methods enter as training-fitted linear scores. The comparison evaluates method-specific representations and predictive performance, without matching tuning budgets. A separate exploratory comparison used restricted supervised principal components, Cox partial least squares and a single sparse Cox fit (Supplementary Information, The D1 axis is not specific to DeSurv).</w:t>
+        <w:t xml:space="preserve">The two comparators, lasso-penalized Cox regression and supervised principal components, select features by different mechanisms, neither matching DeSurv’s elastic net, and both retain far fewer genes than DeSurv’s 810-gene support (Supplementary Information, Robustness to tuned supervised comparators and compartment attribution). Because tuning budgets were not matched, the comparison characterizes the representations each approach recovers rather than benchmarking tuned predictive performance. A separate exploratory comparison used restricted supervised principal components, Cox partial least squares and a single sparse Cox fit (Supplementary Information, The D1 axis is not specific to DeSurv).</w:t>
       </w:r>
     </w:p>
     <w:p>
@@ -10613,7 +9848,7 @@
         <w:pStyle w:val="BodyText"/>
       </w:pPr>
       <w:r>
-        <w:t xml:space="preserve">No matched-budget control was run for these supervised comparators, as was done for the unsupervised arm. Correspondence between each supervised risk score and the DeSurv programs D1–D3 was quantified in the training cohort using absolute Pearson correlation. Additional analyses of selected-gene enrichment and compartment attribution are described in the Supplementary Information.</w:t>
+        <w:t xml:space="preserve">No matched-budget control was run for these supervised comparators, as was done for the unsupervised arm. Score correspondence with the DeSurv programs, selected-gene enrichment and compartment attribution are reported in Supplementary Information, Robustness to tuned supervised comparators and compartment attribution.</w:t>
       </w:r>
     </w:p>
     <w:bookmarkEnd w:id="50"/>
@@ -10653,7 +9888,7 @@
         <w:pStyle w:val="BodyText"/>
       </w:pPr>
       <w:r>
-        <w:t xml:space="preserve">Two per-factor contribution measures are reported alongside this correspondence. Reconstruction shares are exact Shapley values over subsets of the fixed rank-one factor contributions, computed without refitting the factorization, and each subset’s value is its reconstruction gain relative to the zero-factor reconstruction; the shares are normalized to sum to 100%. The separately reported centered</w:t>
+        <w:t xml:space="preserve">Two per-factor contribution measures are reported alongside this correspondence: reconstruction shares, computed as exact Shapley values over the fixed rank-one factor contributions without refitting the factorization, and survival contributions, computed as the loss in maximized unpenalized Cox partial log-likelihood when one factor is omitted. Reconstruction gain and the separately reported centered</w:t>
       </w:r>
       <w:r>
         <w:t xml:space="preserve"> </w:t>
@@ -10676,30 +9911,7 @@
         <w:t xml:space="preserve"> </w:t>
       </w:r>
       <w:r>
-        <w:t xml:space="preserve">instead takes the grand mean of the analysis matrix as its reference. Reconstruction gain and centered</w:t>
-      </w:r>
-      <w:r>
-        <w:t xml:space="preserve"> </w:t>
-      </w:r>
-      <m:oMath>
-        <m:sSup>
-          <m:e>
-            <m:r>
-              <m:t>R</m:t>
-            </m:r>
-          </m:e>
-          <m:sup>
-            <m:r>
-              <m:t>2</m:t>
-            </m:r>
-          </m:sup>
-        </m:sSup>
-      </m:oMath>
-      <w:r>
-        <w:t xml:space="preserve"> </w:t>
-      </w:r>
-      <w:r>
-        <w:t xml:space="preserve">describe different aspects of reconstruction and should not be interpreted as interchangeable measures. Survival contributions are the loss in maximized unpenalized Cox partial log-likelihood between a model on all factor scores and a model refitted after omitting one factor, computed from full-support training scores; these conditional increments are nonadditive and are not changes in the trained penalized DeSurv predictor. Because the programs were estimated from the same training outcomes, both measures are descriptive rather than independent tests of prognosis (Supplementary Information, Reconstruction and Survival Contribution per Factor).</w:t>
+        <w:t xml:space="preserve">describe different aspects of reconstruction and should not be interpreted as interchangeable measures, and because the programs were estimated from the same training outcomes both measures are descriptive rather than independent tests of prognosis (Supplementary Information, Reconstruction and Survival Contribution per Factor).</w:t>
       </w:r>
     </w:p>
     <w:p>
@@ -10854,7 +10066,7 @@
         <w:pStyle w:val="BodyText"/>
       </w:pPr>
       <w:r>
-        <w:t xml:space="preserve">Harrell’s C-index is rank-based and assesses discrimination only, not calibration or time-dependent prediction error, so we additionally report a proper score as a sensitivity check. This is the integrated Brier score and its index of prediction accuracy relative to a Kaplan–Meier reference, computed by recalibrating only the frozen score’s scalar slope and baseline hazard within each validation dataset and integrating to the 80th percentile of that dataset’s event times. These are apparent, in-sample recalibrated values rather than out-of-sample prediction error, and because each validation dataset is integrated over its own horizon the pooled figure is a descriptive event-weighted summary (Supplementary Information, Proper-scoring sensitivity of the external validation).</w:t>
+        <w:t xml:space="preserve">Harrell’s C-index is rank-based and assesses discrimination only, not calibration or time-dependent prediction error, so we additionally report a proper score as a sensitivity check: the integrated Brier score and its index of prediction accuracy relative to a Kaplan–Meier reference, computed under within-dataset recalibration. These are apparent, in-sample recalibrated values rather than out-of-sample prediction error (Supplementary Information, Proper-scoring sensitivity of the external validation).</w:t>
       </w:r>
     </w:p>
     <w:p>
@@ -10933,7 +10145,21 @@
         </m:sSub>
       </m:oMath>
       <w:r>
-        <w:t xml:space="preserve">, without using their survival outcomes. Related supervised-NMF methods instead place the survival term on the sample side: CoxNMF maximizes a Cox partial likelihood whose covariates are the columns of</w:t>
+        <w:t xml:space="preserve">, without using their survival outcomes. Related supervised-NMF methods instead place the survival term on the sample side, so that the risk score is a function of the sample loadings and a new sample needs loadings of its own (Supplementary Information, Supervision on</w:t>
+      </w:r>
+      <w:r>
+        <w:t xml:space="preserve"> </w:t>
+      </w:r>
+      <m:oMath>
+        <m:r>
+          <m:t>W</m:t>
+        </m:r>
+      </m:oMath>
+      <w:r>
+        <w:t xml:space="preserve"> </w:t>
+      </w:r>
+      <w:r>
+        <w:t xml:space="preserve">versus</w:t>
       </w:r>
       <w:r>
         <w:t xml:space="preserve"> </w:t>
@@ -10943,37 +10169,8 @@
           <m:t>H</m:t>
         </m:r>
       </m:oMath>
-      <w:hyperlink w:anchor="ref-huang2020low">
-        <w:r>
-          <w:rPr>
-            <w:rStyle w:val="Hyperlink"/>
-            <w:vertAlign w:val="superscript"/>
-          </w:rPr>
-          <w:t xml:space="preserve">32</w:t>
-        </w:r>
-      </w:hyperlink>
-      <w:r>
-        <w:t xml:space="preserve">, and SurvNMF jointly learns the factorization and a Cox model on the sample-side latent matrix, which its own transposed notation writes as</w:t>
-      </w:r>
-      <w:r>
-        <w:t xml:space="preserve"> </w:t>
-      </w:r>
-      <m:oMath>
-        <m:r>
-          <m:t>W</m:t>
-        </m:r>
-      </m:oMath>
-      <w:hyperlink w:anchor="ref-le2025survnmf">
-        <w:r>
-          <w:rPr>
-            <w:rStyle w:val="Hyperlink"/>
-            <w:vertAlign w:val="superscript"/>
-          </w:rPr>
-          <w:t xml:space="preserve">33</w:t>
-        </w:r>
-      </w:hyperlink>
-      <w:r>
-        <w:t xml:space="preserve">. Because the risk score under either formulation is a function of the sample loadings rather than of the gene-program basis, a new sample needs loadings of its own. SurvNMF documents such a step, obtaining them for held-out samples by a constrained least-squares fit; that step holds the gene basis fixed and needs neither relearning of the basis nor validation survival outcomes, so it is an additional fitting step at transfer rather than a leak. CoxNMF’s published description does not specify a new-sample scoring procedure (Supplementary Table [tab:architecture]). Sample-side supervision can nonetheless influence the basis indirectly, through the alternating reconstruction updates. External survival outcomes were used to estimate associations and evaluate performance, including the separately described recalibration analysis, rather than to learn or tune the primary programs or risk score. Further training and validation details appear in Supplementary Information, Part I.</w:t>
+      <w:r>
+        <w:t xml:space="preserve">; Supplementary Table [tab:architecture]). External survival outcomes were used to estimate associations and evaluate performance, including the separately described recalibration analysis, rather than to learn or tune the primary programs or risk score. Further training and validation details appear in Supplementary Information, Cross-validation procedure and Survival Analysis.</w:t>
       </w:r>
     </w:p>
     <w:bookmarkEnd w:id="52"/>
@@ -10991,7 +10188,7 @@
         <w:pStyle w:val="FirstParagraph"/>
       </w:pPr>
       <w:r>
-        <w:t xml:space="preserve">Simulation studies were conducted to assess recovery of prognostic latent structure and survival prediction under controlled conditions in three scenarios: a prognostic scenario in which the factor-specific survival signal contributes little transcriptomic variation relative to the shared background that is excluded from the survival-generating gene set, a null scenario with no survival signal, and a mixed scenario where prognostic and variance-dominant signals partially overlap. Gene expression data were generated from a nonnegative factor model</w:t>
+        <w:t xml:space="preserve">Simulation studies were conducted to assess recovery of prognostic latent structure and survival prediction under controlled conditions in three scenarios: a prognostic scenario in which the factor-specific survival signal contributes little transcriptomic variation relative to the shared background that is excluded from the survival-generating gene set, a null scenario with no survival signal, and a mixed scenario where prognostic and variance-dominant signals partially overlap. Expression matrices were generated from a nonnegative factor model</w:t>
       </w:r>
       <w:r>
         <w:t xml:space="preserve"> </w:t>
@@ -11014,525 +10211,10 @@
         </m:r>
       </m:oMath>
       <w:r>
-        <w:t xml:space="preserve">, where gene loadings</w:t>
-      </w:r>
-      <w:r>
-        <w:t xml:space="preserve"> </w:t>
-      </w:r>
-      <m:oMath>
-        <m:r>
-          <m:t>W</m:t>
-        </m:r>
-      </m:oMath>
-      <w:r>
-        <w:t xml:space="preserve"> </w:t>
-      </w:r>
-      <w:r>
-        <w:t xml:space="preserve">comprised three gene classes: marker genes, background genes, and noise genes. Marker genes were simulated to load strongly on a single factor and weakly on others, background genes to load strongly across all factors, and noise genes to have uniformly low loadings. Specifically, marker gene primary loadings were drawn from</w:t>
-      </w:r>
-      <w:r>
-        <w:t xml:space="preserve"> </w:t>
-      </w:r>
-      <m:oMath>
-        <m:r>
-          <m:rPr>
-            <m:nor/>
-            <m:sty m:val="p"/>
-          </m:rPr>
-          <m:t>Gamma</m:t>
-        </m:r>
-        <m:d>
-          <m:dPr>
-            <m:begChr m:val="("/>
-            <m:endChr m:val=")"/>
-            <m:sepChr m:val=""/>
-            <m:grow/>
-          </m:dPr>
-          <m:e>
-            <m:r>
-              <m:rPr>
-                <m:nor/>
-                <m:sty m:val="p"/>
-              </m:rPr>
-              <m:t>shape</m:t>
-            </m:r>
-            <m:r>
-              <m:rPr>
-                <m:sty m:val="p"/>
-              </m:rPr>
-              <m:t>=</m:t>
-            </m:r>
-            <m:r>
-              <m:t>3</m:t>
-            </m:r>
-            <m:r>
-              <m:rPr>
-                <m:sty m:val="p"/>
-              </m:rPr>
-              <m:t>,</m:t>
-            </m:r>
-            <m:r>
-              <m:rPr>
-                <m:nor/>
-                <m:sty m:val="p"/>
-              </m:rPr>
-              <m:t>rate</m:t>
-            </m:r>
-            <m:r>
-              <m:rPr>
-                <m:sty m:val="p"/>
-              </m:rPr>
-              <m:t>=</m:t>
-            </m:r>
-            <m:r>
-              <m:t>0.8</m:t>
-            </m:r>
-          </m:e>
-        </m:d>
-      </m:oMath>
-      <w:r>
-        <w:t xml:space="preserve"> </w:t>
-      </w:r>
-      <w:r>
-        <w:t xml:space="preserve">and cross-loadings onto other factors from</w:t>
-      </w:r>
-      <w:r>
-        <w:t xml:space="preserve"> </w:t>
-      </w:r>
-      <m:oMath>
-        <m:r>
-          <m:rPr>
-            <m:nor/>
-            <m:sty m:val="p"/>
-          </m:rPr>
-          <m:t>Gamma</m:t>
-        </m:r>
-        <m:d>
-          <m:dPr>
-            <m:begChr m:val="("/>
-            <m:endChr m:val=")"/>
-            <m:sepChr m:val=""/>
-            <m:grow/>
-          </m:dPr>
-          <m:e>
-            <m:r>
-              <m:t>1</m:t>
-            </m:r>
-            <m:r>
-              <m:rPr>
-                <m:sty m:val="p"/>
-              </m:rPr>
-              <m:t>,</m:t>
-            </m:r>
-            <m:r>
-              <m:t>20</m:t>
-            </m:r>
-          </m:e>
-        </m:d>
-      </m:oMath>
-      <w:r>
-        <w:t xml:space="preserve">; background gene loadings from</w:t>
-      </w:r>
-      <w:r>
-        <w:t xml:space="preserve"> </w:t>
-      </w:r>
-      <m:oMath>
-        <m:r>
-          <m:rPr>
-            <m:nor/>
-            <m:sty m:val="p"/>
-          </m:rPr>
-          <m:t>Gamma</m:t>
-        </m:r>
-        <m:d>
-          <m:dPr>
-            <m:begChr m:val="("/>
-            <m:endChr m:val=")"/>
-            <m:sepChr m:val=""/>
-            <m:grow/>
-          </m:dPr>
-          <m:e>
-            <m:r>
-              <m:t>2</m:t>
-            </m:r>
-            <m:r>
-              <m:rPr>
-                <m:sty m:val="p"/>
-              </m:rPr>
-              <m:t>,</m:t>
-            </m:r>
-            <m:r>
-              <m:t>1</m:t>
-            </m:r>
-          </m:e>
-        </m:d>
-      </m:oMath>
-      <w:r>
-        <w:t xml:space="preserve"> </w:t>
-      </w:r>
-      <w:r>
-        <w:t xml:space="preserve">across all factors; and noise gene loadings from</w:t>
-      </w:r>
-      <w:r>
-        <w:t xml:space="preserve"> </w:t>
-      </w:r>
-      <m:oMath>
-        <m:r>
-          <m:rPr>
-            <m:nor/>
-            <m:sty m:val="p"/>
-          </m:rPr>
-          <m:t>Gamma</m:t>
-        </m:r>
-        <m:d>
-          <m:dPr>
-            <m:begChr m:val="("/>
-            <m:endChr m:val=")"/>
-            <m:sepChr m:val=""/>
-            <m:grow/>
-          </m:dPr>
-          <m:e>
-            <m:r>
-              <m:t>1</m:t>
-            </m:r>
-            <m:r>
-              <m:rPr>
-                <m:sty m:val="p"/>
-              </m:rPr>
-              <m:t>,</m:t>
-            </m:r>
-            <m:r>
-              <m:t>20</m:t>
-            </m:r>
-          </m:e>
-        </m:d>
-      </m:oMath>
-      <w:r>
-        <w:t xml:space="preserve">. Sample-level factor activities</w:t>
-      </w:r>
-      <w:r>
-        <w:t xml:space="preserve"> </w:t>
-      </w:r>
-      <m:oMath>
-        <m:r>
-          <m:t>H</m:t>
-        </m:r>
-      </m:oMath>
-      <w:r>
-        <w:t xml:space="preserve"> </w:t>
-      </w:r>
-      <w:r>
-        <w:t xml:space="preserve">were drawn from</w:t>
-      </w:r>
-      <w:r>
-        <w:t xml:space="preserve"> </w:t>
-      </w:r>
-      <m:oMath>
-        <m:r>
-          <m:rPr>
-            <m:nor/>
-            <m:sty m:val="p"/>
-          </m:rPr>
-          <m:t>Gamma</m:t>
-        </m:r>
-        <m:d>
-          <m:dPr>
-            <m:begChr m:val="("/>
-            <m:endChr m:val=")"/>
-            <m:sepChr m:val=""/>
-            <m:grow/>
-          </m:dPr>
-          <m:e>
-            <m:r>
-              <m:t>2</m:t>
-            </m:r>
-            <m:r>
-              <m:rPr>
-                <m:sty m:val="p"/>
-              </m:rPr>
-              <m:t>,</m:t>
-            </m:r>
-            <m:r>
-              <m:t>2</m:t>
-            </m:r>
-          </m:e>
-        </m:d>
-      </m:oMath>
-      <w:r>
-        <w:t xml:space="preserve">. Each dataset comprised</w:t>
-      </w:r>
-      <w:r>
-        <w:t xml:space="preserve"> </w:t>
-      </w:r>
-      <m:oMath>
-        <m:r>
-          <m:t>p</m:t>
-        </m:r>
-        <m:r>
-          <m:rPr>
-            <m:sty m:val="p"/>
-          </m:rPr>
-          <m:t>=</m:t>
-        </m:r>
-        <m:r>
-          <m:t>3</m:t>
-        </m:r>
-        <m:r>
-          <m:rPr>
-            <m:sty m:val="p"/>
-          </m:rPr>
-          <m:t>,</m:t>
-        </m:r>
-        <m:r>
-          <m:t>000</m:t>
-        </m:r>
-      </m:oMath>
-      <w:r>
-        <w:t xml:space="preserve"> </w:t>
-      </w:r>
-      <w:r>
-        <w:t xml:space="preserve">genes,</w:t>
-      </w:r>
-      <w:r>
-        <w:t xml:space="preserve"> </w:t>
-      </w:r>
-      <m:oMath>
-        <m:r>
-          <m:t>n</m:t>
-        </m:r>
-        <m:r>
-          <m:rPr>
-            <m:sty m:val="p"/>
-          </m:rPr>
-          <m:t>=</m:t>
-        </m:r>
-        <m:r>
-          <m:t>200</m:t>
-        </m:r>
-      </m:oMath>
-      <w:r>
-        <w:t xml:space="preserve"> </w:t>
-      </w:r>
-      <w:r>
-        <w:t xml:space="preserve">samples, and</w:t>
-      </w:r>
-      <w:r>
-        <w:t xml:space="preserve"> </w:t>
-      </w:r>
-      <m:oMath>
-        <m:r>
-          <m:t>k</m:t>
-        </m:r>
-        <m:r>
-          <m:rPr>
-            <m:sty m:val="p"/>
-          </m:rPr>
-          <m:t>=</m:t>
-        </m:r>
-        <m:r>
-          <m:t>3</m:t>
-        </m:r>
-      </m:oMath>
-      <w:r>
-        <w:t xml:space="preserve"> </w:t>
-      </w:r>
-      <w:r>
-        <w:t xml:space="preserve">factors, with 150 marker genes per factor and 500 shared background genes. The three factors are exchangeable in this design: the prognostic factor is not generated with lower variance than the other two. The variance-dominant signal excluded from the survival-generating gene set is the shared background block, which loads on every factor, so the factor-specific marker genes that carry survival contribute less of the total expression variation than that block. Because the background genes load on the same latent activities as the markers, their expression remains correlated with the linear predictor;</w:t>
-      </w:r>
-      <w:r>
-        <w:t xml:space="preserve"> </w:t>
-      </w:r>
-      <w:r>
-        <w:t xml:space="preserve">“</w:t>
-      </w:r>
-      <w:r>
-        <w:t xml:space="preserve">background</w:t>
-      </w:r>
-      <w:r>
-        <w:t xml:space="preserve">”</w:t>
-      </w:r>
-      <w:r>
-        <w:t xml:space="preserve"> </w:t>
-      </w:r>
-      <w:r>
-        <w:t xml:space="preserve">here denotes exclusion from the survival-generating gene set, not statistical independence of outcome. The expression matrix actually analyzed was not the noise-free product</w:t>
-      </w:r>
-      <w:r>
-        <w:t xml:space="preserve"> </w:t>
-      </w:r>
-      <m:oMath>
-        <m:r>
-          <m:t>W</m:t>
-        </m:r>
-        <m:r>
-          <m:t>H</m:t>
-        </m:r>
-      </m:oMath>
-      <w:r>
-        <w:t xml:space="preserve">: a per-gene baseline drawn as</w:t>
-      </w:r>
-      <w:r>
-        <w:t xml:space="preserve"> </w:t>
-      </w:r>
-      <m:oMath>
-        <m:r>
-          <m:rPr>
-            <m:sty m:val="p"/>
-            <m:scr m:val="script"/>
-          </m:rPr>
-          <m:t>N</m:t>
-        </m:r>
-        <m:d>
-          <m:dPr>
-            <m:begChr m:val="("/>
-            <m:endChr m:val=")"/>
-            <m:sepChr m:val=""/>
-            <m:grow/>
-          </m:dPr>
-          <m:e>
-            <m:r>
-              <m:t>3</m:t>
-            </m:r>
-            <m:r>
-              <m:rPr>
-                <m:sty m:val="p"/>
-              </m:rPr>
-              <m:t>,</m:t>
-            </m:r>
-            <m:r>
-              <m:t>1</m:t>
-            </m:r>
-          </m:e>
-        </m:d>
-      </m:oMath>
-      <w:r>
-        <w:t xml:space="preserve"> </w:t>
-      </w:r>
-      <w:r>
-        <w:t xml:space="preserve">was added to every row, independent Gaussian noise with standard deviation</w:t>
-      </w:r>
-      <w:r>
-        <w:t xml:space="preserve"> </w:t>
-      </w:r>
-      <m:oMath>
-        <m:r>
-          <m:t>0.01</m:t>
-        </m:r>
-      </m:oMath>
-      <w:r>
-        <w:t xml:space="preserve"> </w:t>
-      </w:r>
-      <w:r>
-        <w:t xml:space="preserve">was added to every entry, and negative values were clipped to zero. Cox regression coefficients were</w:t>
-      </w:r>
-      <w:r>
-        <w:t xml:space="preserve"> </w:t>
-      </w:r>
-      <m:oMath>
-        <m:r>
-          <m:t>β</m:t>
-        </m:r>
-        <m:r>
-          <m:rPr>
-            <m:sty m:val="p"/>
-          </m:rPr>
-          <m:t>=</m:t>
-        </m:r>
-        <m:sSup>
-          <m:e>
-            <m:d>
-              <m:dPr>
-                <m:begChr m:val="("/>
-                <m:endChr m:val=")"/>
-                <m:sepChr m:val=""/>
-                <m:grow/>
-              </m:dPr>
-              <m:e>
-                <m:r>
-                  <m:t>2</m:t>
-                </m:r>
-                <m:r>
-                  <m:rPr>
-                    <m:sty m:val="p"/>
-                  </m:rPr>
-                  <m:t>,</m:t>
-                </m:r>
-                <m:r>
-                  <m:t>0</m:t>
-                </m:r>
-                <m:r>
-                  <m:rPr>
-                    <m:sty m:val="p"/>
-                  </m:rPr>
-                  <m:t>,</m:t>
-                </m:r>
-                <m:r>
-                  <m:t>0</m:t>
-                </m:r>
-              </m:e>
-            </m:d>
-          </m:e>
-          <m:sup>
-            <m:r>
-              <m:rPr>
-                <m:sty m:val="p"/>
-              </m:rPr>
-              <m:t>⊤</m:t>
-            </m:r>
-          </m:sup>
-        </m:sSup>
-      </m:oMath>
-      <w:r>
-        <w:t xml:space="preserve"> </w:t>
-      </w:r>
-      <w:r>
-        <w:t xml:space="preserve">in the prognostic and mixed scenarios and</w:t>
-      </w:r>
-      <w:r>
-        <w:t xml:space="preserve"> </w:t>
-      </w:r>
-      <m:oMath>
-        <m:r>
-          <m:t>β</m:t>
-        </m:r>
-        <m:r>
-          <m:rPr>
-            <m:sty m:val="p"/>
-          </m:rPr>
-          <m:t>=</m:t>
-        </m:r>
-        <m:r>
-          <m:t>0</m:t>
-        </m:r>
-      </m:oMath>
-      <w:r>
-        <w:t xml:space="preserve"> </w:t>
-      </w:r>
-      <w:r>
-        <w:t xml:space="preserve">in the null scenario, which otherwise used the same baseline hazard parameter and censoring rate as the prognostic scenario. The mixed scenario differs from the prognostic scenario only in its survival gene set, 300 genes per column of the survival-generating weight matrix</w:t>
-      </w:r>
-      <w:r>
-        <w:t xml:space="preserve"> </w:t>
-      </w:r>
-      <m:oMath>
-        <m:sSup>
-          <m:e>
-            <m:r>
-              <m:t>W</m:t>
-            </m:r>
-          </m:e>
-          <m:sup>
-            <m:r>
-              <m:rPr>
-                <m:sty m:val="p"/>
-              </m:rPr>
-              <m:t>*</m:t>
-            </m:r>
-          </m:sup>
-        </m:sSup>
-      </m:oMath>
-      <w:r>
-        <w:t xml:space="preserve">, comprising the 150 markers of that factor and 150 randomly sampled background genes, which creates partial overlap between the prognostic signal and the variance-dominant background.</w:t>
+        <w:t xml:space="preserve"> </w:t>
+      </w:r>
+      <w:r>
+        <w:t xml:space="preserve">with marker, background and noise gene classes, and survival times from an exponential model applied to the noise-free expression through a masked survival-generating weight matrix; the generating distributions, dimensions, scenario coefficients and masking construction are given in Supplementary Information, Simulation design and data generation.</w:t>
       </w:r>
     </w:p>
     <w:p>
@@ -11540,483 +10222,7 @@
         <w:pStyle w:val="BodyText"/>
       </w:pPr>
       <w:r>
-        <w:t xml:space="preserve">Survival times were generated from an exponential distribution, from the noise-free expression only. Let</w:t>
-      </w:r>
-      <w:r>
-        <w:t xml:space="preserve"> </w:t>
-      </w:r>
-      <m:oMath>
-        <m:sSub>
-          <m:e>
-            <m:r>
-              <m:t>X</m:t>
-            </m:r>
-          </m:e>
-          <m:sub>
-            <m:r>
-              <m:t>0</m:t>
-            </m:r>
-          </m:sub>
-        </m:sSub>
-        <m:r>
-          <m:rPr>
-            <m:sty m:val="p"/>
-          </m:rPr>
-          <m:t>=</m:t>
-        </m:r>
-        <m:r>
-          <m:t>W</m:t>
-        </m:r>
-        <m:r>
-          <m:t>H</m:t>
-        </m:r>
-      </m:oMath>
-      <w:r>
-        <w:t xml:space="preserve"> </w:t>
-      </w:r>
-      <w:r>
-        <w:t xml:space="preserve">denote that noise-free matrix and</w:t>
-      </w:r>
-      <w:r>
-        <w:t xml:space="preserve"> </w:t>
-      </w:r>
-      <m:oMath>
-        <m:sSup>
-          <m:e>
-            <m:r>
-              <m:t>W</m:t>
-            </m:r>
-          </m:e>
-          <m:sup>
-            <m:r>
-              <m:rPr>
-                <m:sty m:val="p"/>
-              </m:rPr>
-              <m:t>*</m:t>
-            </m:r>
-          </m:sup>
-        </m:sSup>
-      </m:oMath>
-      <w:r>
-        <w:t xml:space="preserve"> </w:t>
-      </w:r>
-      <w:r>
-        <w:t xml:space="preserve">the survival-generating weight matrix, a masked copy of the column-normalized</w:t>
-      </w:r>
-      <w:r>
-        <w:t xml:space="preserve"> </w:t>
-      </w:r>
-      <m:oMath>
-        <m:r>
-          <m:t>W</m:t>
-        </m:r>
-      </m:oMath>
-      <w:r>
-        <w:t xml:space="preserve"> </w:t>
-      </w:r>
-      <w:r>
-        <w:t xml:space="preserve">that retains, in each column, only the loadings of that factor’s survival-generating genes and is zero elsewhere: the 150 markers of that factor in the prognostic and null scenarios, and 150 markers plus 150 background genes in the mixed scenario. The raw generating scores were</w:t>
-      </w:r>
-      <w:r>
-        <w:t xml:space="preserve"> </w:t>
-      </w:r>
-      <m:oMath>
-        <m:sSub>
-          <m:e>
-            <m:r>
-              <m:t>Z</m:t>
-            </m:r>
-          </m:e>
-          <m:sub>
-            <m:r>
-              <m:rPr>
-                <m:nor/>
-                <m:sty m:val="p"/>
-              </m:rPr>
-              <m:t>raw</m:t>
-            </m:r>
-          </m:sub>
-        </m:sSub>
-        <m:r>
-          <m:rPr>
-            <m:sty m:val="p"/>
-          </m:rPr>
-          <m:t>=</m:t>
-        </m:r>
-        <m:sSubSup>
-          <m:e>
-            <m:r>
-              <m:t>X</m:t>
-            </m:r>
-          </m:e>
-          <m:sub>
-            <m:r>
-              <m:t>0</m:t>
-            </m:r>
-          </m:sub>
-          <m:sup>
-            <m:r>
-              <m:rPr>
-                <m:sty m:val="p"/>
-              </m:rPr>
-              <m:t>⊤</m:t>
-            </m:r>
-          </m:sup>
-        </m:sSubSup>
-        <m:sSup>
-          <m:e>
-            <m:r>
-              <m:t>W</m:t>
-            </m:r>
-          </m:e>
-          <m:sup>
-            <m:r>
-              <m:rPr>
-                <m:sty m:val="p"/>
-              </m:rPr>
-              <m:t>*</m:t>
-            </m:r>
-          </m:sup>
-        </m:sSup>
-        <m:r>
-          <m:rPr>
-            <m:sty m:val="p"/>
-          </m:rPr>
-          <m:t>∈</m:t>
-        </m:r>
-        <m:sSup>
-          <m:e>
-            <m:r>
-              <m:rPr>
-                <m:sty m:val="p"/>
-                <m:scr m:val="double-struck"/>
-              </m:rPr>
-              <m:t>R</m:t>
-            </m:r>
-          </m:e>
-          <m:sup>
-            <m:r>
-              <m:t>n</m:t>
-            </m:r>
-            <m:r>
-              <m:rPr>
-                <m:sty m:val="p"/>
-              </m:rPr>
-              <m:t>×</m:t>
-            </m:r>
-            <m:r>
-              <m:t>k</m:t>
-            </m:r>
-          </m:sup>
-        </m:sSup>
-      </m:oMath>
-      <w:r>
-        <w:t xml:space="preserve">, written here as the transpose of the model-section convention</w:t>
-      </w:r>
-      <w:r>
-        <w:t xml:space="preserve"> </w:t>
-      </w:r>
-      <m:oMath>
-        <m:r>
-          <m:t>Z</m:t>
-        </m:r>
-        <m:r>
-          <m:rPr>
-            <m:sty m:val="p"/>
-          </m:rPr>
-          <m:t>=</m:t>
-        </m:r>
-        <m:sSup>
-          <m:e>
-            <m:r>
-              <m:t>W</m:t>
-            </m:r>
-          </m:e>
-          <m:sup>
-            <m:r>
-              <m:rPr>
-                <m:sty m:val="p"/>
-              </m:rPr>
-              <m:t>⊤</m:t>
-            </m:r>
-          </m:sup>
-        </m:sSup>
-        <m:r>
-          <m:t>X</m:t>
-        </m:r>
-      </m:oMath>
-      <w:r>
-        <w:t xml:space="preserve"> </w:t>
-      </w:r>
-      <w:r>
-        <w:t xml:space="preserve">so that rows index samples, and</w:t>
-      </w:r>
-      <w:r>
-        <w:t xml:space="preserve"> </w:t>
-      </w:r>
-      <m:oMath>
-        <m:sSub>
-          <m:e>
-            <m:r>
-              <m:t>Z</m:t>
-            </m:r>
-          </m:e>
-          <m:sub>
-            <m:r>
-              <m:rPr>
-                <m:nor/>
-                <m:sty m:val="p"/>
-              </m:rPr>
-              <m:t>true</m:t>
-            </m:r>
-          </m:sub>
-        </m:sSub>
-      </m:oMath>
-      <w:r>
-        <w:t xml:space="preserve"> </w:t>
-      </w:r>
-      <w:r>
-        <w:t xml:space="preserve">denotes their column-wise standardization across all</w:t>
-      </w:r>
-      <w:r>
-        <w:t xml:space="preserve"> </w:t>
-      </w:r>
-      <m:oMath>
-        <m:r>
-          <m:t>n</m:t>
-        </m:r>
-        <m:r>
-          <m:rPr>
-            <m:sty m:val="p"/>
-          </m:rPr>
-          <m:t>=</m:t>
-        </m:r>
-        <m:r>
-          <m:t>200</m:t>
-        </m:r>
-      </m:oMath>
-      <w:r>
-        <w:t xml:space="preserve"> </w:t>
-      </w:r>
-      <w:r>
-        <w:t xml:space="preserve">samples, applied before the 70/30 train/test split; the linear predictor was</w:t>
-      </w:r>
-      <w:r>
-        <w:t xml:space="preserve"> </w:t>
-      </w:r>
-      <m:oMath>
-        <m:r>
-          <m:t>η</m:t>
-        </m:r>
-        <m:r>
-          <m:rPr>
-            <m:sty m:val="p"/>
-          </m:rPr>
-          <m:t>=</m:t>
-        </m:r>
-        <m:sSub>
-          <m:e>
-            <m:r>
-              <m:t>Z</m:t>
-            </m:r>
-          </m:e>
-          <m:sub>
-            <m:r>
-              <m:rPr>
-                <m:nor/>
-                <m:sty m:val="p"/>
-              </m:rPr>
-              <m:t>true</m:t>
-            </m:r>
-          </m:sub>
-        </m:sSub>
-        <m:r>
-          <m:t>β</m:t>
-        </m:r>
-      </m:oMath>
-      <w:r>
-        <w:t xml:space="preserve">, so with</w:t>
-      </w:r>
-      <w:r>
-        <w:t xml:space="preserve"> </w:t>
-      </w:r>
-      <m:oMath>
-        <m:r>
-          <m:t>β</m:t>
-        </m:r>
-        <m:r>
-          <m:rPr>
-            <m:sty m:val="p"/>
-          </m:rPr>
-          <m:t>=</m:t>
-        </m:r>
-        <m:sSup>
-          <m:e>
-            <m:d>
-              <m:dPr>
-                <m:begChr m:val="("/>
-                <m:endChr m:val=")"/>
-                <m:sepChr m:val=""/>
-                <m:grow/>
-              </m:dPr>
-              <m:e>
-                <m:r>
-                  <m:t>2</m:t>
-                </m:r>
-                <m:r>
-                  <m:rPr>
-                    <m:sty m:val="p"/>
-                  </m:rPr>
-                  <m:t>,</m:t>
-                </m:r>
-                <m:r>
-                  <m:t>0</m:t>
-                </m:r>
-                <m:r>
-                  <m:rPr>
-                    <m:sty m:val="p"/>
-                  </m:rPr>
-                  <m:t>,</m:t>
-                </m:r>
-                <m:r>
-                  <m:t>0</m:t>
-                </m:r>
-              </m:e>
-            </m:d>
-          </m:e>
-          <m:sup>
-            <m:r>
-              <m:rPr>
-                <m:sty m:val="p"/>
-              </m:rPr>
-              <m:t>⊤</m:t>
-            </m:r>
-          </m:sup>
-        </m:sSup>
-      </m:oMath>
-      <w:r>
-        <w:t xml:space="preserve"> </w:t>
-      </w:r>
-      <w:r>
-        <w:t xml:space="preserve">only factor 1 contributes; event times were drawn as</w:t>
-      </w:r>
-      <w:r>
-        <w:t xml:space="preserve"> </w:t>
-      </w:r>
-      <m:oMath>
-        <m:r>
-          <m:t>T</m:t>
-        </m:r>
-        <m:r>
-          <m:rPr>
-            <m:sty m:val="p"/>
-          </m:rPr>
-          <m:t>∼</m:t>
-        </m:r>
-        <m:r>
-          <m:rPr>
-            <m:nor/>
-            <m:sty m:val="p"/>
-          </m:rPr>
-          <m:t>Exponential</m:t>
-        </m:r>
-        <m:d>
-          <m:dPr>
-            <m:begChr m:val="("/>
-            <m:endChr m:val=")"/>
-            <m:sepChr m:val=""/>
-            <m:grow/>
-          </m:dPr>
-          <m:e>
-            <m:sSub>
-              <m:e>
-                <m:r>
-                  <m:t>λ</m:t>
-                </m:r>
-              </m:e>
-              <m:sub>
-                <m:r>
-                  <m:t>0</m:t>
-                </m:r>
-              </m:sub>
-            </m:sSub>
-            <m:sSup>
-              <m:e>
-                <m:r>
-                  <m:t>e</m:t>
-                </m:r>
-              </m:e>
-              <m:sup>
-                <m:r>
-                  <m:t>η</m:t>
-                </m:r>
-              </m:sup>
-            </m:sSup>
-          </m:e>
-        </m:d>
-      </m:oMath>
-      <w:r>
-        <w:t xml:space="preserve"> </w:t>
-      </w:r>
-      <w:r>
-        <w:t xml:space="preserve">with</w:t>
-      </w:r>
-      <w:r>
-        <w:t xml:space="preserve"> </w:t>
-      </w:r>
-      <m:oMath>
-        <m:sSub>
-          <m:e>
-            <m:r>
-              <m:t>λ</m:t>
-            </m:r>
-          </m:e>
-          <m:sub>
-            <m:r>
-              <m:t>0</m:t>
-            </m:r>
-          </m:sub>
-        </m:sSub>
-        <m:r>
-          <m:rPr>
-            <m:sty m:val="p"/>
-          </m:rPr>
-          <m:t>=</m:t>
-        </m:r>
-        <m:r>
-          <m:t>0.05</m:t>
-        </m:r>
-      </m:oMath>
-      <w:r>
-        <w:t xml:space="preserve">, and censoring times independently as</w:t>
-      </w:r>
-      <w:r>
-        <w:t xml:space="preserve"> </w:t>
-      </w:r>
-      <m:oMath>
-        <m:r>
-          <m:rPr>
-            <m:nor/>
-            <m:sty m:val="p"/>
-          </m:rPr>
-          <m:t>Exponential</m:t>
-        </m:r>
-        <m:d>
-          <m:dPr>
-            <m:begChr m:val="("/>
-            <m:endChr m:val=")"/>
-            <m:sepChr m:val=""/>
-            <m:grow/>
-          </m:dPr>
-          <m:e>
-            <m:r>
-              <m:t>0.02</m:t>
-            </m:r>
-          </m:e>
-        </m:d>
-      </m:oMath>
-      <w:r>
-        <w:t xml:space="preserve">. Each scenario comprised 100 replicates, each with a held-out test split. DeSurv incorporated survival during factorization, whereas its unsupervised limit used a post hoc Cox model on projected scores; both pipelines were tuned by Bayesian optimization using cross-validated concordance. Performance was summarized across replicates using test-set concordance and matched-factor precision of prognostic-gene recovery.</w:t>
+        <w:t xml:space="preserve">DeSurv incorporated survival during factorization, whereas its unsupervised limit used a post hoc Cox model on projected scores; both pipelines were tuned by Bayesian optimization using cross-validated concordance. Performance was summarized across replicates, each with a held-out test split, using test-set concordance and matched-factor precision of prognostic-gene recovery.</w:t>
       </w:r>
     </w:p>
     <w:p>
@@ -12075,103 +10281,7 @@
         <w:t xml:space="preserve"> </w:t>
       </w:r>
       <w:r>
-        <w:t xml:space="preserve">set to the Bayesian-optimization-selected signature size. Because the matching selects the factor by the precision that is then reported, matched-factor precision is optimistic by construction. We also report global marker recall, the fraction of the true survival-gene set recovered anywhere in the union of all learned factors’ top-</w:t>
-      </w:r>
-      <m:oMath>
-        <m:sSub>
-          <m:e>
-            <m:r>
-              <m:t>n</m:t>
-            </m:r>
-          </m:e>
-          <m:sub>
-            <m:r>
-              <m:rPr>
-                <m:nor/>
-                <m:sty m:val="p"/>
-              </m:rPr>
-              <m:t>top</m:t>
-            </m:r>
-          </m:sub>
-        </m:sSub>
-      </m:oMath>
-      <w:r>
-        <w:t xml:space="preserve"> </w:t>
-      </w:r>
-      <w:r>
-        <w:t xml:space="preserve">gene sets; it is insensitive to factor matching, although, like precision, it depends on each method’s selected</w:t>
-      </w:r>
-      <w:r>
-        <w:t xml:space="preserve"> </w:t>
-      </w:r>
-      <m:oMath>
-        <m:sSub>
-          <m:e>
-            <m:r>
-              <m:t>n</m:t>
-            </m:r>
-          </m:e>
-          <m:sub>
-            <m:r>
-              <m:rPr>
-                <m:nor/>
-                <m:sty m:val="p"/>
-              </m:rPr>
-              <m:t>top</m:t>
-            </m:r>
-          </m:sub>
-        </m:sSub>
-      </m:oMath>
-      <w:r>
-        <w:t xml:space="preserve"> </w:t>
-      </w:r>
-      <w:r>
-        <w:t xml:space="preserve">(Supplementary Information). In the primary scenario the target comprised the 150 factor-specific marker genes driving survival (</w:t>
-      </w:r>
-      <m:oMath>
-        <m:r>
-          <m:t>β</m:t>
-        </m:r>
-        <m:r>
-          <m:rPr>
-            <m:sty m:val="p"/>
-          </m:rPr>
-          <m:t>=</m:t>
-        </m:r>
-        <m:d>
-          <m:dPr>
-            <m:begChr m:val="("/>
-            <m:endChr m:val=")"/>
-            <m:sepChr m:val=""/>
-            <m:grow/>
-          </m:dPr>
-          <m:e>
-            <m:r>
-              <m:t>2</m:t>
-            </m:r>
-            <m:r>
-              <m:rPr>
-                <m:sty m:val="p"/>
-              </m:rPr>
-              <m:t>,</m:t>
-            </m:r>
-            <m:r>
-              <m:t>0</m:t>
-            </m:r>
-            <m:r>
-              <m:rPr>
-                <m:sty m:val="p"/>
-              </m:rPr>
-              <m:t>,</m:t>
-            </m:r>
-            <m:r>
-              <m:t>0</m:t>
-            </m:r>
-          </m:e>
-        </m:d>
-      </m:oMath>
-      <w:r>
-        <w:t xml:space="preserve">); in the mixed scenario, marker-only and full survival-gene definitions of the target were evaluated separately.</w:t>
+        <w:t xml:space="preserve">set to the Bayesian-optimization-selected signature size. Because the matching selects the factor by the precision that is then reported, matched-factor precision is optimistic by construction. Global marker recall and the per-scenario definitions of the target gene set are reported in Supplementary Information, Simulation design and data generation and Simulation results under null and mixed scenarios.</w:t>
       </w:r>
     </w:p>
     <w:bookmarkEnd w:id="53"/>
@@ -12189,16 +10299,7 @@
         <w:pStyle w:val="FirstParagraph"/>
       </w:pPr>
       <w:r>
-        <w:t xml:space="preserve">We analyzed publicly available and controlled-access RNA sequencing (RNA-seq) and microarray cohorts of PDAC with corresponding overall survival outcomes. Eligible samples were primary PDAC tumors with a measured bulk expression profile and valid overall-survival annotation, subject to cohort-specific quality-control and exclusion criteria detailed in Supplementary Information, PDAC Datasets; accrual and follow-up periods are as defined in each cohort’s original publication. Gene expression matrices were analyzed on a log scale: RNA-seq cohorts as log</w:t>
-      </w:r>
-      <w:r>
-        <w:rPr>
-          <w:vertAlign w:val="subscript"/>
-        </w:rPr>
-        <w:t xml:space="preserve">2</w:t>
-      </w:r>
-      <w:r>
-        <w:t xml:space="preserve">(TPM + 1); microarray cohorts in platform-normalized log-scale intensities. Within each training cohort, genes were ranked separately in descending order of mean expression and of variance, and the 3,000 genes with the smallest sum of the two ranks were retained, selecting genes that are both highly expressed and highly variable. The intersection across training cohorts yielded 1,970 genes used for all analyses. Validation datasets were restricted to this same gene set. Survival times and censoring indicators were taken from the associated clinical annotations. No missing-data imputation was performed: all analyses used complete cases, and analyses adjusted for the PurIST and DeCAF classifiers were restricted to samples with available classifier calls. Of the seven PDAC expression datasets we considered, two were used for training (TCGA and CPTAC) and five for external validation (Dijk, Moffitt, PACA-AU array, PACA-AU RNA-seq, and Puleo); because the two PACA-AU platforms profile one patient cohort, these five validation datasets span four independent patient cohorts. To harmonize differences in scale across cohorts, filtered gene expression data were within-sample rank transformed before model training (ranks are inherently nonnegative, preserving NMF compatibility). Within-sample ranking reduces platform- and library-size differences in expression scale that would otherwise dominate cross-cohort projection. The training Cox objective was fit to the pooled TCGA and CPTAC samples without a cohort term; cross-validation folds were constructed within cohort with stratification by event status. Both training cohorts are RNA-seq, were rank transformed within sample, and had similar event rates (52% in TCGA-PAAD and 50% in CPTAC; Supplementary Table [tab:cohorts]); all validation analyses stratify by dataset, and a descriptive check against cohort-driven association is given in the Supplementary Information (Cohort handling in the training objective). More details about the datasets can be found in Supplementary Information, PDAC Datasets.</w:t>
+        <w:t xml:space="preserve">We analyzed publicly available and controlled-access RNA sequencing (RNA-seq) and microarray cohorts of PDAC with corresponding overall survival outcomes. Eligible samples were primary PDAC tumors with a measured bulk expression profile and valid overall-survival annotation, subject to cohort-specific quality-control and exclusion criteria detailed in Supplementary Information, PDAC Datasets; accrual and follow-up periods are as defined in each cohort’s original publication. Of the seven PDAC expression datasets we considered, two were used for training (TCGA and CPTAC) and five for external validation (Dijk, Moffitt, PACA-AU array, PACA-AU RNA-seq, and Puleo); because the two PACA-AU platforms profile one patient cohort, these five validation datasets span four independent patient cohorts. Expression matrices were analyzed on a log scale and filtered within each training cohort by a combined mean-and-variance rank rule, whose intersection across training cohorts yielded the 1,970 genes used for all analyses; validation datasets were restricted to this same gene set. Filtered expression was then within-sample rank transformed before model training, which reduces platform- and library-size differences in expression scale that would otherwise dominate cross-cohort projection (ranks are inherently nonnegative, preserving NMF compatibility). No missing-data imputation was performed: all analyses used complete cases, and analyses adjusted for the PurIST and DeCAF classifiers were restricted to samples with available classifier calls. The training Cox objective was fit to the pooled TCGA and CPTAC samples without a cohort term, with cross-validation folds constructed within cohort and stratified by event status; both training cohorts are RNA-seq and had similar event rates (52% in TCGA-PAAD and 50% in CPTAC; Supplementary Table [tab:cohorts]). All validation analyses stratify by dataset, and a descriptive check against cohort-driven association is given in Supplementary Information, Cohort handling in the training objective.</w:t>
       </w:r>
     </w:p>
     <w:p>
@@ -12387,7 +10488,7 @@
         <w:pStyle w:val="FirstParagraph"/>
       </w:pPr>
       <w:r>
-        <w:t xml:space="preserve">Two independently treated PDAC cohorts were used only for projection of the frozen programs (Supplementary Information, Translational transportability). Projection used the frozen union support without any retraining: expression was rank transformed within sample over the genes each cohort shares with the trained gene-program namespace, support genes absent from a cohort were omitted from that cohort’s projection rather than imputed (805 of the support genes were measured in the COMPASS data), and the resulting program scores were standardized within each treated cohort before analysis. In the O’Kane/COMPASS cohort of treated metastatic PDAC (</w:t>
+        <w:t xml:space="preserve">Two independently treated PDAC cohorts were used only for projection of the frozen programs, without any retraining. In the O’Kane/COMPASS cohort of treated metastatic PDAC (</w:t>
       </w:r>
       <m:oMath>
         <m:r>
@@ -12407,7 +10508,7 @@
         <w:t xml:space="preserve"> </w:t>
       </w:r>
       <w:r>
-        <w:t xml:space="preserve">patients, 123 deaths; laser-capture microdissected, epithelial-enriched expression), the association of the projected D1 score with survival was reported both as arm-specific estimates and as a common slope from a Cox model stratified by treatment arm, which allows arm-specific baseline hazards, with a treatment-by-D1 interaction test reported descriptively; no estimate is pooled across cohorts. In the Linehan cohort of borderline-resectable or locally advanced disease, 29 patients with paired pre- and post-treatment biopsies were compared on the projected D2 score by a paired Wilcoxon signed-rank test; this analysis concerns program level, not survival. Both analyses were exploratory and not preregistered.</w:t>
+        <w:t xml:space="preserve">patients, 123 deaths; laser-capture microdissected, epithelial-enriched expression), the association of the projected D1 score with survival was reported both as arm-specific estimates and as a common slope from a Cox model stratified by treatment arm, which allows arm-specific baseline hazards, with a treatment-by-D1 interaction test reported descriptively; no estimate is pooled across cohorts. In the Linehan cohort of borderline-resectable or locally advanced disease, 29 patients with paired pre- and post-treatment biopsies were compared on the projected D2 score by a paired Wilcoxon signed-rank test; this analysis concerns program level, not survival. Projection mechanics, including missing-gene handling and within-cohort standardization, are described in Supplementary Information, Translational transportability into independent treated PDAC cohorts. Both analyses were exploratory and not preregistered.</w:t>
       </w:r>
     </w:p>
     <w:bookmarkEnd w:id="56"/>
@@ -12452,7 +10553,7 @@
             <w:rStyle w:val="Hyperlink"/>
             <w:vertAlign w:val="superscript"/>
           </w:rPr>
-          <w:t xml:space="preserve">39</w:t>
+          <w:t xml:space="preserve">43</w:t>
         </w:r>
       </w:hyperlink>
       <w:r>
@@ -12467,7 +10568,7 @@
             <w:rStyle w:val="Hyperlink"/>
             <w:vertAlign w:val="superscript"/>
           </w:rPr>
-          <w:t xml:space="preserve">40</w:t>
+          <w:t xml:space="preserve">44</w:t>
         </w:r>
       </w:hyperlink>
       <w:r>
@@ -12479,7 +10580,7 @@
             <w:rStyle w:val="Hyperlink"/>
             <w:vertAlign w:val="superscript"/>
           </w:rPr>
-          <w:t xml:space="preserve">41</w:t>
+          <w:t xml:space="preserve">45</w:t>
         </w:r>
       </w:hyperlink>
       <w:r>
@@ -12491,7 +10592,7 @@
             <w:rStyle w:val="Hyperlink"/>
             <w:vertAlign w:val="superscript"/>
           </w:rPr>
-          <w:t xml:space="preserve">42</w:t>
+          <w:t xml:space="preserve">46</w:t>
         </w:r>
       </w:hyperlink>
       <w:r>
@@ -12503,7 +10604,7 @@
             <w:rStyle w:val="Hyperlink"/>
             <w:vertAlign w:val="superscript"/>
           </w:rPr>
-          <w:t xml:space="preserve">43</w:t>
+          <w:t xml:space="preserve">47</w:t>
         </w:r>
       </w:hyperlink>
       <w:r>
@@ -12515,7 +10616,7 @@
             <w:rStyle w:val="Hyperlink"/>
             <w:vertAlign w:val="superscript"/>
           </w:rPr>
-          <w:t xml:space="preserve">44</w:t>
+          <w:t xml:space="preserve">48</w:t>
         </w:r>
       </w:hyperlink>
       <w:r>
@@ -12595,7 +10696,7 @@
             <w:rStyle w:val="Hyperlink"/>
             <w:vertAlign w:val="superscript"/>
           </w:rPr>
-          <w:t xml:space="preserve">38</w:t>
+          <w:t xml:space="preserve">42</w:t>
         </w:r>
       </w:hyperlink>
       <w:r>
@@ -12799,7 +10900,7 @@
       </w:r>
     </w:p>
     <w:bookmarkEnd w:id="65"/>
-    <w:bookmarkStart w:id="150" w:name="references"/>
+    <w:bookmarkStart w:id="158" w:name="references"/>
     <w:p>
       <w:pPr>
         <w:pStyle w:val="Heading1"/>
@@ -12808,7 +10909,7 @@
         <w:t xml:space="preserve">References</w:t>
       </w:r>
     </w:p>
-    <w:bookmarkStart w:id="149" w:name="refs"/>
+    <w:bookmarkStart w:id="157" w:name="refs"/>
     <w:bookmarkStart w:id="67" w:name="ref-siegel2026cancer"/>
     <w:p>
       <w:pPr>
@@ -14806,7 +12907,7 @@
       </w:r>
     </w:p>
     <w:bookmarkEnd w:id="126"/>
-    <w:bookmarkStart w:id="128" w:name="ref-ogawa2020stroma"/>
+    <w:bookmarkStart w:id="128" w:name="ref-zaccaria2023surviae"/>
     <w:p>
       <w:pPr>
         <w:pStyle w:val="Bibliography"/>
@@ -14821,7 +12922,7 @@
         <w:t xml:space="preserve">	</w:t>
       </w:r>
       <w:r>
-        <w:t xml:space="preserve">Ogawa, Y.</w:t>
+        <w:t xml:space="preserve">Zaccaria, G. M.</w:t>
       </w:r>
       <w:r>
         <w:t xml:space="preserve"> </w:t>
@@ -14841,7 +12942,31 @@
           <w:rPr>
             <w:rStyle w:val="Hyperlink"/>
           </w:rPr>
-          <w:t xml:space="preserve">Three distinct stroma types in human pancreatic cancer identified by image analysis of fibroblast subpopulations and collagen</w:t>
+          <w:t xml:space="preserve">SurvIAE</w:t>
+        </w:r>
+        <w:r>
+          <w:rPr>
+            <w:rStyle w:val="Hyperlink"/>
+          </w:rPr>
+          <w:t xml:space="preserve">: Survival prediction with interpretable autoencoders from diffuse large</w:t>
+        </w:r>
+        <w:r>
+          <w:rPr>
+            <w:rStyle w:val="Hyperlink"/>
+          </w:rPr>
+          <w:t xml:space="preserve"> </w:t>
+        </w:r>
+        <w:r>
+          <w:rPr>
+            <w:rStyle w:val="Hyperlink"/>
+          </w:rPr>
+          <w:t xml:space="preserve">B</w:t>
+        </w:r>
+        <w:r>
+          <w:rPr>
+            <w:rStyle w:val="Hyperlink"/>
+          </w:rPr>
+          <w:t xml:space="preserve">-cell lymphoma gene expression data</w:t>
         </w:r>
       </w:hyperlink>
       <w:r>
@@ -14855,7 +12980,7 @@
           <w:iCs/>
           <w:i/>
         </w:rPr>
-        <w:t xml:space="preserve">Clinical Cancer Research</w:t>
+        <w:t xml:space="preserve">Computer Methods and Programs in Biomedicine</w:t>
       </w:r>
       <w:r>
         <w:t xml:space="preserve"> </w:t>
@@ -14865,14 +12990,14 @@
           <w:bCs/>
           <w:b/>
         </w:rPr>
-        <w:t xml:space="preserve">27</w:t>
-      </w:r>
-      <w:r>
-        <w:t xml:space="preserve">, 107–119 (2021).</w:t>
+        <w:t xml:space="preserve">244</w:t>
+      </w:r>
+      <w:r>
+        <w:t xml:space="preserve">, 107966 (2024).</w:t>
       </w:r>
     </w:p>
     <w:bookmarkEnd w:id="128"/>
-    <w:bookmarkStart w:id="130" w:name="ref-neuzillet2022periostin"/>
+    <w:bookmarkStart w:id="130" w:name="ref-meng2022savae"/>
     <w:p>
       <w:pPr>
         <w:pStyle w:val="Bibliography"/>
@@ -14887,7 +13012,7 @@
         <w:t xml:space="preserve">	</w:t>
       </w:r>
       <w:r>
-        <w:t xml:space="preserve">Neuzillet, C.</w:t>
+        <w:t xml:space="preserve">Meng, X.</w:t>
       </w:r>
       <w:r>
         <w:t xml:space="preserve"> </w:t>
@@ -14907,7 +13032,31 @@
           <w:rPr>
             <w:rStyle w:val="Hyperlink"/>
           </w:rPr>
-          <w:t xml:space="preserve">Periostin- and podoplanin-positive cancer-associated fibroblast subtypes cooperate to shape the inflamed tumor microenvironment in aggressive pancreatic adenocarcinoma</w:t>
+          <w:t xml:space="preserve">A novel attention-mechanism based</w:t>
+        </w:r>
+        <w:r>
+          <w:rPr>
+            <w:rStyle w:val="Hyperlink"/>
+          </w:rPr>
+          <w:t xml:space="preserve"> </w:t>
+        </w:r>
+        <w:r>
+          <w:rPr>
+            <w:rStyle w:val="Hyperlink"/>
+          </w:rPr>
+          <w:t xml:space="preserve">Cox</w:t>
+        </w:r>
+        <w:r>
+          <w:rPr>
+            <w:rStyle w:val="Hyperlink"/>
+          </w:rPr>
+          <w:t xml:space="preserve"> </w:t>
+        </w:r>
+        <w:r>
+          <w:rPr>
+            <w:rStyle w:val="Hyperlink"/>
+          </w:rPr>
+          <w:t xml:space="preserve">survival model by exploiting pan-cancer empirical genomic information</w:t>
         </w:r>
       </w:hyperlink>
       <w:r>
@@ -14921,7 +13070,7 @@
           <w:iCs/>
           <w:i/>
         </w:rPr>
-        <w:t xml:space="preserve">The Journal of Pathology</w:t>
+        <w:t xml:space="preserve">Cells</w:t>
       </w:r>
       <w:r>
         <w:t xml:space="preserve"> </w:t>
@@ -14931,14 +13080,14 @@
           <w:bCs/>
           <w:b/>
         </w:rPr>
-        <w:t xml:space="preserve">258</w:t>
-      </w:r>
-      <w:r>
-        <w:t xml:space="preserve">, 408–425 (2022).</w:t>
+        <w:t xml:space="preserve">11</w:t>
+      </w:r>
+      <w:r>
+        <w:t xml:space="preserve">, 1421 (2022).</w:t>
       </w:r>
     </w:p>
     <w:bookmarkEnd w:id="130"/>
-    <w:bookmarkStart w:id="132" w:name="ref-lee2024tumorcaf"/>
+    <w:bookmarkStart w:id="132" w:name="ref-newman2019cibersortx"/>
     <w:p>
       <w:pPr>
         <w:pStyle w:val="Bibliography"/>
@@ -14953,7 +13102,7 @@
         <w:t xml:space="preserve">	</w:t>
       </w:r>
       <w:r>
-        <w:t xml:space="preserve">Lee, J. J.</w:t>
+        <w:t xml:space="preserve">Newman, A. M.</w:t>
       </w:r>
       <w:r>
         <w:t xml:space="preserve"> </w:t>
@@ -14973,7 +13122,7 @@
           <w:rPr>
             <w:rStyle w:val="Hyperlink"/>
           </w:rPr>
-          <w:t xml:space="preserve">Tumor-intrinsic and cancer-associated fibroblast subtypes independently predict outcomes in pancreatic cancer</w:t>
+          <w:t xml:space="preserve">Determining cell type abundance and expression from bulk tissues with digital cytometry</w:t>
         </w:r>
       </w:hyperlink>
       <w:r>
@@ -14987,7 +13136,7 @@
           <w:iCs/>
           <w:i/>
         </w:rPr>
-        <w:t xml:space="preserve">Annals of Surgery</w:t>
+        <w:t xml:space="preserve">Nature Biotechnology</w:t>
       </w:r>
       <w:r>
         <w:t xml:space="preserve"> </w:t>
@@ -14997,14 +13146,14 @@
           <w:bCs/>
           <w:b/>
         </w:rPr>
-        <w:t xml:space="preserve">280</w:t>
-      </w:r>
-      <w:r>
-        <w:t xml:space="preserve">, 659–666 (2024).</w:t>
+        <w:t xml:space="preserve">37</w:t>
+      </w:r>
+      <w:r>
+        <w:t xml:space="preserve">, 773–782 (2019).</w:t>
       </w:r>
     </w:p>
     <w:bookmarkEnd w:id="132"/>
-    <w:bookmarkStart w:id="134" w:name="ref-smith2020standard"/>
+    <w:bookmarkStart w:id="134" w:name="ref-chu2022bayesprism"/>
     <w:p>
       <w:pPr>
         <w:pStyle w:val="Bibliography"/>
@@ -15019,17 +13168,7 @@
         <w:t xml:space="preserve">	</w:t>
       </w:r>
       <w:r>
-        <w:t xml:space="preserve">Smith, A. M.</w:t>
-      </w:r>
-      <w:r>
-        <w:t xml:space="preserve"> </w:t>
-      </w:r>
-      <w:r>
-        <w:rPr>
-          <w:iCs/>
-          <w:i/>
-        </w:rPr>
-        <w:t xml:space="preserve">et al.</w:t>
+        <w:t xml:space="preserve">Chu, T., Wang, Z., Pe’er, D. &amp; Danko, C. G.</w:t>
       </w:r>
       <w:r>
         <w:t xml:space="preserve"> </w:t>
@@ -15039,7 +13178,79 @@
           <w:rPr>
             <w:rStyle w:val="Hyperlink"/>
           </w:rPr>
-          <w:t xml:space="preserve">Standard machine learning approaches outperform deep representation learning on phenotype prediction from transcriptomics data</w:t>
+          <w:t xml:space="preserve">Cell type and gene expression deconvolution with</w:t>
+        </w:r>
+        <w:r>
+          <w:rPr>
+            <w:rStyle w:val="Hyperlink"/>
+          </w:rPr>
+          <w:t xml:space="preserve"> </w:t>
+        </w:r>
+        <w:r>
+          <w:rPr>
+            <w:rStyle w:val="Hyperlink"/>
+          </w:rPr>
+          <w:t xml:space="preserve">BayesPrism</w:t>
+        </w:r>
+        <w:r>
+          <w:rPr>
+            <w:rStyle w:val="Hyperlink"/>
+          </w:rPr>
+          <w:t xml:space="preserve"> </w:t>
+        </w:r>
+        <w:r>
+          <w:rPr>
+            <w:rStyle w:val="Hyperlink"/>
+          </w:rPr>
+          <w:t xml:space="preserve">enables</w:t>
+        </w:r>
+        <w:r>
+          <w:rPr>
+            <w:rStyle w:val="Hyperlink"/>
+          </w:rPr>
+          <w:t xml:space="preserve"> </w:t>
+        </w:r>
+        <w:r>
+          <w:rPr>
+            <w:rStyle w:val="Hyperlink"/>
+          </w:rPr>
+          <w:t xml:space="preserve">Bayesian</w:t>
+        </w:r>
+        <w:r>
+          <w:rPr>
+            <w:rStyle w:val="Hyperlink"/>
+          </w:rPr>
+          <w:t xml:space="preserve"> </w:t>
+        </w:r>
+        <w:r>
+          <w:rPr>
+            <w:rStyle w:val="Hyperlink"/>
+          </w:rPr>
+          <w:t xml:space="preserve">integrative analysis across bulk and single-cell</w:t>
+        </w:r>
+        <w:r>
+          <w:rPr>
+            <w:rStyle w:val="Hyperlink"/>
+          </w:rPr>
+          <w:t xml:space="preserve"> </w:t>
+        </w:r>
+        <w:r>
+          <w:rPr>
+            <w:rStyle w:val="Hyperlink"/>
+          </w:rPr>
+          <w:t xml:space="preserve">RNA</w:t>
+        </w:r>
+        <w:r>
+          <w:rPr>
+            <w:rStyle w:val="Hyperlink"/>
+          </w:rPr>
+          <w:t xml:space="preserve"> </w:t>
+        </w:r>
+        <w:r>
+          <w:rPr>
+            <w:rStyle w:val="Hyperlink"/>
+          </w:rPr>
+          <w:t xml:space="preserve">sequencing in oncology</w:t>
         </w:r>
       </w:hyperlink>
       <w:r>
@@ -15053,7 +13264,7 @@
           <w:iCs/>
           <w:i/>
         </w:rPr>
-        <w:t xml:space="preserve">BMC Bioinformatics</w:t>
+        <w:t xml:space="preserve">Nature Cancer</w:t>
       </w:r>
       <w:r>
         <w:t xml:space="preserve"> </w:t>
@@ -15063,14 +13274,14 @@
           <w:bCs/>
           <w:b/>
         </w:rPr>
-        <w:t xml:space="preserve">21</w:t>
-      </w:r>
-      <w:r>
-        <w:t xml:space="preserve">, 119 (2020).</w:t>
+        <w:t xml:space="preserve">3</w:t>
+      </w:r>
+      <w:r>
+        <w:t xml:space="preserve">, 505–517 (2022).</w:t>
       </w:r>
     </w:p>
     <w:bookmarkEnd w:id="134"/>
-    <w:bookmarkStart w:id="136" w:name="ref-gaujoux2010flexible"/>
+    <w:bookmarkStart w:id="136" w:name="ref-ogawa2020stroma"/>
     <w:p>
       <w:pPr>
         <w:pStyle w:val="Bibliography"/>
@@ -15085,7 +13296,17 @@
         <w:t xml:space="preserve">	</w:t>
       </w:r>
       <w:r>
-        <w:t xml:space="preserve">Gaujoux, R. &amp; Seoighe, C.</w:t>
+        <w:t xml:space="preserve">Ogawa, Y.</w:t>
+      </w:r>
+      <w:r>
+        <w:t xml:space="preserve"> </w:t>
+      </w:r>
+      <w:r>
+        <w:rPr>
+          <w:iCs/>
+          <w:i/>
+        </w:rPr>
+        <w:t xml:space="preserve">et al.</w:t>
       </w:r>
       <w:r>
         <w:t xml:space="preserve"> </w:t>
@@ -15095,31 +13316,7 @@
           <w:rPr>
             <w:rStyle w:val="Hyperlink"/>
           </w:rPr>
-          <w:t xml:space="preserve">A flexible</w:t>
-        </w:r>
-        <w:r>
-          <w:rPr>
-            <w:rStyle w:val="Hyperlink"/>
-          </w:rPr>
-          <w:t xml:space="preserve"> </w:t>
-        </w:r>
-        <w:r>
-          <w:rPr>
-            <w:rStyle w:val="Hyperlink"/>
-          </w:rPr>
-          <w:t xml:space="preserve">R</w:t>
-        </w:r>
-        <w:r>
-          <w:rPr>
-            <w:rStyle w:val="Hyperlink"/>
-          </w:rPr>
-          <w:t xml:space="preserve"> </w:t>
-        </w:r>
-        <w:r>
-          <w:rPr>
-            <w:rStyle w:val="Hyperlink"/>
-          </w:rPr>
-          <w:t xml:space="preserve">package for nonnegative matrix factorization</w:t>
+          <w:t xml:space="preserve">Three distinct stroma types in human pancreatic cancer identified by image analysis of fibroblast subpopulations and collagen</w:t>
         </w:r>
       </w:hyperlink>
       <w:r>
@@ -15133,7 +13330,7 @@
           <w:iCs/>
           <w:i/>
         </w:rPr>
-        <w:t xml:space="preserve">BMC Bioinformatics</w:t>
+        <w:t xml:space="preserve">Clinical Cancer Research</w:t>
       </w:r>
       <w:r>
         <w:t xml:space="preserve"> </w:t>
@@ -15143,20 +13340,298 @@
           <w:bCs/>
           <w:b/>
         </w:rPr>
+        <w:t xml:space="preserve">27</w:t>
+      </w:r>
+      <w:r>
+        <w:t xml:space="preserve">, 107–119 (2021).</w:t>
+      </w:r>
+    </w:p>
+    <w:bookmarkEnd w:id="136"/>
+    <w:bookmarkStart w:id="138" w:name="ref-neuzillet2022periostin"/>
+    <w:p>
+      <w:pPr>
+        <w:pStyle w:val="Bibliography"/>
+      </w:pPr>
+      <w:r>
+        <w:t xml:space="preserve">39.</w:t>
+      </w:r>
+      <w:r>
+        <w:t xml:space="preserve"> </w:t>
+      </w:r>
+      <w:r>
+        <w:t xml:space="preserve">	</w:t>
+      </w:r>
+      <w:r>
+        <w:t xml:space="preserve">Neuzillet, C.</w:t>
+      </w:r>
+      <w:r>
+        <w:t xml:space="preserve"> </w:t>
+      </w:r>
+      <w:r>
+        <w:rPr>
+          <w:iCs/>
+          <w:i/>
+        </w:rPr>
+        <w:t xml:space="preserve">et al.</w:t>
+      </w:r>
+      <w:r>
+        <w:t xml:space="preserve"> </w:t>
+      </w:r>
+      <w:hyperlink r:id="rId137">
+        <w:r>
+          <w:rPr>
+            <w:rStyle w:val="Hyperlink"/>
+          </w:rPr>
+          <w:t xml:space="preserve">Periostin- and podoplanin-positive cancer-associated fibroblast subtypes cooperate to shape the inflamed tumor microenvironment in aggressive pancreatic adenocarcinoma</w:t>
+        </w:r>
+      </w:hyperlink>
+      <w:r>
+        <w:t xml:space="preserve">.</w:t>
+      </w:r>
+      <w:r>
+        <w:t xml:space="preserve"> </w:t>
+      </w:r>
+      <w:r>
+        <w:rPr>
+          <w:iCs/>
+          <w:i/>
+        </w:rPr>
+        <w:t xml:space="preserve">The Journal of Pathology</w:t>
+      </w:r>
+      <w:r>
+        <w:t xml:space="preserve"> </w:t>
+      </w:r>
+      <w:r>
+        <w:rPr>
+          <w:bCs/>
+          <w:b/>
+        </w:rPr>
+        <w:t xml:space="preserve">258</w:t>
+      </w:r>
+      <w:r>
+        <w:t xml:space="preserve">, 408–425 (2022).</w:t>
+      </w:r>
+    </w:p>
+    <w:bookmarkEnd w:id="138"/>
+    <w:bookmarkStart w:id="140" w:name="ref-lee2024tumorcaf"/>
+    <w:p>
+      <w:pPr>
+        <w:pStyle w:val="Bibliography"/>
+      </w:pPr>
+      <w:r>
+        <w:t xml:space="preserve">40.</w:t>
+      </w:r>
+      <w:r>
+        <w:t xml:space="preserve"> </w:t>
+      </w:r>
+      <w:r>
+        <w:t xml:space="preserve">	</w:t>
+      </w:r>
+      <w:r>
+        <w:t xml:space="preserve">Lee, J. J.</w:t>
+      </w:r>
+      <w:r>
+        <w:t xml:space="preserve"> </w:t>
+      </w:r>
+      <w:r>
+        <w:rPr>
+          <w:iCs/>
+          <w:i/>
+        </w:rPr>
+        <w:t xml:space="preserve">et al.</w:t>
+      </w:r>
+      <w:r>
+        <w:t xml:space="preserve"> </w:t>
+      </w:r>
+      <w:hyperlink r:id="rId139">
+        <w:r>
+          <w:rPr>
+            <w:rStyle w:val="Hyperlink"/>
+          </w:rPr>
+          <w:t xml:space="preserve">Tumor-intrinsic and cancer-associated fibroblast subtypes independently predict outcomes in pancreatic cancer</w:t>
+        </w:r>
+      </w:hyperlink>
+      <w:r>
+        <w:t xml:space="preserve">.</w:t>
+      </w:r>
+      <w:r>
+        <w:t xml:space="preserve"> </w:t>
+      </w:r>
+      <w:r>
+        <w:rPr>
+          <w:iCs/>
+          <w:i/>
+        </w:rPr>
+        <w:t xml:space="preserve">Annals of Surgery</w:t>
+      </w:r>
+      <w:r>
+        <w:t xml:space="preserve"> </w:t>
+      </w:r>
+      <w:r>
+        <w:rPr>
+          <w:bCs/>
+          <w:b/>
+        </w:rPr>
+        <w:t xml:space="preserve">280</w:t>
+      </w:r>
+      <w:r>
+        <w:t xml:space="preserve">, 659–666 (2024).</w:t>
+      </w:r>
+    </w:p>
+    <w:bookmarkEnd w:id="140"/>
+    <w:bookmarkStart w:id="142" w:name="ref-smith2020standard"/>
+    <w:p>
+      <w:pPr>
+        <w:pStyle w:val="Bibliography"/>
+      </w:pPr>
+      <w:r>
+        <w:t xml:space="preserve">41.</w:t>
+      </w:r>
+      <w:r>
+        <w:t xml:space="preserve"> </w:t>
+      </w:r>
+      <w:r>
+        <w:t xml:space="preserve">	</w:t>
+      </w:r>
+      <w:r>
+        <w:t xml:space="preserve">Smith, A. M.</w:t>
+      </w:r>
+      <w:r>
+        <w:t xml:space="preserve"> </w:t>
+      </w:r>
+      <w:r>
+        <w:rPr>
+          <w:iCs/>
+          <w:i/>
+        </w:rPr>
+        <w:t xml:space="preserve">et al.</w:t>
+      </w:r>
+      <w:r>
+        <w:t xml:space="preserve"> </w:t>
+      </w:r>
+      <w:hyperlink r:id="rId141">
+        <w:r>
+          <w:rPr>
+            <w:rStyle w:val="Hyperlink"/>
+          </w:rPr>
+          <w:t xml:space="preserve">Standard machine learning approaches outperform deep representation learning on phenotype prediction from transcriptomics data</w:t>
+        </w:r>
+      </w:hyperlink>
+      <w:r>
+        <w:t xml:space="preserve">.</w:t>
+      </w:r>
+      <w:r>
+        <w:t xml:space="preserve"> </w:t>
+      </w:r>
+      <w:r>
+        <w:rPr>
+          <w:iCs/>
+          <w:i/>
+        </w:rPr>
+        <w:t xml:space="preserve">BMC Bioinformatics</w:t>
+      </w:r>
+      <w:r>
+        <w:t xml:space="preserve"> </w:t>
+      </w:r>
+      <w:r>
+        <w:rPr>
+          <w:bCs/>
+          <w:b/>
+        </w:rPr>
+        <w:t xml:space="preserve">21</w:t>
+      </w:r>
+      <w:r>
+        <w:t xml:space="preserve">, 119 (2020).</w:t>
+      </w:r>
+    </w:p>
+    <w:bookmarkEnd w:id="142"/>
+    <w:bookmarkStart w:id="144" w:name="ref-gaujoux2010flexible"/>
+    <w:p>
+      <w:pPr>
+        <w:pStyle w:val="Bibliography"/>
+      </w:pPr>
+      <w:r>
+        <w:t xml:space="preserve">42.</w:t>
+      </w:r>
+      <w:r>
+        <w:t xml:space="preserve"> </w:t>
+      </w:r>
+      <w:r>
+        <w:t xml:space="preserve">	</w:t>
+      </w:r>
+      <w:r>
+        <w:t xml:space="preserve">Gaujoux, R. &amp; Seoighe, C.</w:t>
+      </w:r>
+      <w:r>
+        <w:t xml:space="preserve"> </w:t>
+      </w:r>
+      <w:hyperlink r:id="rId143">
+        <w:r>
+          <w:rPr>
+            <w:rStyle w:val="Hyperlink"/>
+          </w:rPr>
+          <w:t xml:space="preserve">A flexible</w:t>
+        </w:r>
+        <w:r>
+          <w:rPr>
+            <w:rStyle w:val="Hyperlink"/>
+          </w:rPr>
+          <w:t xml:space="preserve"> </w:t>
+        </w:r>
+        <w:r>
+          <w:rPr>
+            <w:rStyle w:val="Hyperlink"/>
+          </w:rPr>
+          <w:t xml:space="preserve">R</w:t>
+        </w:r>
+        <w:r>
+          <w:rPr>
+            <w:rStyle w:val="Hyperlink"/>
+          </w:rPr>
+          <w:t xml:space="preserve"> </w:t>
+        </w:r>
+        <w:r>
+          <w:rPr>
+            <w:rStyle w:val="Hyperlink"/>
+          </w:rPr>
+          <w:t xml:space="preserve">package for nonnegative matrix factorization</w:t>
+        </w:r>
+      </w:hyperlink>
+      <w:r>
+        <w:t xml:space="preserve">.</w:t>
+      </w:r>
+      <w:r>
+        <w:t xml:space="preserve"> </w:t>
+      </w:r>
+      <w:r>
+        <w:rPr>
+          <w:iCs/>
+          <w:i/>
+        </w:rPr>
+        <w:t xml:space="preserve">BMC Bioinformatics</w:t>
+      </w:r>
+      <w:r>
+        <w:t xml:space="preserve"> </w:t>
+      </w:r>
+      <w:r>
+        <w:rPr>
+          <w:bCs/>
+          <w:b/>
+        </w:rPr>
         <w:t xml:space="preserve">11</w:t>
       </w:r>
       <w:r>
         <w:t xml:space="preserve">, 367 (2010).</w:t>
       </w:r>
     </w:p>
-    <w:bookmarkEnd w:id="136"/>
-    <w:bookmarkStart w:id="138" w:name="ref-data_tcga_paad"/>
+    <w:bookmarkEnd w:id="144"/>
+    <w:bookmarkStart w:id="146" w:name="ref-data_tcga_paad"/>
     <w:p>
       <w:pPr>
         <w:pStyle w:val="Bibliography"/>
       </w:pPr>
       <w:r>
-        <w:t xml:space="preserve">39.</w:t>
+        <w:t xml:space="preserve">43.</w:t>
       </w:r>
       <w:r>
         <w:t xml:space="preserve"> </w:t>
@@ -15170,7 +13645,7 @@
       <w:r>
         <w:t xml:space="preserve"> </w:t>
       </w:r>
-      <w:hyperlink r:id="rId137">
+      <w:hyperlink r:id="rId145">
         <w:r>
           <w:rPr>
             <w:rStyle w:val="Hyperlink"/>
@@ -15206,14 +13681,14 @@
         <w:t xml:space="preserve">. (2017).</w:t>
       </w:r>
     </w:p>
-    <w:bookmarkEnd w:id="138"/>
-    <w:bookmarkStart w:id="140" w:name="ref-data_cptac3"/>
+    <w:bookmarkEnd w:id="146"/>
+    <w:bookmarkStart w:id="148" w:name="ref-data_cptac3"/>
     <w:p>
       <w:pPr>
         <w:pStyle w:val="Bibliography"/>
       </w:pPr>
       <w:r>
-        <w:t xml:space="preserve">40.</w:t>
+        <w:t xml:space="preserve">44.</w:t>
       </w:r>
       <w:r>
         <w:t xml:space="preserve"> </w:t>
@@ -15227,7 +13702,7 @@
       <w:r>
         <w:t xml:space="preserve"> </w:t>
       </w:r>
-      <w:hyperlink r:id="rId139">
+      <w:hyperlink r:id="rId147">
         <w:r>
           <w:rPr>
             <w:rStyle w:val="Hyperlink"/>
@@ -15239,14 +13714,14 @@
         <w:t xml:space="preserve">. (2019).</w:t>
       </w:r>
     </w:p>
-    <w:bookmarkEnd w:id="140"/>
-    <w:bookmarkStart w:id="142" w:name="ref-data_dijk_emtab6830"/>
+    <w:bookmarkEnd w:id="148"/>
+    <w:bookmarkStart w:id="150" w:name="ref-data_dijk_emtab6830"/>
     <w:p>
       <w:pPr>
         <w:pStyle w:val="Bibliography"/>
       </w:pPr>
       <w:r>
-        <w:t xml:space="preserve">41.</w:t>
+        <w:t xml:space="preserve">45.</w:t>
       </w:r>
       <w:r>
         <w:t xml:space="preserve"> </w:t>
@@ -15270,7 +13745,7 @@
       <w:r>
         <w:t xml:space="preserve"> </w:t>
       </w:r>
-      <w:hyperlink r:id="rId141">
+      <w:hyperlink r:id="rId149">
         <w:r>
           <w:rPr>
             <w:rStyle w:val="Hyperlink"/>
@@ -15294,14 +13769,14 @@
         <w:t xml:space="preserve">. (2020).</w:t>
       </w:r>
     </w:p>
-    <w:bookmarkEnd w:id="142"/>
-    <w:bookmarkStart w:id="144" w:name="ref-data_puleo_emtab6134"/>
+    <w:bookmarkEnd w:id="150"/>
+    <w:bookmarkStart w:id="152" w:name="ref-data_puleo_emtab6134"/>
     <w:p>
       <w:pPr>
         <w:pStyle w:val="Bibliography"/>
       </w:pPr>
       <w:r>
-        <w:t xml:space="preserve">42.</w:t>
+        <w:t xml:space="preserve">46.</w:t>
       </w:r>
       <w:r>
         <w:t xml:space="preserve"> </w:t>
@@ -15325,7 +13800,7 @@
       <w:r>
         <w:t xml:space="preserve"> </w:t>
       </w:r>
-      <w:hyperlink r:id="rId143">
+      <w:hyperlink r:id="rId151">
         <w:r>
           <w:rPr>
             <w:rStyle w:val="Hyperlink"/>
@@ -15349,14 +13824,14 @@
         <w:t xml:space="preserve">. (2018).</w:t>
       </w:r>
     </w:p>
-    <w:bookmarkEnd w:id="144"/>
-    <w:bookmarkStart w:id="146" w:name="ref-data_moffitt_gse71729"/>
+    <w:bookmarkEnd w:id="152"/>
+    <w:bookmarkStart w:id="154" w:name="ref-data_moffitt_gse71729"/>
     <w:p>
       <w:pPr>
         <w:pStyle w:val="Bibliography"/>
       </w:pPr>
       <w:r>
-        <w:t xml:space="preserve">43.</w:t>
+        <w:t xml:space="preserve">47.</w:t>
       </w:r>
       <w:r>
         <w:t xml:space="preserve"> </w:t>
@@ -15380,7 +13855,7 @@
       <w:r>
         <w:t xml:space="preserve"> </w:t>
       </w:r>
-      <w:hyperlink r:id="rId145">
+      <w:hyperlink r:id="rId153">
         <w:r>
           <w:rPr>
             <w:rStyle w:val="Hyperlink"/>
@@ -15404,14 +13879,14 @@
         <w:t xml:space="preserve">. (2015).</w:t>
       </w:r>
     </w:p>
-    <w:bookmarkEnd w:id="146"/>
-    <w:bookmarkStart w:id="148" w:name="ref-data_paca_au_egas"/>
+    <w:bookmarkEnd w:id="154"/>
+    <w:bookmarkStart w:id="156" w:name="ref-data_paca_au_egas"/>
     <w:p>
       <w:pPr>
         <w:pStyle w:val="Bibliography"/>
       </w:pPr>
       <w:r>
-        <w:t xml:space="preserve">44.</w:t>
+        <w:t xml:space="preserve">48.</w:t>
       </w:r>
       <w:r>
         <w:t xml:space="preserve"> </w:t>
@@ -15425,7 +13900,7 @@
       <w:r>
         <w:t xml:space="preserve"> </w:t>
       </w:r>
-      <w:hyperlink r:id="rId147">
+      <w:hyperlink r:id="rId155">
         <w:r>
           <w:rPr>
             <w:rStyle w:val="Hyperlink"/>
@@ -15437,9 +13912,9 @@
         <w:t xml:space="preserve">. (2016).</w:t>
       </w:r>
     </w:p>
-    <w:bookmarkEnd w:id="148"/>
-    <w:bookmarkEnd w:id="149"/>
-    <w:bookmarkEnd w:id="150"/>
+    <w:bookmarkEnd w:id="156"/>
+    <w:bookmarkEnd w:id="157"/>
+    <w:bookmarkEnd w:id="158"/>
     <w:sectPr/>
   </w:body>
 </w:document>

</xml_diff>

<commit_message>
Methods and SI: evaluate the final hyperparameter configuration under the BO cross-validation protocol
The one-SE rule selected k = 3 but alpha, lambda, xi and n_top were inherited
from the overall best (k = 7) configuration, so the fitted combination was
never evaluated during Bayesian optimization. code/29_final_config_cv.R
re-evaluates the overall best, the best k = 3 and the final configuration
with the identical evaluator (desurv_cv, seed 123, 5 folds stratified by
event and cohort, 30 starts). Same-build C-indices 0.655 / 0.647 / 0.642;
the final configuration sits 0.002 below the recomputed one-SE threshold.
Methods states this outright with all values inline from the cached object;
new Supplementary Table tab:final-config-cv. Model and every published
number unchanged. Guards pass.

Co-Authored-By: Claude Fable 5.1 <noreply@anthropic.com>
Claude-Session: https://claude.ai/code/session_01UmC5VGiZgLLFSQibZmMyH7
</commit_message>
<xml_diff>
--- a/paper/paper.docx
+++ b/paper/paper.docx
@@ -8512,7 +8512,7 @@
         <w:t xml:space="preserve"> </w:t>
       </w:r>
       <w:r>
-        <w:t xml:space="preserve">were selected by maximizing the cross-validated Harrell C-index using Bayesian optimization (BO)</w:t>
+        <w:t xml:space="preserve">were explored by Bayesian optimization (BO) maximizing the cross-validated Harrell C-index</w:t>
       </w:r>
       <w:hyperlink w:anchor="ref-snoek2012practical">
         <w:r>
@@ -8539,7 +8539,7 @@
         </w:r>
       </w:hyperlink>
       <w:r>
-        <w:t xml:space="preserve">. The objective was the mean 5-fold cross-validated C-index, with folds constructed separately within each training cohort and stratified by event status under a fixed seed (123). Each configuration was evaluated from 30 random initializations at the cross-validation stopping tolerance</w:t>
+        <w:t xml:space="preserve">, and the reported configuration was then fixed by applying a one-standard-error rule on rank to the resulting search history, as specified below. The objective was the mean 5-fold cross-validated C-index, with folds constructed separately within each training cohort and stratified by event status under a fixed seed (123). Each configuration was evaluated from 30 random initializations at the cross-validation stopping tolerance</w:t>
       </w:r>
       <w:r>
         <w:t xml:space="preserve"> </w:t>
@@ -8579,7 +8579,7 @@
         <w:t xml:space="preserve"> </w:t>
       </w:r>
       <w:r>
-        <w:t xml:space="preserve">was chosen by a one-standard-error rule: for each rank, the Bayesian-optimization configuration with the highest observed mean cross-validated C-index was retained, the threshold was set one fold-level standard error below the best observed configuration’s mean, and the smallest rank whose retained configuration met the threshold was selected; the remaining hyperparameters were those of the best observed configuration (Supplementary Information, Bayesian Optimization). The best observed configuration had mean cross-validated C-index 0.655 (fold-level SE 0.011) at</w:t>
+        <w:t xml:space="preserve">was chosen by a one-standard-error rule: for each rank, the Bayesian-optimization configuration with the highest observed mean cross-validated C-index was retained, the threshold was set one fold-level standard error below the best observed configuration’s mean, and the smallest rank whose retained configuration met the threshold was selected (Supplementary Information, Bayesian Optimization). The best observed configuration had mean cross-validated C-index 0.655 (fold-level SE 0.011) at</w:t>
       </w:r>
       <w:r>
         <w:t xml:space="preserve"> </w:t>
@@ -8622,7 +8622,73 @@
         <w:t xml:space="preserve"> </w:t>
       </w:r>
       <w:r>
-        <w:t xml:space="preserve">reached 0.646 and was therefore eligible. All model selection was performed entirely within the training data using cross-validation; no validation cohort data were used during any stage of tuning, and out-of-sample generalization was assessed only on the external validation cohorts. The consensus initialization described next was used only for the final model and is not reproduced within each fold.</w:t>
+        <w:t xml:space="preserve">reached 0.646 and was therefore eligible. The remaining hyperparameters were inherited from the overall best observed configuration, which had rank</w:t>
+      </w:r>
+      <w:r>
+        <w:t xml:space="preserve"> </w:t>
+      </w:r>
+      <m:oMath>
+        <m:r>
+          <m:t>k</m:t>
+        </m:r>
+        <m:r>
+          <m:rPr>
+            <m:sty m:val="p"/>
+          </m:rPr>
+          <m:t>=</m:t>
+        </m:r>
+        <m:r>
+          <m:t>7</m:t>
+        </m:r>
+      </m:oMath>
+      <w:r>
+        <w:t xml:space="preserve">, so the resulting final</w:t>
+      </w:r>
+      <w:r>
+        <w:t xml:space="preserve"> </w:t>
+      </w:r>
+      <m:oMath>
+        <m:r>
+          <m:t>k</m:t>
+        </m:r>
+        <m:r>
+          <m:rPr>
+            <m:sty m:val="p"/>
+          </m:rPr>
+          <m:t>=</m:t>
+        </m:r>
+        <m:r>
+          <m:t>3</m:t>
+        </m:r>
+      </m:oMath>
+      <w:r>
+        <w:t xml:space="preserve"> </w:t>
+      </w:r>
+      <w:r>
+        <w:t xml:space="preserve">combination was not itself among the configurations evaluated during Bayesian optimization. We therefore evaluated this exact combination afterward using the identical cross-validation protocol. Re-evaluated together under the current software build, the final configuration achieved a mean cross-validated C-index of 0.642 (fold-level SE 0.007), compared with 0.655 (0.011) for the overall best configuration and 0.647 (0.009) for the best</w:t>
+      </w:r>
+      <w:r>
+        <w:t xml:space="preserve"> </w:t>
+      </w:r>
+      <m:oMath>
+        <m:r>
+          <m:t>k</m:t>
+        </m:r>
+        <m:r>
+          <m:rPr>
+            <m:sty m:val="p"/>
+          </m:rPr>
+          <m:t>=</m:t>
+        </m:r>
+        <m:r>
+          <m:t>3</m:t>
+        </m:r>
+      </m:oMath>
+      <w:r>
+        <w:t xml:space="preserve"> </w:t>
+      </w:r>
+      <w:r>
+        <w:t xml:space="preserve">configuration. The recomputed one-standard-error threshold was 0.644, placing the final configuration 0.002 below that threshold (Supplementary Table [tab:final-config-cv]). All model selection was performed entirely within the training data using cross-validation; no validation cohort data were used during any stage of tuning, and out-of-sample generalization was assessed only on the external validation cohorts. The consensus initialization described next was used only for the final model and is not reproduced within each fold.</w:t>
       </w:r>
     </w:p>
     <w:p>

</xml_diff>

<commit_message>
Main text and cover letter: resolve the abstract adjusted-HR and Fig. 4 legend contradictions, trim to 3,998 words, re-date the cover letter
- Abstract now reports the PurIST/DeCAF-adjusted risk-score HR (1.28,
  1.11-1.47) next to the unadjusted 1.42 instead of implying one estimate
  covers both.
- Fig. 4 legend closes with the same 'exploratory, no differential
  treatment benefit' statement as the Results paragraph.
- Discussion tightened by 76 words (redundant recap of adjustment results,
  duplicated pan-cancer caveat, filler); no claim added or removed.
- Cover letter dated 17 September 2026 and carries the current title.
- PDFs, DOCX and figure assets regenerated; scripts/guards.sh passes
  (main text 3,998 / 4,000; abstract 140 words; 0 unresolved refs).

Co-Authored-By: Claude Fable 5.1 <noreply@anthropic.com>
Claude-Session: https://claude.ai/code/session_01UmC5VGiZgLLFSQibZmMyH7
</commit_message>
<xml_diff>
--- a/paper/paper.docx
+++ b/paper/paper.docx
@@ -659,13 +659,43 @@
         <w:t xml:space="preserve"> </w:t>
       </w:r>
       <w:r>
-        <w:t xml:space="preserve">1.26–1.59)</w:t>
-      </w:r>
-      <w:r>
-        <w:t xml:space="preserve"> </w:t>
-      </w:r>
-      <w:r>
-        <w:t xml:space="preserve">before</w:t>
+        <w:t xml:space="preserve">1.26–1.59;</w:t>
+      </w:r>
+      <w:r>
+        <w:t xml:space="preserve"> </w:t>
+      </w:r>
+      <w:r>
+        <w:t xml:space="preserve">1.28,</w:t>
+      </w:r>
+      <w:r>
+        <w:t xml:space="preserve"> </w:t>
+      </w:r>
+      <w:r>
+        <w:t xml:space="preserve">95%</w:t>
+      </w:r>
+      <w:r>
+        <w:t xml:space="preserve"> </w:t>
+      </w:r>
+      <w:r>
+        <w:t xml:space="preserve">CI</w:t>
+      </w:r>
+      <w:r>
+        <w:t xml:space="preserve"> </w:t>
+      </w:r>
+      <w:r>
+        <w:t xml:space="preserve">1.11–1.47</w:t>
+      </w:r>
+      <w:r>
+        <w:t xml:space="preserve"> </w:t>
+      </w:r>
+      <w:r>
+        <w:t xml:space="preserve">after</w:t>
+      </w:r>
+      <w:r>
+        <w:t xml:space="preserve"> </w:t>
+      </w:r>
+      <w:r>
+        <w:t xml:space="preserve">PurIST</w:t>
       </w:r>
       <w:r>
         <w:t xml:space="preserve"> </w:t>
@@ -677,31 +707,13 @@
         <w:t xml:space="preserve"> </w:t>
       </w:r>
       <w:r>
-        <w:t xml:space="preserve">after</w:t>
-      </w:r>
-      <w:r>
-        <w:t xml:space="preserve"> </w:t>
-      </w:r>
-      <w:r>
-        <w:t xml:space="preserve">PurIST</w:t>
-      </w:r>
-      <w:r>
-        <w:t xml:space="preserve"> </w:t>
-      </w:r>
-      <w:r>
-        <w:t xml:space="preserve">and</w:t>
-      </w:r>
-      <w:r>
-        <w:t xml:space="preserve"> </w:t>
-      </w:r>
-      <w:r>
         <w:t xml:space="preserve">DeCAF</w:t>
       </w:r>
       <w:r>
         <w:t xml:space="preserve"> </w:t>
       </w:r>
       <w:r>
-        <w:t xml:space="preserve">adjustment.</w:t>
+        <w:t xml:space="preserve">adjustment).</w:t>
       </w:r>
       <w:r>
         <w:t xml:space="preserve"> </w:t>
@@ -4415,7 +4427,7 @@
           <w:iCs/>
           <w:i/>
         </w:rPr>
-        <w:t xml:space="preserve">). Because treatment, stage and cohort were not independently varied, these analyses support transportability rather than treatment-predictive effects.</w:t>
+        <w:t xml:space="preserve">). Because treatment, stage and cohort were not independently varied, these analyses are exploratory and do not establish differential treatment benefit.</w:t>
       </w:r>
     </w:p>
     <w:bookmarkEnd w:id="36"/>
@@ -5312,7 +5324,7 @@
         <w:pStyle w:val="FirstParagraph"/>
       </w:pPr>
       <w:r>
-        <w:t xml:space="preserve">DeSurv allows patient survival to shape gene-program discovery, yielding a tumor–stroma architecture that connects prognostic information with interpretable malignant and stromal programs. In PDAC, the architecture comprised a dominant survival-aligned program, D1, characterized by coordinated cross-patient variation in classical tumor and restCAF-like stromal features, alongside separately resolved proCAF-like stromal and basal-like tumor programs. D1 remained prognostic after adjustment for the established PurIST and DeCAF classifications. The frozen programs then transferred without refitting across four independent external patient cohorts.</w:t>
+        <w:t xml:space="preserve">DeSurv allows patient survival to shape gene-program discovery, yielding a tumor–stroma architecture that connects prognostic information with interpretable malignant and stromal programs. In PDAC, the architecture comprised a dominant survival-aligned program, D1, characterized by coordinated cross-patient variation in classical tumor and restCAF-like stromal features, alongside separately resolved proCAF-like stromal and basal-like tumor programs. D1 remained prognostic after adjustment for the established PurIST and DeCAF classifications. The frozen programs transferred without refitting to four independent external cohorts.</w:t>
       </w:r>
     </w:p>
     <w:p>
@@ -5340,7 +5352,7 @@
         </m:r>
       </m:oMath>
       <w:r>
-        <w:t xml:space="preserve">, matched to DeSurv on rank and tuning budget, did not recover D1, so the difference in the recovered programs did not appear to reflect rank or tuning effort. A rank-optimized unsupervised control recovered comparable prognostic information across a broader seven-factor representation, and conventional supervised predictors achieved similar discrimination while combining contributions from underlying expression programs within single scores. These comparisons separate prognostic information from the representation in which that information is recovered. DeSurv instead retains the contributing sources as separately scored programs rather than combining them only within a composite prognostic predictor.</w:t>
+        <w:t xml:space="preserve">, matched to DeSurv on rank and tuning budget, did not recover D1, so the difference in the recovered programs did not appear to reflect rank or tuning effort. A rank-optimized unsupervised control recovered comparable prognostic information across a broader seven-factor representation, and conventional supervised predictors achieved similar discrimination while combining contributions from underlying expression programs within single scores. These comparisons separate prognostic information from the representation in which it is recovered. DeSurv retains the contributing sources as separately scored programs rather than combining them within a composite predictor.</w:t>
       </w:r>
     </w:p>
     <w:p>
@@ -5389,7 +5401,7 @@
         </w:r>
       </w:hyperlink>
       <w:r>
-        <w:t xml:space="preserve">. In DeSurv, it depends directly on projections through the gene-program matrix, and new samples are scored using fixed gene weights without an additional sample-loading estimation step (Supplementary Table [tab:architecture]). Deep latent-variable survival models</w:t>
+        <w:t xml:space="preserve">. In DeSurv, it depends directly on projections through the gene-program matrix, and new samples are scored with fixed gene weights without a sample-loading estimation step (Supplementary Table [tab:architecture]). Deep latent-variable survival models</w:t>
       </w:r>
       <w:hyperlink w:anchor="ref-zaccaria2023surviae">
         <w:r>
@@ -5449,7 +5461,7 @@
         <w:t xml:space="preserve"> </w:t>
       </w:r>
       <w:r>
-        <w:t xml:space="preserve">estimate the abundance of predefined cell types rather than outcome-aligned programs, so DeSurv is complementary to them.</w:t>
+        <w:t xml:space="preserve">estimate the abundance of predefined cell types rather than outcome-aligned programs and are complementary to DeSurv.</w:t>
       </w:r>
     </w:p>
     <w:p>
@@ -5457,7 +5469,7 @@
         <w:pStyle w:val="BodyText"/>
       </w:pPr>
       <w:r>
-        <w:t xml:space="preserve">Program-level outputs are the practical product of this architecture, because the genes defining each program determine how it can be interpreted and what can be tested next. Previous PDAC studies illustrate how interpretable malignant and stromal programs can support biological characterization and the development of single-sample classifiers</w:t>
+        <w:t xml:space="preserve">Program-level outputs are the practical product of this architecture, because the genes defining each program determine its interpretation and what can be tested next. Previous PDAC studies illustrate how interpretable malignant and stromal programs can support biological characterization and single-sample classifiers</w:t>
       </w:r>
       <w:hyperlink w:anchor="ref-moffitt2015virtual">
         <w:r>
@@ -5499,7 +5511,7 @@
         </w:r>
       </w:hyperlink>
       <w:r>
-        <w:t xml:space="preserve">. DeSurv extends this line of work by allowing patient outcomes to influence the gene weights themselves while retaining separately measurable programs: for example, D2 remains available as proCAF-like stromal context although the fitted risk score combines D1 and D3. In settings without established molecular annotations, the ranked genes defining each recovered program could instead provide the starting point for biological annotation, subtype development and reduced biomarker assays. These outputs do not yet establish clinical utility or a treatment-selection rule.</w:t>
+        <w:t xml:space="preserve">. DeSurv extends this line of work by allowing patient outcomes to influence the gene weights themselves while retaining separately measurable programs: for example, D2 remains available as proCAF-like stromal context although the fitted risk score combines D1 and D3. Where molecular annotations are lacking, the ranked genes defining each program could seed biological annotation, subtype development and reduced biomarker assays. These outputs do not yet establish clinical utility or a treatment-selection rule.</w:t>
       </w:r>
     </w:p>
     <w:p>
@@ -5507,7 +5519,7 @@
         <w:pStyle w:val="BodyText"/>
       </w:pPr>
       <w:r>
-        <w:t xml:space="preserve">Rank choice and initialization can affect the recovered gene programs. Increasing rank progressively broadened correspondence to established PDAC programs. The three-factor DeSurv solution and the seven-factor unsupervised control were selected by the same one-standard-error rule. Survival supervision provides an outcome-informed criterion for shaping the representation, but it does not remove the non-uniqueness of matrix factorization, and individual DeSurv runs from different random starts recover appreciably different gene sets. Split-half consensus fits agreed closely with the reported basis (Supplementary Information, Stability of the recovered gene programs), supporting stability to restart-pool composition within the training data but not establishing reproducibility under independent repetition or patient resampling.</w:t>
+        <w:t xml:space="preserve">Rank choice and initialization can affect the recovered gene programs. Increasing rank progressively broadened correspondence to established PDAC programs. The three-factor DeSurv solution and the seven-factor unsupervised control were selected by the same one-standard-error rule. Survival supervision provides an outcome-informed criterion for shaping the representation but does not remove the non-uniqueness of matrix factorization, and individual runs from different random starts recover appreciably different gene sets. Split-half consensus fits agreed closely with the reported basis (Supplementary Information, Stability of the recovered gene programs), supporting stability to restart-pool composition within the training data but not establishing reproducibility under independent repetition or patient resampling.</w:t>
       </w:r>
     </w:p>
     <w:p>
@@ -5515,7 +5527,7 @@
         <w:pStyle w:val="BodyText"/>
       </w:pPr>
       <w:r>
-        <w:t xml:space="preserve">The simulations identify conditions under which survival information improves program recovery. They provide a controlled example in which survival supervision prioritizes prognostically relevant programs that contribute relatively little expression variation and are therefore less readily recovered by reconstruction-driven factorization.</w:t>
+        <w:t xml:space="preserve">The simulations identify conditions under which survival information improves program recovery. They provide a controlled example in which survival supervision prioritizes prognostically relevant programs that contribute little expression variation and are therefore less readily recovered by reconstruction-driven factorization.</w:t>
       </w:r>
     </w:p>
     <w:p>
@@ -5523,7 +5535,7 @@
         <w:pStyle w:val="BodyText"/>
       </w:pPr>
       <w:r>
-        <w:t xml:space="preserve">Three statistical qualifications limit interpretation of the prognostic findings. DeSurv uses a proportional-hazards objective, while the external validation data showed attenuation of the prognostic association over follow-up (Schoenfeld test, Results), so the reported hazard ratios are time-averaged summaries and extensions could accommodate non-proportional hazards or nonlinear survival relationships. The integrated Brier analysis recalibrated the score’s scalar slope and baseline hazard within each validation dataset, so it describes apparent prediction error rather than out-of-sample prediction error (Supplementary Information, Proper-scoring sensitivity of the external validation). The pooled training objective was fitted without a cohort term; within-cohort analyses argued against simple encoding of training-cohort membership, although cohort influence on the learned representation remains possible (Supplementary Information, Cohort handling in the training objective).</w:t>
+        <w:t xml:space="preserve">Three statistical qualifications limit interpretation of the prognostic findings. DeSurv uses a proportional-hazards objective, while the external validation data showed attenuation of the prognostic association over follow-up (Schoenfeld test, Results), so the reported hazard ratios are time-averaged summaries and extensions could accommodate non-proportional or nonlinear hazards. The integrated Brier analysis recalibrated the score’s scalar slope and baseline hazard within each validation dataset, so it describes apparent prediction error rather than out-of-sample error (Supplementary Information, Proper-scoring sensitivity of the external validation). The pooled training objective was fitted without a cohort term; within-cohort analyses argued against simple encoding of training-cohort membership, although cohort influence on the learned representation remains possible (Supplementary Information, Cohort handling in the training objective).</w:t>
       </w:r>
     </w:p>
     <w:p>
@@ -5531,7 +5543,7 @@
         <w:pStyle w:val="BodyText"/>
       </w:pPr>
       <w:r>
-        <w:t xml:space="preserve">In treated cohorts the frozen scores remained informative in exploratory analyses, but arm-level sample sizes limited assessment of variation in the association across treatments. Whether these programs predict differential treatment benefit therefore remains unresolved and will require adequately powered, prespecified treatment-by-program interaction analyses in studies designed to support treatment comparisons.</w:t>
+        <w:t xml:space="preserve">In treated cohorts the frozen scores remained informative in exploratory analyses, but arm-level sample sizes limited assessment of variation across treatments. Whether these programs predict differential treatment benefit therefore remains unresolved and will require adequately powered, prespecified treatment-by-program interaction analyses.</w:t>
       </w:r>
     </w:p>
     <w:p>
@@ -5539,7 +5551,7 @@
         <w:pStyle w:val="BodyText"/>
       </w:pPr>
       <w:r>
-        <w:t xml:space="preserve">The tumor–stroma architecture described here is a bulk-tissue phenomenon. It reflects cross-patient covariation in tumor- and stroma-associated transcriptional programs rather than cellular co-expression or spatial adjacency within individual tumors. This organization is consistent with broader evidence that malignant lineage state and stromal composition vary together in PDAC</w:t>
+        <w:t xml:space="preserve">The tumor–stroma architecture described here is a bulk-tissue phenomenon. It reflects cross-patient covariation in tumor- and stroma-associated transcriptional programs rather than cellular co-expression or spatial adjacency within individual tumors. This is consistent with broader evidence that malignant lineage state and stromal composition vary together in PDAC</w:t>
       </w:r>
       <w:hyperlink w:anchor="ref-ogawa2020stroma">
         <w:r>
@@ -5566,7 +5578,7 @@
         </w:r>
       </w:hyperlink>
       <w:r>
-        <w:t xml:space="preserve">. Adjustment for PurIST and DeCAF supports D1’s prognostic association beyond those classifiers, purity adjustment in the PACA-AU datasets leaves the risk score’s association essentially unchanged, and other supervised methods capture related survival-associated signal. GATA6 RNA in situ hybridization independently supports D1’s classical tumor component; these analyses do not establish the cellular identity of its stromal component. Single-cell or spatial profiling could clarify the cellular sources of these programs; linking those sources to prognosis would additionally require outcome-annotated cohorts and scoring methods appropriate for the measurement platform.</w:t>
+        <w:t xml:space="preserve">. Purity adjustment in the PACA-AU datasets left the risk score’s association essentially unchanged. GATA6 RNA in situ hybridization independently supports D1’s classical tumor component; these analyses do not establish the cellular identity of its stromal component. Single-cell or spatial profiling could clarify the cellular sources of these programs, but linking those sources to prognosis would require outcome-annotated cohorts and platform-appropriate scoring.</w:t>
       </w:r>
     </w:p>
     <w:p>
@@ -5586,7 +5598,7 @@
         </w:r>
       </w:hyperlink>
       <w:r>
-        <w:t xml:space="preserve">. PDAC is the empirical demonstration presented here rather than evidence of pan-cancer validation.</w:t>
+        <w:t xml:space="preserve">.</w:t>
       </w:r>
     </w:p>
     <w:p>

</xml_diff>